<commit_message>
feat: add VPAA Assistant role and update related components for improved approval workflow
</commit_message>
<xml_diff>
--- a/public/templates/student-activity-proposal-form-v2.docx
+++ b/public/templates/student-activity-proposal-form-v2.docx
@@ -211,7 +211,7 @@
           <w:szCs w:val="28"/>
         </w:rPr>
         <w:drawing>
-          <wp:anchor distT="0" distB="0" distL="114300" distR="114300" simplePos="0" relativeHeight="251665408" behindDoc="0" locked="0" layoutInCell="1" allowOverlap="1" wp14:anchorId="4D66C737" wp14:editId="648EF1A5">
+          <wp:anchor distT="0" distB="0" distL="114300" distR="114300" simplePos="0" relativeHeight="251665408" behindDoc="0" locked="0" layoutInCell="1" allowOverlap="1" wp14:anchorId="4D66C737" wp14:editId="38C38F0D">
             <wp:simplePos x="0" y="0"/>
             <wp:positionH relativeFrom="column">
               <wp:posOffset>190004</wp:posOffset>
@@ -276,7 +276,7 @@
           <w:szCs w:val="28"/>
         </w:rPr>
         <w:drawing>
-          <wp:anchor distT="0" distB="0" distL="114300" distR="114300" simplePos="0" relativeHeight="251659264" behindDoc="0" locked="0" layoutInCell="1" allowOverlap="1" wp14:anchorId="31EB85D4" wp14:editId="6511524B">
+          <wp:anchor distT="0" distB="0" distL="114300" distR="114300" simplePos="0" relativeHeight="251659264" behindDoc="0" locked="0" layoutInCell="1" allowOverlap="1" wp14:anchorId="31EB85D4" wp14:editId="42790BB9">
             <wp:simplePos x="0" y="0"/>
             <wp:positionH relativeFrom="column">
               <wp:posOffset>-474914</wp:posOffset>
@@ -5233,7 +5233,23 @@
                 <w:rFonts w:ascii="Arial Narrow" w:hAnsi="Arial Narrow"/>
                 <w:b/>
               </w:rPr>
-              <w:t>Dr. Rosalyn S. Galvez</w:t>
+              <w:t>{</w:t>
+            </w:r>
+            <w:proofErr w:type="spellStart"/>
+            <w:r>
+              <w:rPr>
+                <w:rFonts w:ascii="Arial Narrow" w:hAnsi="Arial Narrow"/>
+                <w:b/>
+              </w:rPr>
+              <w:t>vpaaAsst</w:t>
+            </w:r>
+            <w:proofErr w:type="spellEnd"/>
+            <w:r>
+              <w:rPr>
+                <w:rFonts w:ascii="Arial Narrow" w:hAnsi="Arial Narrow"/>
+                <w:b/>
+              </w:rPr>
+              <w:t>}</w:t>
             </w:r>
           </w:p>
           <w:p>

</xml_diff>

<commit_message>
feat: add off-campus agreement handling in SAPF forms and related components
</commit_message>
<xml_diff>
--- a/public/templates/student-activity-proposal-form-v2.docx
+++ b/public/templates/student-activity-proposal-form-v2.docx
@@ -211,7 +211,7 @@
           <w:szCs w:val="28"/>
         </w:rPr>
         <w:drawing>
-          <wp:anchor distT="0" distB="0" distL="114300" distR="114300" simplePos="0" relativeHeight="251665408" behindDoc="0" locked="0" layoutInCell="1" allowOverlap="1" wp14:anchorId="4D66C737" wp14:editId="38C38F0D">
+          <wp:anchor distT="0" distB="0" distL="114300" distR="114300" simplePos="0" relativeHeight="251665408" behindDoc="0" locked="0" layoutInCell="1" allowOverlap="1" wp14:anchorId="4D66C737" wp14:editId="1BB10811">
             <wp:simplePos x="0" y="0"/>
             <wp:positionH relativeFrom="column">
               <wp:posOffset>190004</wp:posOffset>
@@ -276,7 +276,7 @@
           <w:szCs w:val="28"/>
         </w:rPr>
         <w:drawing>
-          <wp:anchor distT="0" distB="0" distL="114300" distR="114300" simplePos="0" relativeHeight="251659264" behindDoc="0" locked="0" layoutInCell="1" allowOverlap="1" wp14:anchorId="31EB85D4" wp14:editId="42790BB9">
+          <wp:anchor distT="0" distB="0" distL="114300" distR="114300" simplePos="0" relativeHeight="251659264" behindDoc="0" locked="0" layoutInCell="1" allowOverlap="1" wp14:anchorId="31EB85D4" wp14:editId="7EE1135E">
             <wp:simplePos x="0" y="0"/>
             <wp:positionH relativeFrom="column">
               <wp:posOffset>-474914</wp:posOffset>
@@ -875,27 +875,27 @@
               <mc:AlternateContent>
                 <mc:Choice Requires="wps">
                   <w:drawing>
-                    <wp:anchor distT="0" distB="0" distL="114300" distR="114300" simplePos="0" relativeHeight="251668480" behindDoc="0" locked="0" layoutInCell="1" allowOverlap="1" wp14:anchorId="18774BC4" wp14:editId="33A2556D">
+                    <wp:anchor distT="0" distB="0" distL="114300" distR="114300" simplePos="0" relativeHeight="251669504" behindDoc="0" locked="0" layoutInCell="1" allowOverlap="1" wp14:anchorId="3D30B037" wp14:editId="5B810EF3">
                       <wp:simplePos x="0" y="0"/>
                       <wp:positionH relativeFrom="column">
-                        <wp:posOffset>50800</wp:posOffset>
+                        <wp:posOffset>33020</wp:posOffset>
                       </wp:positionH>
                       <wp:positionV relativeFrom="paragraph">
-                        <wp:posOffset>457200</wp:posOffset>
+                        <wp:posOffset>478790</wp:posOffset>
                       </wp:positionV>
-                      <wp:extent cx="1016512" cy="375313"/>
-                      <wp:effectExtent l="0" t="0" r="12700" b="24765"/>
+                      <wp:extent cx="1047750" cy="361950"/>
+                      <wp:effectExtent l="0" t="0" r="19050" b="19050"/>
                       <wp:wrapNone/>
-                      <wp:docPr id="2" name="Rectangle 2"/>
+                      <wp:docPr id="638105040" name="Text Box 9"/>
                       <wp:cNvGraphicFramePr/>
                       <a:graphic xmlns:a="http://schemas.openxmlformats.org/drawingml/2006/main">
                         <a:graphicData uri="http://schemas.microsoft.com/office/word/2010/wordprocessingShape">
                           <wps:wsp>
-                            <wps:cNvSpPr/>
+                            <wps:cNvSpPr txBox="1"/>
                             <wps:spPr>
                               <a:xfrm>
                                 <a:off x="0" y="0"/>
-                                <a:ext cx="1016512" cy="375313"/>
+                                <a:ext cx="1047750" cy="361950"/>
                               </a:xfrm>
                               <a:prstGeom prst="rect">
                                 <a:avLst/>
@@ -906,23 +906,47 @@
                                   <a:lumOff val="80000"/>
                                 </a:schemeClr>
                               </a:solidFill>
+                              <a:ln w="6350">
+                                <a:solidFill>
+                                  <a:schemeClr val="accent2"/>
+                                </a:solidFill>
+                              </a:ln>
                             </wps:spPr>
-                            <wps:style>
-                              <a:lnRef idx="2">
-                                <a:schemeClr val="accent2">
-                                  <a:shade val="50000"/>
-                                </a:schemeClr>
-                              </a:lnRef>
-                              <a:fillRef idx="1">
-                                <a:schemeClr val="accent2"/>
-                              </a:fillRef>
-                              <a:effectRef idx="0">
-                                <a:schemeClr val="accent2"/>
-                              </a:effectRef>
-                              <a:fontRef idx="minor">
-                                <a:schemeClr val="lt1"/>
-                              </a:fontRef>
-                            </wps:style>
+                            <wps:txbx>
+                              <w:txbxContent>
+                                <w:p>
+                                  <w:pPr>
+                                    <w:rPr>
+                                      <w:sz w:val="20"/>
+                                      <w:szCs w:val="20"/>
+                                    </w:rPr>
+                                  </w:pPr>
+                                  <w:r>
+                                    <w:rPr>
+                                      <w:sz w:val="20"/>
+                                      <w:szCs w:val="20"/>
+                                    </w:rPr>
+                                    <w:t>{</w:t>
+                                  </w:r>
+                                  <w:proofErr w:type="spellStart"/>
+                                  <w:r>
+                                    <w:rPr>
+                                      <w:sz w:val="20"/>
+                                      <w:szCs w:val="20"/>
+                                    </w:rPr>
+                                    <w:t>offCampAgree</w:t>
+                                  </w:r>
+                                  <w:proofErr w:type="spellEnd"/>
+                                  <w:r>
+                                    <w:rPr>
+                                      <w:sz w:val="20"/>
+                                      <w:szCs w:val="20"/>
+                                    </w:rPr>
+                                    <w:t>}</w:t>
+                                  </w:r>
+                                </w:p>
+                              </w:txbxContent>
+                            </wps:txbx>
                             <wps:bodyPr rot="0" spcFirstLastPara="0" vertOverflow="overflow" horzOverflow="overflow" vert="horz" wrap="square" lIns="91440" tIns="45720" rIns="91440" bIns="45720" numCol="1" spcCol="0" rtlCol="0" fromWordArt="0" anchor="ctr" anchorCtr="0" forceAA="0" compatLnSpc="1">
                               <a:prstTxWarp prst="textNoShape">
                                 <a:avLst/>
@@ -943,7 +967,43 @@
                 </mc:Choice>
                 <mc:Fallback>
                   <w:pict>
-                    <v:rect w14:anchorId="1CB5374F" id="Rectangle 2" o:spid="_x0000_s1026" style="position:absolute;margin-left:4pt;margin-top:36pt;width:80.05pt;height:29.55pt;z-index:251668480;visibility:visible;mso-wrap-style:square;mso-width-percent:0;mso-height-percent:0;mso-wrap-distance-left:9pt;mso-wrap-distance-top:0;mso-wrap-distance-right:9pt;mso-wrap-distance-bottom:0;mso-position-horizontal:absolute;mso-position-horizontal-relative:text;mso-position-vertical:absolute;mso-position-vertical-relative:text;mso-width-percent:0;mso-height-percent:0;mso-width-relative:margin;mso-height-relative:margin;v-text-anchor:middle" o:gfxdata="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" fillcolor="#fbe4d5 [661]" strokecolor="#823b0b [1605]" strokeweight="1pt"/>
+                    <v:shape w14:anchorId="3D30B037" id="_x0000_s1028" type="#_x0000_t202" style="position:absolute;left:0;text-align:left;margin-left:2.6pt;margin-top:37.7pt;width:82.5pt;height:28.5pt;z-index:251669504;visibility:visible;mso-wrap-style:square;mso-width-percent:0;mso-height-percent:0;mso-wrap-distance-left:9pt;mso-wrap-distance-top:0;mso-wrap-distance-right:9pt;mso-wrap-distance-bottom:0;mso-position-horizontal:absolute;mso-position-horizontal-relative:text;mso-position-vertical:absolute;mso-position-vertical-relative:text;mso-width-percent:0;mso-height-percent:0;mso-width-relative:margin;mso-height-relative:margin;v-text-anchor:middle" o:gfxdata="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" fillcolor="#fbe4d5 [661]" strokecolor="#ed7d31 [3205]" strokeweight=".5pt">
+                      <v:textbox>
+                        <w:txbxContent>
+                          <w:p>
+                            <w:pPr>
+                              <w:rPr>
+                                <w:sz w:val="20"/>
+                                <w:szCs w:val="20"/>
+                              </w:rPr>
+                            </w:pPr>
+                            <w:r>
+                              <w:rPr>
+                                <w:sz w:val="20"/>
+                                <w:szCs w:val="20"/>
+                              </w:rPr>
+                              <w:t>{</w:t>
+                            </w:r>
+                            <w:proofErr w:type="spellStart"/>
+                            <w:r>
+                              <w:rPr>
+                                <w:sz w:val="20"/>
+                                <w:szCs w:val="20"/>
+                              </w:rPr>
+                              <w:t>offCampAgree</w:t>
+                            </w:r>
+                            <w:proofErr w:type="spellEnd"/>
+                            <w:r>
+                              <w:rPr>
+                                <w:sz w:val="20"/>
+                                <w:szCs w:val="20"/>
+                              </w:rPr>
+                              <w:t>}</w:t>
+                            </w:r>
+                          </w:p>
+                        </w:txbxContent>
+                      </v:textbox>
+                    </v:shape>
                   </w:pict>
                 </mc:Fallback>
               </mc:AlternateContent>
@@ -5959,13 +6019,13 @@
         </mc:Choice>
         <mc:Fallback>
           <w:pict>
-            <v:group w14:anchorId="4EDD8B59" id="Group 37" o:spid="_x0000_s1028" style="position:absolute;margin-left:416.8pt;margin-top:0;width:468pt;height:25.2pt;z-index:251663360;mso-width-percent:1000;mso-top-percent:200;mso-wrap-distance-left:0;mso-wrap-distance-right:0;mso-position-horizontal:right;mso-position-horizontal-relative:margin;mso-position-vertical-relative:bottom-margin-area;mso-width-percent:1000;mso-top-percent:200;mso-width-relative:margin;mso-height-relative:margin" coordsize="59626,3238" o:gfxdata="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">
-              <v:rect id="Rectangle 38" o:spid="_x0000_s1029" style="position:absolute;left:190;width:59436;height:188;visibility:visible;mso-wrap-style:square;v-text-anchor:middle" o:gfxdata="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" fillcolor="black [3213]" stroked="f" strokeweight="1pt"/>
+            <v:group w14:anchorId="4EDD8B59" id="Group 37" o:spid="_x0000_s1029" style="position:absolute;margin-left:416.8pt;margin-top:0;width:468pt;height:25.2pt;z-index:251663360;mso-width-percent:1000;mso-top-percent:200;mso-wrap-distance-left:0;mso-wrap-distance-right:0;mso-position-horizontal:right;mso-position-horizontal-relative:margin;mso-position-vertical-relative:bottom-margin-area;mso-width-percent:1000;mso-top-percent:200;mso-width-relative:margin;mso-height-relative:margin" coordsize="59626,3238" o:gfxdata="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">
+              <v:rect id="Rectangle 38" o:spid="_x0000_s1030" style="position:absolute;left:190;width:59436;height:188;visibility:visible;mso-wrap-style:square;v-text-anchor:middle" o:gfxdata="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" fillcolor="black [3213]" stroked="f" strokeweight="1pt"/>
               <v:shapetype id="_x0000_t202" coordsize="21600,21600" o:spt="202" path="m,l,21600r21600,l21600,xe">
                 <v:stroke joinstyle="miter"/>
                 <v:path gradientshapeok="t" o:connecttype="rect"/>
               </v:shapetype>
-              <v:shape id="Text Box 39" o:spid="_x0000_s1030" type="#_x0000_t202" style="position:absolute;top:666;width:59436;height:2572;visibility:visible;mso-wrap-style:square;v-text-anchor:bottom" o:gfxdata="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" filled="f" stroked="f" strokeweight=".5pt">
+              <v:shape id="Text Box 39" o:spid="_x0000_s1031" type="#_x0000_t202" style="position:absolute;top:666;width:59436;height:2572;visibility:visible;mso-wrap-style:square;v-text-anchor:bottom" o:gfxdata="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" filled="f" stroked="f" strokeweight=".5pt">
                 <v:textbox inset=",,,0">
                   <w:txbxContent>
                     <w:sdt>
@@ -6158,7 +6218,7 @@
         </mc:Choice>
         <mc:Fallback>
           <w:pict>
-            <v:rect w14:anchorId="072B54F5" id="Rectangle 40" o:spid="_x0000_s1031" style="position:absolute;margin-left:0;margin-top:0;width:36pt;height:25.2pt;z-index:251662336;visibility:visible;mso-wrap-style:square;mso-width-percent:0;mso-height-percent:0;mso-top-percent:200;mso-wrap-distance-left:0;mso-wrap-distance-top:0;mso-wrap-distance-right:0;mso-wrap-distance-bottom:0;mso-position-horizontal:left;mso-position-horizontal-relative:right-margin-area;mso-position-vertical-relative:bottom-margin-area;mso-width-percent:0;mso-height-percent:0;mso-top-percent:200;mso-width-relative:margin;mso-height-relative:margin;v-text-anchor:bottom" o:gfxdata="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" fillcolor="black [3213]" stroked="f" strokeweight="3pt">
+            <v:rect w14:anchorId="072B54F5" id="Rectangle 40" o:spid="_x0000_s1032" style="position:absolute;margin-left:0;margin-top:0;width:36pt;height:25.2pt;z-index:251662336;visibility:visible;mso-wrap-style:square;mso-width-percent:0;mso-height-percent:0;mso-top-percent:200;mso-wrap-distance-left:0;mso-wrap-distance-top:0;mso-wrap-distance-right:0;mso-wrap-distance-bottom:0;mso-position-horizontal:left;mso-position-horizontal-relative:right-margin-area;mso-position-vertical-relative:bottom-margin-area;mso-width-percent:0;mso-height-percent:0;mso-top-percent:200;mso-width-relative:margin;mso-height-relative:margin;v-text-anchor:bottom" o:gfxdata="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" fillcolor="black [3213]" stroked="f" strokeweight="3pt">
               <v:textbox>
                 <w:txbxContent>
                   <w:p>

</xml_diff>

<commit_message>
feat: enhance SAPF approval process with dean selection and title handling
</commit_message>
<xml_diff>
--- a/public/templates/student-activity-proposal-form-v2.docx
+++ b/public/templates/student-activity-proposal-form-v2.docx
@@ -211,7 +211,7 @@
           <w:szCs w:val="28"/>
         </w:rPr>
         <w:drawing>
-          <wp:anchor distT="0" distB="0" distL="114300" distR="114300" simplePos="0" relativeHeight="251665408" behindDoc="0" locked="0" layoutInCell="1" allowOverlap="1" wp14:anchorId="4D66C737" wp14:editId="1BB10811">
+          <wp:anchor distT="0" distB="0" distL="114300" distR="114300" simplePos="0" relativeHeight="251665408" behindDoc="0" locked="0" layoutInCell="1" allowOverlap="1" wp14:anchorId="4D66C737" wp14:editId="44959F2E">
             <wp:simplePos x="0" y="0"/>
             <wp:positionH relativeFrom="column">
               <wp:posOffset>190004</wp:posOffset>
@@ -276,7 +276,7 @@
           <w:szCs w:val="28"/>
         </w:rPr>
         <w:drawing>
-          <wp:anchor distT="0" distB="0" distL="114300" distR="114300" simplePos="0" relativeHeight="251659264" behindDoc="0" locked="0" layoutInCell="1" allowOverlap="1" wp14:anchorId="31EB85D4" wp14:editId="7EE1135E">
+          <wp:anchor distT="0" distB="0" distL="114300" distR="114300" simplePos="0" relativeHeight="251659264" behindDoc="0" locked="0" layoutInCell="1" allowOverlap="1" wp14:anchorId="31EB85D4" wp14:editId="76FF8B73">
             <wp:simplePos x="0" y="0"/>
             <wp:positionH relativeFrom="column">
               <wp:posOffset>-474914</wp:posOffset>
@@ -561,133 +561,7 @@
               <w:rPr>
                 <w:rFonts w:ascii="Arial Narrow" w:hAnsi="Arial Narrow"/>
               </w:rPr>
-              <w:t>({</w:t>
-            </w:r>
-            <w:proofErr w:type="spellStart"/>
-            <w:r>
-              <w:rPr>
-                <w:rFonts w:ascii="Arial Narrow" w:hAnsi="Arial Narrow"/>
-              </w:rPr>
-              <w:t>departmentCollege</w:t>
-            </w:r>
-            <w:proofErr w:type="spellEnd"/>
-            <w:r>
-              <w:rPr>
-                <w:rFonts w:ascii="Arial Narrow" w:hAnsi="Arial Narrow"/>
-              </w:rPr>
-              <w:t xml:space="preserve">}) </w:t>
-            </w:r>
-            <w:proofErr w:type="gramStart"/>
-            <w:r>
-              <w:rPr>
-                <w:rFonts w:ascii="Arial Narrow" w:hAnsi="Arial Narrow"/>
-              </w:rPr>
-              <w:t>College  (</w:t>
-            </w:r>
-            <w:proofErr w:type="gramEnd"/>
-            <w:r>
-              <w:rPr>
-                <w:rFonts w:ascii="Arial Narrow" w:hAnsi="Arial Narrow"/>
-              </w:rPr>
-              <w:t>{</w:t>
-            </w:r>
-            <w:proofErr w:type="spellStart"/>
-            <w:r>
-              <w:rPr>
-                <w:rFonts w:ascii="Arial Narrow" w:hAnsi="Arial Narrow"/>
-              </w:rPr>
-              <w:t>departmentAltEd</w:t>
-            </w:r>
-            <w:proofErr w:type="spellEnd"/>
-            <w:r>
-              <w:rPr>
-                <w:rFonts w:ascii="Arial Narrow" w:hAnsi="Arial Narrow"/>
-              </w:rPr>
-              <w:t xml:space="preserve">}) Alternative </w:t>
-            </w:r>
-            <w:proofErr w:type="gramStart"/>
-            <w:r>
-              <w:rPr>
-                <w:rFonts w:ascii="Arial Narrow" w:hAnsi="Arial Narrow"/>
-              </w:rPr>
-              <w:t>Education  (</w:t>
-            </w:r>
-            <w:proofErr w:type="gramEnd"/>
-            <w:r>
-              <w:rPr>
-                <w:rFonts w:ascii="Arial Narrow" w:hAnsi="Arial Narrow"/>
-              </w:rPr>
-              <w:t>{</w:t>
-            </w:r>
-            <w:proofErr w:type="spellStart"/>
-            <w:r>
-              <w:rPr>
-                <w:rFonts w:ascii="Arial Narrow" w:hAnsi="Arial Narrow"/>
-              </w:rPr>
-              <w:t>departmentGraduate</w:t>
-            </w:r>
-            <w:proofErr w:type="spellEnd"/>
-            <w:r>
-              <w:rPr>
-                <w:rFonts w:ascii="Arial Narrow" w:hAnsi="Arial Narrow"/>
-              </w:rPr>
-              <w:t xml:space="preserve">}) Graduate </w:t>
-            </w:r>
-            <w:proofErr w:type="gramStart"/>
-            <w:r>
-              <w:rPr>
-                <w:rFonts w:ascii="Arial Narrow" w:hAnsi="Arial Narrow"/>
-              </w:rPr>
-              <w:t>Studies  (</w:t>
-            </w:r>
-            <w:proofErr w:type="gramEnd"/>
-            <w:r>
-              <w:rPr>
-                <w:rFonts w:ascii="Arial Narrow" w:hAnsi="Arial Narrow"/>
-              </w:rPr>
-              <w:t>{</w:t>
-            </w:r>
-            <w:proofErr w:type="spellStart"/>
-            <w:r>
-              <w:rPr>
-                <w:rFonts w:ascii="Arial Narrow" w:hAnsi="Arial Narrow"/>
-              </w:rPr>
-              <w:t>departmentExtensions</w:t>
-            </w:r>
-            <w:proofErr w:type="spellEnd"/>
-            <w:r>
-              <w:rPr>
-                <w:rFonts w:ascii="Arial Narrow" w:hAnsi="Arial Narrow"/>
-              </w:rPr>
-              <w:t xml:space="preserve">}) Extensions </w:t>
-            </w:r>
-            <w:proofErr w:type="gramStart"/>
-            <w:r>
-              <w:rPr>
-                <w:rFonts w:ascii="Arial Narrow" w:hAnsi="Arial Narrow"/>
-              </w:rPr>
-              <w:t>Office  (</w:t>
-            </w:r>
-            <w:proofErr w:type="gramEnd"/>
-            <w:r>
-              <w:rPr>
-                <w:rFonts w:ascii="Arial Narrow" w:hAnsi="Arial Narrow"/>
-              </w:rPr>
-              <w:t>{</w:t>
-            </w:r>
-            <w:proofErr w:type="spellStart"/>
-            <w:r>
-              <w:rPr>
-                <w:rFonts w:ascii="Arial Narrow" w:hAnsi="Arial Narrow"/>
-              </w:rPr>
-              <w:t>departmentCom</w:t>
-            </w:r>
-            <w:proofErr w:type="spellEnd"/>
-            <w:r>
-              <w:rPr>
-                <w:rFonts w:ascii="Arial Narrow" w:hAnsi="Arial Narrow"/>
-              </w:rPr>
-              <w:t>}) COM</w:t>
+              <w:t>({departmentCollege}) College  ({departmentAltEd}) Alternative Education  ({departmentGraduate}) Graduate Studies  ({departmentExtensions}) Extensions Office  ({departmentCom}) COM</w:t>
             </w:r>
           </w:p>
         </w:tc>
@@ -731,27 +605,7 @@
           <w:szCs w:val="20"/>
           <w:u w:val="single"/>
         </w:rPr>
-        <w:t>{</w:t>
-      </w:r>
-      <w:proofErr w:type="spellStart"/>
-      <w:r>
-        <w:rPr>
-          <w:rFonts w:ascii="Arial" w:eastAsia="Arial" w:hAnsi="Arial" w:cs="Arial"/>
-          <w:sz w:val="20"/>
-          <w:szCs w:val="20"/>
-          <w:u w:val="single"/>
-        </w:rPr>
-        <w:t>proposalDate</w:t>
-      </w:r>
-      <w:proofErr w:type="spellEnd"/>
-      <w:r>
-        <w:rPr>
-          <w:rFonts w:ascii="Arial" w:eastAsia="Arial" w:hAnsi="Arial" w:cs="Arial"/>
-          <w:sz w:val="20"/>
-          <w:szCs w:val="20"/>
-          <w:u w:val="single"/>
-        </w:rPr>
-        <w:t>}</w:t>
+        <w:t>{proposalDate}</w:t>
       </w:r>
     </w:p>
     <w:p>
@@ -926,23 +780,7 @@
                                       <w:sz w:val="20"/>
                                       <w:szCs w:val="20"/>
                                     </w:rPr>
-                                    <w:t>{</w:t>
-                                  </w:r>
-                                  <w:proofErr w:type="spellStart"/>
-                                  <w:r>
-                                    <w:rPr>
-                                      <w:sz w:val="20"/>
-                                      <w:szCs w:val="20"/>
-                                    </w:rPr>
-                                    <w:t>offCampAgree</w:t>
-                                  </w:r>
-                                  <w:proofErr w:type="spellEnd"/>
-                                  <w:r>
-                                    <w:rPr>
-                                      <w:sz w:val="20"/>
-                                      <w:szCs w:val="20"/>
-                                    </w:rPr>
-                                    <w:t>}</w:t>
+                                    <w:t>{offCampAgree}</w:t>
                                   </w:r>
                                 </w:p>
                               </w:txbxContent>
@@ -1203,21 +1041,7 @@
               <w:rPr>
                 <w:rFonts w:ascii="Arial Narrow" w:hAnsi="Arial Narrow"/>
               </w:rPr>
-              <w:t>{</w:t>
-            </w:r>
-            <w:proofErr w:type="spellStart"/>
-            <w:r>
-              <w:rPr>
-                <w:rFonts w:ascii="Arial Narrow" w:hAnsi="Arial Narrow"/>
-              </w:rPr>
-              <w:t>activityTitle</w:t>
-            </w:r>
-            <w:proofErr w:type="spellEnd"/>
-            <w:r>
-              <w:rPr>
-                <w:rFonts w:ascii="Arial Narrow" w:hAnsi="Arial Narrow"/>
-              </w:rPr>
-              <w:t>}</w:t>
+              <w:t>{activityTitle}</w:t>
             </w:r>
           </w:p>
         </w:tc>
@@ -1307,21 +1131,7 @@
               <w:rPr>
                 <w:rFonts w:ascii="Arial Narrow" w:hAnsi="Arial Narrow"/>
               </w:rPr>
-              <w:t>{</w:t>
-            </w:r>
-            <w:proofErr w:type="spellStart"/>
-            <w:r>
-              <w:rPr>
-                <w:rFonts w:ascii="Arial Narrow" w:hAnsi="Arial Narrow"/>
-              </w:rPr>
-              <w:t>activityTime</w:t>
-            </w:r>
-            <w:proofErr w:type="spellEnd"/>
-            <w:r>
-              <w:rPr>
-                <w:rFonts w:ascii="Arial Narrow" w:hAnsi="Arial Narrow"/>
-              </w:rPr>
-              <w:t>}</w:t>
+              <w:t>{activityTime}</w:t>
             </w:r>
           </w:p>
         </w:tc>
@@ -1378,25 +1188,7 @@
                 <w:b/>
                 <w:bCs/>
               </w:rPr>
-              <w:t>{</w:t>
-            </w:r>
-            <w:proofErr w:type="spellStart"/>
-            <w:r>
-              <w:rPr>
-                <w:rFonts w:ascii="Arial Narrow" w:hAnsi="Arial Narrow"/>
-                <w:b/>
-                <w:bCs/>
-              </w:rPr>
-              <w:t>activityDate</w:t>
-            </w:r>
-            <w:proofErr w:type="spellEnd"/>
-            <w:r>
-              <w:rPr>
-                <w:rFonts w:ascii="Arial Narrow" w:hAnsi="Arial Narrow"/>
-                <w:b/>
-                <w:bCs/>
-              </w:rPr>
-              <w:t>}</w:t>
+              <w:t>{activityDate}</w:t>
             </w:r>
           </w:p>
         </w:tc>
@@ -1438,21 +1230,7 @@
               <w:rPr>
                 <w:rFonts w:ascii="Arial Narrow" w:hAnsi="Arial Narrow"/>
               </w:rPr>
-              <w:t>({</w:t>
-            </w:r>
-            <w:proofErr w:type="spellStart"/>
-            <w:r>
-              <w:rPr>
-                <w:rFonts w:ascii="Arial Narrow" w:hAnsi="Arial Narrow"/>
-              </w:rPr>
-              <w:t>modalityFaceToFace</w:t>
-            </w:r>
-            <w:proofErr w:type="spellEnd"/>
-            <w:r>
-              <w:rPr>
-                <w:rFonts w:ascii="Arial Narrow" w:hAnsi="Arial Narrow"/>
-              </w:rPr>
-              <w:t xml:space="preserve">}) Face-to-face </w:t>
+              <w:t xml:space="preserve">({modalityFaceToFace}) Face-to-face </w:t>
             </w:r>
           </w:p>
           <w:p>
@@ -1466,49 +1244,7 @@
               <w:rPr>
                 <w:rFonts w:ascii="Arial Narrow" w:hAnsi="Arial Narrow"/>
               </w:rPr>
-              <w:t>({</w:t>
-            </w:r>
-            <w:proofErr w:type="spellStart"/>
-            <w:r>
-              <w:rPr>
-                <w:rFonts w:ascii="Arial Narrow" w:hAnsi="Arial Narrow"/>
-              </w:rPr>
-              <w:t>modalityOnline</w:t>
-            </w:r>
-            <w:proofErr w:type="spellEnd"/>
-            <w:r>
-              <w:rPr>
-                <w:rFonts w:ascii="Arial Narrow" w:hAnsi="Arial Narrow"/>
-              </w:rPr>
-              <w:t xml:space="preserve">}) Online     </w:t>
-            </w:r>
-            <w:proofErr w:type="gramStart"/>
-            <w:r>
-              <w:rPr>
-                <w:rFonts w:ascii="Arial Narrow" w:hAnsi="Arial Narrow"/>
-              </w:rPr>
-              <w:t xml:space="preserve">   (</w:t>
-            </w:r>
-            <w:proofErr w:type="gramEnd"/>
-            <w:r>
-              <w:rPr>
-                <w:rFonts w:ascii="Arial Narrow" w:hAnsi="Arial Narrow"/>
-              </w:rPr>
-              <w:t>{</w:t>
-            </w:r>
-            <w:proofErr w:type="spellStart"/>
-            <w:r>
-              <w:rPr>
-                <w:rFonts w:ascii="Arial Narrow" w:hAnsi="Arial Narrow"/>
-              </w:rPr>
-              <w:t>modalityHybrid</w:t>
-            </w:r>
-            <w:proofErr w:type="spellEnd"/>
-            <w:r>
-              <w:rPr>
-                <w:rFonts w:ascii="Arial Narrow" w:hAnsi="Arial Narrow"/>
-              </w:rPr>
-              <w:t>}) Hybrid</w:t>
+              <w:t>({modalityOnline}) Online        ({modalityHybrid}) Hybrid</w:t>
             </w:r>
           </w:p>
         </w:tc>
@@ -1555,21 +1291,7 @@
               <w:rPr>
                 <w:rFonts w:ascii="Arial Narrow" w:hAnsi="Arial Narrow"/>
               </w:rPr>
-              <w:t>{</w:t>
-            </w:r>
-            <w:proofErr w:type="spellStart"/>
-            <w:r>
-              <w:rPr>
-                <w:rFonts w:ascii="Arial Narrow" w:hAnsi="Arial Narrow"/>
-              </w:rPr>
-              <w:t>programCourse</w:t>
-            </w:r>
-            <w:proofErr w:type="spellEnd"/>
-            <w:r>
-              <w:rPr>
-                <w:rFonts w:ascii="Arial Narrow" w:hAnsi="Arial Narrow"/>
-              </w:rPr>
-              <w:t>}</w:t>
+              <w:t>{programCourse}</w:t>
             </w:r>
           </w:p>
         </w:tc>
@@ -1704,21 +1426,7 @@
               <w:rPr>
                 <w:rFonts w:ascii="Arial Narrow" w:hAnsi="Arial Narrow"/>
               </w:rPr>
-              <w:t>({</w:t>
-            </w:r>
-            <w:proofErr w:type="spellStart"/>
-            <w:r>
-              <w:rPr>
-                <w:rFonts w:ascii="Arial Narrow" w:hAnsi="Arial Narrow"/>
-              </w:rPr>
-              <w:t>settingInCampus</w:t>
-            </w:r>
-            <w:proofErr w:type="spellEnd"/>
-            <w:r>
-              <w:rPr>
-                <w:rFonts w:ascii="Arial Narrow" w:hAnsi="Arial Narrow"/>
-              </w:rPr>
-              <w:t>}) In-Campus</w:t>
+              <w:t>({settingInCampus}) In-Campus</w:t>
             </w:r>
           </w:p>
         </w:tc>
@@ -1740,21 +1448,7 @@
               <w:rPr>
                 <w:rFonts w:ascii="Arial Narrow" w:hAnsi="Arial Narrow"/>
               </w:rPr>
-              <w:t>({</w:t>
-            </w:r>
-            <w:proofErr w:type="spellStart"/>
-            <w:r>
-              <w:rPr>
-                <w:rFonts w:ascii="Arial Narrow" w:hAnsi="Arial Narrow"/>
-              </w:rPr>
-              <w:t>settingOffCampus</w:t>
-            </w:r>
-            <w:proofErr w:type="spellEnd"/>
-            <w:r>
-              <w:rPr>
-                <w:rFonts w:ascii="Arial Narrow" w:hAnsi="Arial Narrow"/>
-              </w:rPr>
-              <w:t>}) Off-Campus</w:t>
+              <w:t>({settingOffCampus}) Off-Campus</w:t>
             </w:r>
           </w:p>
         </w:tc>
@@ -1891,49 +1585,7 @@
               <w:rPr>
                 <w:rFonts w:ascii="Arial Narrow" w:hAnsi="Arial Narrow"/>
               </w:rPr>
-              <w:t>({</w:t>
-            </w:r>
-            <w:proofErr w:type="spellStart"/>
-            <w:r>
-              <w:rPr>
-                <w:rFonts w:ascii="Arial Narrow" w:hAnsi="Arial Narrow"/>
-              </w:rPr>
-              <w:t>activityTypeCoCurricular</w:t>
-            </w:r>
-            <w:proofErr w:type="spellEnd"/>
-            <w:r>
-              <w:rPr>
-                <w:rFonts w:ascii="Arial Narrow" w:hAnsi="Arial Narrow"/>
-              </w:rPr>
-              <w:t>}) Co-Curricular</w:t>
-            </w:r>
-            <w:proofErr w:type="gramStart"/>
-            <w:r>
-              <w:rPr>
-                <w:rFonts w:ascii="Arial Narrow" w:hAnsi="Arial Narrow"/>
-              </w:rPr>
-              <w:t xml:space="preserve">   (</w:t>
-            </w:r>
-            <w:proofErr w:type="gramEnd"/>
-            <w:r>
-              <w:rPr>
-                <w:rFonts w:ascii="Arial Narrow" w:hAnsi="Arial Narrow"/>
-              </w:rPr>
-              <w:t>{</w:t>
-            </w:r>
-            <w:proofErr w:type="spellStart"/>
-            <w:r>
-              <w:rPr>
-                <w:rFonts w:ascii="Arial Narrow" w:hAnsi="Arial Narrow"/>
-              </w:rPr>
-              <w:t>activityTypeExtraCurricular</w:t>
-            </w:r>
-            <w:proofErr w:type="spellEnd"/>
-            <w:r>
-              <w:rPr>
-                <w:rFonts w:ascii="Arial Narrow" w:hAnsi="Arial Narrow"/>
-              </w:rPr>
-              <w:t>}) Extra-Curricular</w:t>
+              <w:t>({activityTypeCoCurricular}) Co-Curricular   ({activityTypeExtraCurricular}) Extra-Curricular</w:t>
             </w:r>
           </w:p>
         </w:tc>
@@ -2025,49 +1677,7 @@
               <w:rPr>
                 <w:rFonts w:ascii="Arial Narrow" w:hAnsi="Arial Narrow"/>
               </w:rPr>
-              <w:t>({</w:t>
-            </w:r>
-            <w:proofErr w:type="spellStart"/>
-            <w:r>
-              <w:rPr>
-                <w:rFonts w:ascii="Arial Narrow" w:hAnsi="Arial Narrow"/>
-              </w:rPr>
-              <w:t>scopeOrganizational</w:t>
-            </w:r>
-            <w:proofErr w:type="spellEnd"/>
-            <w:r>
-              <w:rPr>
-                <w:rFonts w:ascii="Arial Narrow" w:hAnsi="Arial Narrow"/>
-              </w:rPr>
-              <w:t xml:space="preserve">}) Organizational  </w:t>
-            </w:r>
-            <w:proofErr w:type="gramStart"/>
-            <w:r>
-              <w:rPr>
-                <w:rFonts w:ascii="Arial Narrow" w:hAnsi="Arial Narrow"/>
-              </w:rPr>
-              <w:t xml:space="preserve">   (</w:t>
-            </w:r>
-            <w:proofErr w:type="gramEnd"/>
-            <w:r>
-              <w:rPr>
-                <w:rFonts w:ascii="Arial Narrow" w:hAnsi="Arial Narrow"/>
-              </w:rPr>
-              <w:t>{</w:t>
-            </w:r>
-            <w:proofErr w:type="spellStart"/>
-            <w:r>
-              <w:rPr>
-                <w:rFonts w:ascii="Arial Narrow" w:hAnsi="Arial Narrow"/>
-              </w:rPr>
-              <w:t>scopeInstitutional</w:t>
-            </w:r>
-            <w:proofErr w:type="spellEnd"/>
-            <w:r>
-              <w:rPr>
-                <w:rFonts w:ascii="Arial Narrow" w:hAnsi="Arial Narrow"/>
-              </w:rPr>
-              <w:t>})</w:t>
+              <w:t>({scopeOrganizational}) Organizational     ({scopeInstitutional})</w:t>
             </w:r>
           </w:p>
           <w:p>
@@ -2082,63 +1692,7 @@
               <w:rPr>
                 <w:rFonts w:ascii="Arial Narrow" w:hAnsi="Arial Narrow"/>
               </w:rPr>
-              <w:t xml:space="preserve"> Institutional  </w:t>
-            </w:r>
-            <w:proofErr w:type="gramStart"/>
-            <w:r>
-              <w:rPr>
-                <w:rFonts w:ascii="Arial Narrow" w:hAnsi="Arial Narrow"/>
-              </w:rPr>
-              <w:t xml:space="preserve">   (</w:t>
-            </w:r>
-            <w:proofErr w:type="gramEnd"/>
-            <w:r>
-              <w:rPr>
-                <w:rFonts w:ascii="Arial Narrow" w:hAnsi="Arial Narrow"/>
-              </w:rPr>
-              <w:t>{</w:t>
-            </w:r>
-            <w:proofErr w:type="spellStart"/>
-            <w:r>
-              <w:rPr>
-                <w:rFonts w:ascii="Arial Narrow" w:hAnsi="Arial Narrow"/>
-              </w:rPr>
-              <w:t>scopeRegional</w:t>
-            </w:r>
-            <w:proofErr w:type="spellEnd"/>
-            <w:r>
-              <w:rPr>
-                <w:rFonts w:ascii="Arial Narrow" w:hAnsi="Arial Narrow"/>
-              </w:rPr>
-              <w:t xml:space="preserve">}) Regional  </w:t>
-            </w:r>
-            <w:proofErr w:type="gramStart"/>
-            <w:r>
-              <w:rPr>
-                <w:rFonts w:ascii="Arial Narrow" w:hAnsi="Arial Narrow"/>
-              </w:rPr>
-              <w:t xml:space="preserve">   (</w:t>
-            </w:r>
-            <w:proofErr w:type="gramEnd"/>
-            <w:r>
-              <w:rPr>
-                <w:rFonts w:ascii="Arial Narrow" w:hAnsi="Arial Narrow"/>
-              </w:rPr>
-              <w:t>{</w:t>
-            </w:r>
-            <w:proofErr w:type="spellStart"/>
-            <w:r>
-              <w:rPr>
-                <w:rFonts w:ascii="Arial Narrow" w:hAnsi="Arial Narrow"/>
-              </w:rPr>
-              <w:t>scopeNational</w:t>
-            </w:r>
-            <w:proofErr w:type="spellEnd"/>
-            <w:r>
-              <w:rPr>
-                <w:rFonts w:ascii="Arial Narrow" w:hAnsi="Arial Narrow"/>
-              </w:rPr>
-              <w:t>}) National</w:t>
+              <w:t xml:space="preserve"> Institutional     ({scopeRegional}) Regional     ({scopeNational}) National</w:t>
             </w:r>
           </w:p>
         </w:tc>
@@ -2180,21 +1734,7 @@
               <w:rPr>
                 <w:rFonts w:ascii="Arial Narrow" w:hAnsi="Arial Narrow"/>
               </w:rPr>
-              <w:t>{</w:t>
-            </w:r>
-            <w:proofErr w:type="spellStart"/>
-            <w:r>
-              <w:rPr>
-                <w:rFonts w:ascii="Arial Narrow" w:hAnsi="Arial Narrow"/>
-              </w:rPr>
-              <w:t>noOfParticipants</w:t>
-            </w:r>
-            <w:proofErr w:type="spellEnd"/>
-            <w:r>
-              <w:rPr>
-                <w:rFonts w:ascii="Arial Narrow" w:hAnsi="Arial Narrow"/>
-              </w:rPr>
-              <w:t>}</w:t>
+              <w:t>{noOfParticipants}</w:t>
             </w:r>
           </w:p>
         </w:tc>
@@ -2242,105 +1782,7 @@
               <w:rPr>
                 <w:rFonts w:ascii="Arial Narrow" w:hAnsi="Arial Narrow"/>
               </w:rPr>
-              <w:t>({</w:t>
-            </w:r>
-            <w:proofErr w:type="spellStart"/>
-            <w:r>
-              <w:rPr>
-                <w:rFonts w:ascii="Arial Narrow" w:hAnsi="Arial Narrow"/>
-              </w:rPr>
-              <w:t>programTeamBuilding</w:t>
-            </w:r>
-            <w:proofErr w:type="spellEnd"/>
-            <w:r>
-              <w:rPr>
-                <w:rFonts w:ascii="Arial Narrow" w:hAnsi="Arial Narrow"/>
-              </w:rPr>
-              <w:t xml:space="preserve">}) Team Building  </w:t>
-            </w:r>
-            <w:proofErr w:type="gramStart"/>
-            <w:r>
-              <w:rPr>
-                <w:rFonts w:ascii="Arial Narrow" w:hAnsi="Arial Narrow"/>
-              </w:rPr>
-              <w:t xml:space="preserve">   (</w:t>
-            </w:r>
-            <w:proofErr w:type="gramEnd"/>
-            <w:r>
-              <w:rPr>
-                <w:rFonts w:ascii="Arial Narrow" w:hAnsi="Arial Narrow"/>
-              </w:rPr>
-              <w:t>{</w:t>
-            </w:r>
-            <w:proofErr w:type="spellStart"/>
-            <w:r>
-              <w:rPr>
-                <w:rFonts w:ascii="Arial Narrow" w:hAnsi="Arial Narrow"/>
-              </w:rPr>
-              <w:t>programLeadershipSummit</w:t>
-            </w:r>
-            <w:proofErr w:type="spellEnd"/>
-            <w:r>
-              <w:rPr>
-                <w:rFonts w:ascii="Arial Narrow" w:hAnsi="Arial Narrow"/>
-              </w:rPr>
-              <w:t xml:space="preserve">}) Leadership Summit  </w:t>
-            </w:r>
-            <w:proofErr w:type="gramStart"/>
-            <w:r>
-              <w:rPr>
-                <w:rFonts w:ascii="Arial Narrow" w:hAnsi="Arial Narrow"/>
-              </w:rPr>
-              <w:t xml:space="preserve">   (</w:t>
-            </w:r>
-            <w:proofErr w:type="gramEnd"/>
-            <w:r>
-              <w:rPr>
-                <w:rFonts w:ascii="Arial Narrow" w:hAnsi="Arial Narrow"/>
-              </w:rPr>
-              <w:t>{</w:t>
-            </w:r>
-            <w:proofErr w:type="spellStart"/>
-            <w:r>
-              <w:rPr>
-                <w:rFonts w:ascii="Arial Narrow" w:hAnsi="Arial Narrow"/>
-              </w:rPr>
-              <w:t>programGeneralAssembly</w:t>
-            </w:r>
-            <w:proofErr w:type="spellEnd"/>
-            <w:r>
-              <w:rPr>
-                <w:rFonts w:ascii="Arial Narrow" w:hAnsi="Arial Narrow"/>
-              </w:rPr>
-              <w:t xml:space="preserve">}) General Assembly  </w:t>
-            </w:r>
-            <w:proofErr w:type="gramStart"/>
-            <w:r>
-              <w:rPr>
-                <w:rFonts w:ascii="Arial Narrow" w:hAnsi="Arial Narrow"/>
-              </w:rPr>
-              <w:t xml:space="preserve">   (</w:t>
-            </w:r>
-            <w:proofErr w:type="gramEnd"/>
-            <w:r>
-              <w:rPr>
-                <w:rFonts w:ascii="Arial Narrow" w:hAnsi="Arial Narrow"/>
-              </w:rPr>
-              <w:t>{</w:t>
-            </w:r>
-            <w:proofErr w:type="spellStart"/>
-            <w:r>
-              <w:rPr>
-                <w:rFonts w:ascii="Arial Narrow" w:hAnsi="Arial Narrow"/>
-              </w:rPr>
-              <w:t>programCompetition</w:t>
-            </w:r>
-            <w:proofErr w:type="spellEnd"/>
-            <w:r>
-              <w:rPr>
-                <w:rFonts w:ascii="Arial Narrow" w:hAnsi="Arial Narrow"/>
-              </w:rPr>
-              <w:t xml:space="preserve">}) </w:t>
+              <w:t xml:space="preserve">({programTeamBuilding}) Team Building     ({programLeadershipSummit}) Leadership Summit     ({programGeneralAssembly}) General Assembly     ({programCompetition}) </w:t>
             </w:r>
           </w:p>
           <w:p>
@@ -2355,77 +1797,7 @@
               <w:rPr>
                 <w:rFonts w:ascii="Arial Narrow" w:hAnsi="Arial Narrow"/>
               </w:rPr>
-              <w:t xml:space="preserve">Competition  </w:t>
-            </w:r>
-            <w:proofErr w:type="gramStart"/>
-            <w:r>
-              <w:rPr>
-                <w:rFonts w:ascii="Arial Narrow" w:hAnsi="Arial Narrow"/>
-              </w:rPr>
-              <w:t xml:space="preserve">   (</w:t>
-            </w:r>
-            <w:proofErr w:type="gramEnd"/>
-            <w:r>
-              <w:rPr>
-                <w:rFonts w:ascii="Arial Narrow" w:hAnsi="Arial Narrow"/>
-              </w:rPr>
-              <w:t>{</w:t>
-            </w:r>
-            <w:proofErr w:type="spellStart"/>
-            <w:r>
-              <w:rPr>
-                <w:rFonts w:ascii="Arial Narrow" w:hAnsi="Arial Narrow"/>
-              </w:rPr>
-              <w:t>programPressConference</w:t>
-            </w:r>
-            <w:proofErr w:type="spellEnd"/>
-            <w:r>
-              <w:rPr>
-                <w:rFonts w:ascii="Arial Narrow" w:hAnsi="Arial Narrow"/>
-              </w:rPr>
-              <w:t xml:space="preserve">}) Press Conference  </w:t>
-            </w:r>
-            <w:proofErr w:type="gramStart"/>
-            <w:r>
-              <w:rPr>
-                <w:rFonts w:ascii="Arial Narrow" w:hAnsi="Arial Narrow"/>
-              </w:rPr>
-              <w:t xml:space="preserve">   (</w:t>
-            </w:r>
-            <w:proofErr w:type="gramEnd"/>
-            <w:r>
-              <w:rPr>
-                <w:rFonts w:ascii="Arial Narrow" w:hAnsi="Arial Narrow"/>
-              </w:rPr>
-              <w:t>{</w:t>
-            </w:r>
-            <w:proofErr w:type="spellStart"/>
-            <w:r>
-              <w:rPr>
-                <w:rFonts w:ascii="Arial Narrow" w:hAnsi="Arial Narrow"/>
-              </w:rPr>
-              <w:t>programSeminarConvention</w:t>
-            </w:r>
-            <w:proofErr w:type="spellEnd"/>
-            <w:r>
-              <w:rPr>
-                <w:rFonts w:ascii="Arial Narrow" w:hAnsi="Arial Narrow"/>
-              </w:rPr>
-              <w:t>}) Seminar/Convention     Others: {</w:t>
-            </w:r>
-            <w:proofErr w:type="spellStart"/>
-            <w:r>
-              <w:rPr>
-                <w:rFonts w:ascii="Arial Narrow" w:hAnsi="Arial Narrow"/>
-              </w:rPr>
-              <w:t>programOther</w:t>
-            </w:r>
-            <w:proofErr w:type="spellEnd"/>
-            <w:r>
-              <w:rPr>
-                <w:rFonts w:ascii="Arial Narrow" w:hAnsi="Arial Narrow"/>
-              </w:rPr>
-              <w:t>}</w:t>
+              <w:t>Competition     ({programPressConference}) Press Conference     ({programSeminarConvention}) Seminar/Convention     Others: {programOther}</w:t>
             </w:r>
           </w:p>
         </w:tc>
@@ -2578,161 +1950,7 @@
               <w:rPr>
                 <w:rFonts w:ascii="Arial Narrow" w:hAnsi="Arial Narrow"/>
               </w:rPr>
-              <w:t>({</w:t>
-            </w:r>
-            <w:proofErr w:type="spellStart"/>
-            <w:r>
-              <w:rPr>
-                <w:rFonts w:ascii="Arial Narrow" w:hAnsi="Arial Narrow"/>
-              </w:rPr>
-              <w:t>coreCourage</w:t>
-            </w:r>
-            <w:proofErr w:type="spellEnd"/>
-            <w:r>
-              <w:rPr>
-                <w:rFonts w:ascii="Arial Narrow" w:hAnsi="Arial Narrow"/>
-              </w:rPr>
-              <w:t xml:space="preserve">}) </w:t>
-            </w:r>
-            <w:proofErr w:type="gramStart"/>
-            <w:r>
-              <w:rPr>
-                <w:rFonts w:ascii="Arial Narrow" w:hAnsi="Arial Narrow"/>
-              </w:rPr>
-              <w:t>Courage  (</w:t>
-            </w:r>
-            <w:proofErr w:type="gramEnd"/>
-            <w:r>
-              <w:rPr>
-                <w:rFonts w:ascii="Arial Narrow" w:hAnsi="Arial Narrow"/>
-              </w:rPr>
-              <w:t>{</w:t>
-            </w:r>
-            <w:proofErr w:type="spellStart"/>
-            <w:r>
-              <w:rPr>
-                <w:rFonts w:ascii="Arial Narrow" w:hAnsi="Arial Narrow"/>
-              </w:rPr>
-              <w:t>coreCompassion</w:t>
-            </w:r>
-            <w:proofErr w:type="spellEnd"/>
-            <w:r>
-              <w:rPr>
-                <w:rFonts w:ascii="Arial Narrow" w:hAnsi="Arial Narrow"/>
-              </w:rPr>
-              <w:t xml:space="preserve">}) </w:t>
-            </w:r>
-            <w:proofErr w:type="gramStart"/>
-            <w:r>
-              <w:rPr>
-                <w:rFonts w:ascii="Arial Narrow" w:hAnsi="Arial Narrow"/>
-              </w:rPr>
-              <w:t>Compassion  (</w:t>
-            </w:r>
-            <w:proofErr w:type="gramEnd"/>
-            <w:r>
-              <w:rPr>
-                <w:rFonts w:ascii="Arial Narrow" w:hAnsi="Arial Narrow"/>
-              </w:rPr>
-              <w:t>{</w:t>
-            </w:r>
-            <w:proofErr w:type="spellStart"/>
-            <w:r>
-              <w:rPr>
-                <w:rFonts w:ascii="Arial Narrow" w:hAnsi="Arial Narrow"/>
-              </w:rPr>
-              <w:t>coreCommunityOriented</w:t>
-            </w:r>
-            <w:proofErr w:type="spellEnd"/>
-            <w:r>
-              <w:rPr>
-                <w:rFonts w:ascii="Arial Narrow" w:hAnsi="Arial Narrow"/>
-              </w:rPr>
-              <w:t>}) Community-</w:t>
-            </w:r>
-            <w:proofErr w:type="gramStart"/>
-            <w:r>
-              <w:rPr>
-                <w:rFonts w:ascii="Arial Narrow" w:hAnsi="Arial Narrow"/>
-              </w:rPr>
-              <w:t>Oriented  (</w:t>
-            </w:r>
-            <w:proofErr w:type="gramEnd"/>
-            <w:r>
-              <w:rPr>
-                <w:rFonts w:ascii="Arial Narrow" w:hAnsi="Arial Narrow"/>
-              </w:rPr>
-              <w:t>{</w:t>
-            </w:r>
-            <w:proofErr w:type="spellStart"/>
-            <w:r>
-              <w:rPr>
-                <w:rFonts w:ascii="Arial Narrow" w:hAnsi="Arial Narrow"/>
-              </w:rPr>
-              <w:t>coreHumility</w:t>
-            </w:r>
-            <w:proofErr w:type="spellEnd"/>
-            <w:r>
-              <w:rPr>
-                <w:rFonts w:ascii="Arial Narrow" w:hAnsi="Arial Narrow"/>
-              </w:rPr>
-              <w:t xml:space="preserve">}) </w:t>
-            </w:r>
-            <w:proofErr w:type="gramStart"/>
-            <w:r>
-              <w:rPr>
-                <w:rFonts w:ascii="Arial Narrow" w:hAnsi="Arial Narrow"/>
-              </w:rPr>
-              <w:t>Humility  (</w:t>
-            </w:r>
-            <w:proofErr w:type="gramEnd"/>
-            <w:r>
-              <w:rPr>
-                <w:rFonts w:ascii="Arial Narrow" w:hAnsi="Arial Narrow"/>
-              </w:rPr>
-              <w:t>{</w:t>
-            </w:r>
-            <w:proofErr w:type="spellStart"/>
-            <w:r>
-              <w:rPr>
-                <w:rFonts w:ascii="Arial Narrow" w:hAnsi="Arial Narrow"/>
-              </w:rPr>
-              <w:t>coreInteriority</w:t>
-            </w:r>
-            <w:proofErr w:type="spellEnd"/>
-            <w:r>
-              <w:rPr>
-                <w:rFonts w:ascii="Arial Narrow" w:hAnsi="Arial Narrow"/>
-              </w:rPr>
-              <w:t xml:space="preserve">}) </w:t>
-            </w:r>
-            <w:proofErr w:type="gramStart"/>
-            <w:r>
-              <w:rPr>
-                <w:rFonts w:ascii="Arial Narrow" w:hAnsi="Arial Narrow"/>
-              </w:rPr>
-              <w:t>Interiority  (</w:t>
-            </w:r>
-            <w:proofErr w:type="gramEnd"/>
-            <w:r>
-              <w:rPr>
-                <w:rFonts w:ascii="Arial Narrow" w:hAnsi="Arial Narrow"/>
-              </w:rPr>
-              <w:t>{</w:t>
-            </w:r>
-            <w:proofErr w:type="spellStart"/>
-            <w:r>
-              <w:rPr>
-                <w:rFonts w:ascii="Arial Narrow" w:hAnsi="Arial Narrow"/>
-              </w:rPr>
-              <w:t>coreMissionarySpirit</w:t>
-            </w:r>
-            <w:proofErr w:type="spellEnd"/>
-            <w:r>
-              <w:rPr>
-                <w:rFonts w:ascii="Arial Narrow" w:hAnsi="Arial Narrow"/>
-              </w:rPr>
-              <w:t>}) Missionary Spirit</w:t>
+              <w:t>({coreCourage}) Courage  ({coreCompassion}) Compassion  ({coreCommunityOriented}) Community-Oriented  ({coreHumility}) Humility  ({coreInteriority}) Interiority  ({coreMissionarySpirit}) Missionary Spirit</w:t>
             </w:r>
           </w:p>
         </w:tc>
@@ -2779,21 +1997,7 @@
               <w:rPr>
                 <w:rFonts w:ascii="Arial Narrow" w:hAnsi="Arial Narrow"/>
               </w:rPr>
-              <w:t>({</w:t>
-            </w:r>
-            <w:proofErr w:type="spellStart"/>
-            <w:r>
-              <w:rPr>
-                <w:rFonts w:ascii="Arial Narrow" w:hAnsi="Arial Narrow"/>
-              </w:rPr>
-              <w:t>egaCriticalCreative</w:t>
-            </w:r>
-            <w:proofErr w:type="spellEnd"/>
-            <w:r>
-              <w:rPr>
-                <w:rFonts w:ascii="Arial Narrow" w:hAnsi="Arial Narrow"/>
-              </w:rPr>
-              <w:t xml:space="preserve">}) EGA 1: Critical and Creative Thinker </w:t>
+              <w:t xml:space="preserve">({egaCriticalCreative}) EGA 1: Critical and Creative Thinker </w:t>
             </w:r>
           </w:p>
           <w:p>
@@ -2808,21 +2012,7 @@
               <w:rPr>
                 <w:rFonts w:ascii="Arial Narrow" w:hAnsi="Arial Narrow"/>
               </w:rPr>
-              <w:t>({</w:t>
-            </w:r>
-            <w:proofErr w:type="spellStart"/>
-            <w:r>
-              <w:rPr>
-                <w:rFonts w:ascii="Arial Narrow" w:hAnsi="Arial Narrow"/>
-              </w:rPr>
-              <w:t>egaCatholicProfessional</w:t>
-            </w:r>
-            <w:proofErr w:type="spellEnd"/>
-            <w:r>
-              <w:rPr>
-                <w:rFonts w:ascii="Arial Narrow" w:hAnsi="Arial Narrow"/>
-              </w:rPr>
-              <w:t>}) EGA 2: Competent Catholic Augustinian-Marian Professional</w:t>
+              <w:t>({egaCatholicProfessional}) EGA 2: Competent Catholic Augustinian-Marian Professional</w:t>
             </w:r>
           </w:p>
           <w:p>
@@ -2837,21 +2027,7 @@
               <w:rPr>
                 <w:rFonts w:ascii="Arial Narrow" w:hAnsi="Arial Narrow"/>
               </w:rPr>
-              <w:t>({</w:t>
-            </w:r>
-            <w:proofErr w:type="spellStart"/>
-            <w:r>
-              <w:rPr>
-                <w:rFonts w:ascii="Arial Narrow" w:hAnsi="Arial Narrow"/>
-              </w:rPr>
-              <w:t>egaResponsiveSteward</w:t>
-            </w:r>
-            <w:proofErr w:type="spellEnd"/>
-            <w:r>
-              <w:rPr>
-                <w:rFonts w:ascii="Arial Narrow" w:hAnsi="Arial Narrow"/>
-              </w:rPr>
-              <w:t>}) EGA 3: Socially Responsive Steward</w:t>
+              <w:t>({egaResponsiveSteward}) EGA 3: Socially Responsive Steward</w:t>
             </w:r>
           </w:p>
           <w:p>
@@ -2866,21 +2042,7 @@
               <w:rPr>
                 <w:rFonts w:ascii="Arial Narrow" w:hAnsi="Arial Narrow"/>
               </w:rPr>
-              <w:t>({</w:t>
-            </w:r>
-            <w:proofErr w:type="spellStart"/>
-            <w:r>
-              <w:rPr>
-                <w:rFonts w:ascii="Arial Narrow" w:hAnsi="Arial Narrow"/>
-              </w:rPr>
-              <w:t>egaLifelongLearner</w:t>
-            </w:r>
-            <w:proofErr w:type="spellEnd"/>
-            <w:r>
-              <w:rPr>
-                <w:rFonts w:ascii="Arial Narrow" w:hAnsi="Arial Narrow"/>
-              </w:rPr>
-              <w:t>}) EGA 4: Transformative Lifelong Learner</w:t>
+              <w:t>({egaLifelongLearner}) EGA 4: Transformative Lifelong Learner</w:t>
             </w:r>
           </w:p>
         </w:tc>
@@ -2931,25 +2093,7 @@
                 <w:i/>
                 <w:iCs/>
               </w:rPr>
-              <w:t>{</w:t>
-            </w:r>
-            <w:proofErr w:type="spellStart"/>
-            <w:r>
-              <w:rPr>
-                <w:rFonts w:ascii="Arial Narrow" w:hAnsi="Arial Narrow"/>
-                <w:i/>
-                <w:iCs/>
-              </w:rPr>
-              <w:t>programFlow</w:t>
-            </w:r>
-            <w:proofErr w:type="spellEnd"/>
-            <w:r>
-              <w:rPr>
-                <w:rFonts w:ascii="Arial Narrow" w:hAnsi="Arial Narrow"/>
-                <w:i/>
-                <w:iCs/>
-              </w:rPr>
-              <w:t>}</w:t>
+              <w:t>{programFlow}</w:t>
             </w:r>
           </w:p>
         </w:tc>
@@ -2998,23 +2142,7 @@
                 <w:rFonts w:ascii="Arial Narrow" w:hAnsi="Arial Narrow"/>
                 <w:lang w:val="en-PH"/>
               </w:rPr>
-              <w:t>{</w:t>
-            </w:r>
-            <w:proofErr w:type="spellStart"/>
-            <w:r>
-              <w:rPr>
-                <w:rFonts w:ascii="Arial Narrow" w:hAnsi="Arial Narrow"/>
-                <w:lang w:val="en-PH"/>
-              </w:rPr>
-              <w:t>emergencyPlan</w:t>
-            </w:r>
-            <w:proofErr w:type="spellEnd"/>
-            <w:r>
-              <w:rPr>
-                <w:rFonts w:ascii="Arial Narrow" w:hAnsi="Arial Narrow"/>
-                <w:lang w:val="en-PH"/>
-              </w:rPr>
-              <w:t>}</w:t>
+              <w:t>{emergencyPlan}</w:t>
             </w:r>
           </w:p>
         </w:tc>
@@ -3130,29 +2258,7 @@
                 <w:sz w:val="24"/>
                 <w:szCs w:val="24"/>
               </w:rPr>
-              <w:t>{</w:t>
-            </w:r>
-            <w:proofErr w:type="spellStart"/>
-            <w:r>
-              <w:rPr>
-                <w:rFonts w:ascii="Arial Narrow" w:hAnsi="Arial Narrow"/>
-                <w:b/>
-                <w:bCs/>
-                <w:sz w:val="24"/>
-                <w:szCs w:val="24"/>
-              </w:rPr>
-              <w:t>sourceOfBudget</w:t>
-            </w:r>
-            <w:proofErr w:type="spellEnd"/>
-            <w:r>
-              <w:rPr>
-                <w:rFonts w:ascii="Arial Narrow" w:hAnsi="Arial Narrow"/>
-                <w:b/>
-                <w:bCs/>
-                <w:sz w:val="24"/>
-                <w:szCs w:val="24"/>
-              </w:rPr>
-              <w:t>}</w:t>
+              <w:t>{sourceOfBudget}</w:t>
             </w:r>
           </w:p>
         </w:tc>
@@ -3239,39 +2345,7 @@
                 <w:rFonts w:ascii="Arial Narrow" w:hAnsi="Arial Narrow"/>
                 <w:b/>
               </w:rPr>
-              <w:t>({</w:t>
-            </w:r>
-            <w:proofErr w:type="spellStart"/>
-            <w:r>
-              <w:rPr>
-                <w:rFonts w:ascii="Arial Narrow" w:hAnsi="Arial Narrow"/>
-                <w:b/>
-              </w:rPr>
-              <w:t>supportBudget</w:t>
-            </w:r>
-            <w:proofErr w:type="spellEnd"/>
-            <w:r>
-              <w:rPr>
-                <w:rFonts w:ascii="Arial Narrow" w:hAnsi="Arial Narrow"/>
-                <w:b/>
-              </w:rPr>
-              <w:t>}) BUDGET: {</w:t>
-            </w:r>
-            <w:proofErr w:type="spellStart"/>
-            <w:r>
-              <w:rPr>
-                <w:rFonts w:ascii="Arial Narrow" w:hAnsi="Arial Narrow"/>
-                <w:b/>
-              </w:rPr>
-              <w:t>budgetDetails</w:t>
-            </w:r>
-            <w:proofErr w:type="spellEnd"/>
-            <w:r>
-              <w:rPr>
-                <w:rFonts w:ascii="Arial Narrow" w:hAnsi="Arial Narrow"/>
-                <w:b/>
-              </w:rPr>
-              <w:t>}</w:t>
+              <w:t>({supportBudget}) BUDGET: {budgetDetails}</w:t>
             </w:r>
           </w:p>
         </w:tc>
@@ -3292,23 +2366,7 @@
                 <w:rFonts w:ascii="Arial Narrow" w:hAnsi="Arial Narrow"/>
                 <w:b/>
               </w:rPr>
-              <w:t>({</w:t>
-            </w:r>
-            <w:proofErr w:type="spellStart"/>
-            <w:r>
-              <w:rPr>
-                <w:rFonts w:ascii="Arial Narrow" w:hAnsi="Arial Narrow"/>
-                <w:b/>
-              </w:rPr>
-              <w:t>supportVehicle</w:t>
-            </w:r>
-            <w:proofErr w:type="spellEnd"/>
-            <w:r>
-              <w:rPr>
-                <w:rFonts w:ascii="Arial Narrow" w:hAnsi="Arial Narrow"/>
-                <w:b/>
-              </w:rPr>
-              <w:t xml:space="preserve">}) </w:t>
+              <w:t xml:space="preserve">({supportVehicle}) </w:t>
             </w:r>
             <w:r>
               <w:rPr>
@@ -3346,25 +2404,7 @@
                 <w:b/>
                 <w:u w:val="single"/>
               </w:rPr>
-              <w:t>{</w:t>
-            </w:r>
-            <w:proofErr w:type="spellStart"/>
-            <w:r>
-              <w:rPr>
-                <w:rFonts w:ascii="Arial Narrow" w:hAnsi="Arial Narrow"/>
-                <w:b/>
-                <w:u w:val="single"/>
-              </w:rPr>
-              <w:t>vehiclePassengers</w:t>
-            </w:r>
-            <w:proofErr w:type="spellEnd"/>
-            <w:r>
-              <w:rPr>
-                <w:rFonts w:ascii="Arial Narrow" w:hAnsi="Arial Narrow"/>
-                <w:b/>
-                <w:u w:val="single"/>
-              </w:rPr>
-              <w:t>}</w:t>
+              <w:t>{vehiclePassengers}</w:t>
             </w:r>
           </w:p>
           <w:p>
@@ -3432,23 +2472,7 @@
                 <w:rFonts w:ascii="Arial Narrow" w:hAnsi="Arial Narrow"/>
                 <w:b/>
               </w:rPr>
-              <w:t>({</w:t>
-            </w:r>
-            <w:proofErr w:type="spellStart"/>
-            <w:r>
-              <w:rPr>
-                <w:rFonts w:ascii="Arial Narrow" w:hAnsi="Arial Narrow"/>
-                <w:b/>
-              </w:rPr>
-              <w:t>supportFoodSnacks</w:t>
-            </w:r>
-            <w:proofErr w:type="spellEnd"/>
-            <w:r>
-              <w:rPr>
-                <w:rFonts w:ascii="Arial Narrow" w:hAnsi="Arial Narrow"/>
-                <w:b/>
-              </w:rPr>
-              <w:t>})</w:t>
+              <w:t>({supportFoodSnacks})</w:t>
             </w:r>
             <w:r>
               <w:rPr>
@@ -3491,25 +2515,7 @@
                 <w:b/>
                 <w:u w:val="single"/>
               </w:rPr>
-              <w:t>{</w:t>
-            </w:r>
-            <w:proofErr w:type="spellStart"/>
-            <w:r>
-              <w:rPr>
-                <w:rFonts w:ascii="Arial Narrow" w:hAnsi="Arial Narrow"/>
-                <w:b/>
-                <w:u w:val="single"/>
-              </w:rPr>
-              <w:t>foodPax</w:t>
-            </w:r>
-            <w:proofErr w:type="spellEnd"/>
-            <w:r>
-              <w:rPr>
-                <w:rFonts w:ascii="Arial Narrow" w:hAnsi="Arial Narrow"/>
-                <w:b/>
-                <w:u w:val="single"/>
-              </w:rPr>
-              <w:t>}</w:t>
+              <w:t>{foodPax}</w:t>
             </w:r>
           </w:p>
           <w:p>
@@ -3558,23 +2564,7 @@
                 <w:rFonts w:ascii="Arial Narrow" w:hAnsi="Arial Narrow"/>
                 <w:b/>
               </w:rPr>
-              <w:t>({</w:t>
-            </w:r>
-            <w:proofErr w:type="spellStart"/>
-            <w:r>
-              <w:rPr>
-                <w:rFonts w:ascii="Arial Narrow" w:hAnsi="Arial Narrow"/>
-                <w:b/>
-              </w:rPr>
-              <w:t>supportRoomVenue</w:t>
-            </w:r>
-            <w:proofErr w:type="spellEnd"/>
-            <w:r>
-              <w:rPr>
-                <w:rFonts w:ascii="Arial Narrow" w:hAnsi="Arial Narrow"/>
-                <w:b/>
-              </w:rPr>
-              <w:t>})</w:t>
+              <w:t>({supportRoomVenue})</w:t>
             </w:r>
             <w:r>
               <w:rPr>
@@ -3610,25 +2600,7 @@
                 <w:b/>
                 <w:u w:val="single"/>
               </w:rPr>
-              <w:t>{</w:t>
-            </w:r>
-            <w:proofErr w:type="spellStart"/>
-            <w:r>
-              <w:rPr>
-                <w:rFonts w:ascii="Arial Narrow" w:hAnsi="Arial Narrow"/>
-                <w:b/>
-                <w:u w:val="single"/>
-              </w:rPr>
-              <w:t>roomVenueDetails</w:t>
-            </w:r>
-            <w:proofErr w:type="spellEnd"/>
-            <w:r>
-              <w:rPr>
-                <w:rFonts w:ascii="Arial Narrow" w:hAnsi="Arial Narrow"/>
-                <w:b/>
-                <w:u w:val="single"/>
-              </w:rPr>
-              <w:t>}</w:t>
+              <w:t>{roomVenueDetails}</w:t>
             </w:r>
           </w:p>
           <w:p>
@@ -3682,23 +2654,7 @@
                 <w:rFonts w:ascii="Arial Narrow" w:hAnsi="Arial Narrow"/>
                 <w:b/>
               </w:rPr>
-              <w:t>({</w:t>
-            </w:r>
-            <w:proofErr w:type="spellStart"/>
-            <w:r>
-              <w:rPr>
-                <w:rFonts w:ascii="Arial Narrow" w:hAnsi="Arial Narrow"/>
-                <w:b/>
-              </w:rPr>
-              <w:t>supportSoundSystem</w:t>
-            </w:r>
-            <w:proofErr w:type="spellEnd"/>
-            <w:r>
-              <w:rPr>
-                <w:rFonts w:ascii="Arial Narrow" w:hAnsi="Arial Narrow"/>
-                <w:b/>
-              </w:rPr>
-              <w:t xml:space="preserve">}) </w:t>
+              <w:t xml:space="preserve">({supportSoundSystem}) </w:t>
             </w:r>
             <w:r>
               <w:rPr>
@@ -3729,23 +2685,7 @@
                 <w:rFonts w:ascii="Arial Narrow" w:hAnsi="Arial Narrow"/>
                 <w:b/>
               </w:rPr>
-              <w:t>({</w:t>
-            </w:r>
-            <w:proofErr w:type="spellStart"/>
-            <w:r>
-              <w:rPr>
-                <w:rFonts w:ascii="Arial Narrow" w:hAnsi="Arial Narrow"/>
-                <w:b/>
-              </w:rPr>
-              <w:t>supportMicrophone</w:t>
-            </w:r>
-            <w:proofErr w:type="spellEnd"/>
-            <w:r>
-              <w:rPr>
-                <w:rFonts w:ascii="Arial Narrow" w:hAnsi="Arial Narrow"/>
-                <w:b/>
-              </w:rPr>
-              <w:t xml:space="preserve">}) </w:t>
+              <w:t xml:space="preserve">({supportMicrophone}) </w:t>
             </w:r>
             <w:r>
               <w:rPr>
@@ -3785,23 +2725,7 @@
                 <w:rFonts w:ascii="Arial Narrow" w:hAnsi="Arial Narrow"/>
                 <w:b/>
               </w:rPr>
-              <w:t>({</w:t>
-            </w:r>
-            <w:proofErr w:type="spellStart"/>
-            <w:r>
-              <w:rPr>
-                <w:rFonts w:ascii="Arial Narrow" w:hAnsi="Arial Narrow"/>
-                <w:b/>
-              </w:rPr>
-              <w:t>supportLcdProjector</w:t>
-            </w:r>
-            <w:proofErr w:type="spellEnd"/>
-            <w:r>
-              <w:rPr>
-                <w:rFonts w:ascii="Arial Narrow" w:hAnsi="Arial Narrow"/>
-                <w:b/>
-              </w:rPr>
-              <w:t xml:space="preserve">}) </w:t>
+              <w:t xml:space="preserve">({supportLcdProjector}) </w:t>
             </w:r>
             <w:r>
               <w:rPr>
@@ -3833,23 +2757,7 @@
                 <w:rFonts w:ascii="Arial Narrow" w:hAnsi="Arial Narrow"/>
                 <w:b/>
               </w:rPr>
-              <w:t>{</w:t>
-            </w:r>
-            <w:proofErr w:type="spellStart"/>
-            <w:r>
-              <w:rPr>
-                <w:rFonts w:ascii="Arial Narrow" w:hAnsi="Arial Narrow"/>
-                <w:b/>
-              </w:rPr>
-              <w:t>supportLongTable</w:t>
-            </w:r>
-            <w:proofErr w:type="spellEnd"/>
-            <w:r>
-              <w:rPr>
-                <w:rFonts w:ascii="Arial Narrow" w:hAnsi="Arial Narrow"/>
-                <w:b/>
-              </w:rPr>
-              <w:t>}</w:t>
+              <w:t>{supportLongTable}</w:t>
             </w:r>
             <w:r>
               <w:rPr>
@@ -3908,7 +2816,6 @@
               </w:rPr>
               <w:t xml:space="preserve"> {</w:t>
             </w:r>
-            <w:proofErr w:type="spellStart"/>
             <w:r>
               <w:rPr>
                 <w:rFonts w:ascii="Arial Narrow" w:hAnsi="Arial Narrow"/>
@@ -3916,7 +2823,6 @@
               </w:rPr>
               <w:t>otherSupport</w:t>
             </w:r>
-            <w:proofErr w:type="spellEnd"/>
             <w:r>
               <w:rPr>
                 <w:rFonts w:ascii="Arial Narrow" w:hAnsi="Arial Narrow"/>
@@ -3962,23 +2868,7 @@
                 <w:rFonts w:ascii="Arial Narrow" w:hAnsi="Arial Narrow"/>
                 <w:b/>
               </w:rPr>
-              <w:t xml:space="preserve"> {</w:t>
-            </w:r>
-            <w:proofErr w:type="spellStart"/>
-            <w:r>
-              <w:rPr>
-                <w:rFonts w:ascii="Arial Narrow" w:hAnsi="Arial Narrow"/>
-                <w:b/>
-              </w:rPr>
-              <w:t>extraProvisions</w:t>
-            </w:r>
-            <w:proofErr w:type="spellEnd"/>
-            <w:r>
-              <w:rPr>
-                <w:rFonts w:ascii="Arial Narrow" w:hAnsi="Arial Narrow"/>
-                <w:b/>
-              </w:rPr>
-              <w:t>}</w:t>
+              <w:t xml:space="preserve"> {extraProvisions}</w:t>
             </w:r>
           </w:p>
         </w:tc>
@@ -4066,25 +2956,7 @@
           <w:bCs/>
           <w:sz w:val="20"/>
         </w:rPr>
-        <w:t>{</w:t>
-      </w:r>
-      <w:proofErr w:type="spellStart"/>
-      <w:r>
-        <w:rPr>
-          <w:rFonts w:ascii="Century Gothic" w:hAnsi="Century Gothic"/>
-          <w:bCs/>
-          <w:sz w:val="20"/>
-        </w:rPr>
-        <w:t>otherDetailsText</w:t>
-      </w:r>
-      <w:proofErr w:type="spellEnd"/>
-      <w:r>
-        <w:rPr>
-          <w:rFonts w:ascii="Century Gothic" w:hAnsi="Century Gothic"/>
-          <w:bCs/>
-          <w:sz w:val="20"/>
-        </w:rPr>
-        <w:t>}</w:t>
+        <w:t>{otherDetailsText}</w:t>
       </w:r>
     </w:p>
     <w:p>
@@ -4192,60 +3064,28 @@
                 <w:rFonts w:ascii="Arial Narrow" w:hAnsi="Arial Narrow" w:cs="Arial"/>
                 <w:b/>
               </w:rPr>
-              <w:t>({</w:t>
-            </w:r>
-            <w:proofErr w:type="spellStart"/>
+              <w:t>({parentsConsentYes})</w:t>
+            </w:r>
             <w:r>
               <w:rPr>
                 <w:rFonts w:ascii="Arial Narrow" w:hAnsi="Arial Narrow" w:cs="Arial"/>
                 <w:b/>
               </w:rPr>
-              <w:t>parentsConsentYes</w:t>
-            </w:r>
-            <w:proofErr w:type="spellEnd"/>
+              <w:t xml:space="preserve"> Yes</w:t>
+            </w:r>
             <w:r>
               <w:rPr>
                 <w:rFonts w:ascii="Arial Narrow" w:hAnsi="Arial Narrow" w:cs="Arial"/>
                 <w:b/>
               </w:rPr>
-              <w:t>})</w:t>
+              <w:t xml:space="preserve"> </w:t>
             </w:r>
             <w:r>
               <w:rPr>
                 <w:rFonts w:ascii="Arial Narrow" w:hAnsi="Arial Narrow" w:cs="Arial"/>
                 <w:b/>
               </w:rPr>
-              <w:t xml:space="preserve"> Yes</w:t>
-            </w:r>
-            <w:r>
-              <w:rPr>
-                <w:rFonts w:ascii="Arial Narrow" w:hAnsi="Arial Narrow" w:cs="Arial"/>
-                <w:b/>
-              </w:rPr>
-              <w:t xml:space="preserve"> </w:t>
-            </w:r>
-            <w:r>
-              <w:rPr>
-                <w:rFonts w:ascii="Arial Narrow" w:hAnsi="Arial Narrow" w:cs="Arial"/>
-                <w:b/>
-              </w:rPr>
-              <w:t>({</w:t>
-            </w:r>
-            <w:proofErr w:type="spellStart"/>
-            <w:r>
-              <w:rPr>
-                <w:rFonts w:ascii="Arial Narrow" w:hAnsi="Arial Narrow" w:cs="Arial"/>
-                <w:b/>
-              </w:rPr>
-              <w:t>parentsConsentNotApplicable</w:t>
-            </w:r>
-            <w:proofErr w:type="spellEnd"/>
-            <w:r>
-              <w:rPr>
-                <w:rFonts w:ascii="Arial Narrow" w:hAnsi="Arial Narrow" w:cs="Arial"/>
-                <w:b/>
-              </w:rPr>
-              <w:t>})</w:t>
+              <w:t>({parentsConsentNotApplicable})</w:t>
             </w:r>
             <w:r>
               <w:rPr>
@@ -4327,53 +3167,21 @@
                 <w:rFonts w:ascii="Arial Narrow" w:hAnsi="Arial Narrow" w:cs="Arial"/>
                 <w:b/>
               </w:rPr>
-              <w:t>({</w:t>
-            </w:r>
-            <w:proofErr w:type="spellStart"/>
+              <w:t>({parentsConsentYes})</w:t>
+            </w:r>
             <w:r>
               <w:rPr>
                 <w:rFonts w:ascii="Arial Narrow" w:hAnsi="Arial Narrow" w:cs="Arial"/>
                 <w:b/>
               </w:rPr>
-              <w:t>parentsConsentYes</w:t>
-            </w:r>
-            <w:proofErr w:type="spellEnd"/>
+              <w:t xml:space="preserve"> Yes </w:t>
+            </w:r>
             <w:r>
               <w:rPr>
                 <w:rFonts w:ascii="Arial Narrow" w:hAnsi="Arial Narrow" w:cs="Arial"/>
                 <w:b/>
               </w:rPr>
-              <w:t>})</w:t>
-            </w:r>
-            <w:r>
-              <w:rPr>
-                <w:rFonts w:ascii="Arial Narrow" w:hAnsi="Arial Narrow" w:cs="Arial"/>
-                <w:b/>
-              </w:rPr>
-              <w:t xml:space="preserve"> Yes </w:t>
-            </w:r>
-            <w:r>
-              <w:rPr>
-                <w:rFonts w:ascii="Arial Narrow" w:hAnsi="Arial Narrow" w:cs="Arial"/>
-                <w:b/>
-              </w:rPr>
-              <w:t>({</w:t>
-            </w:r>
-            <w:proofErr w:type="spellStart"/>
-            <w:r>
-              <w:rPr>
-                <w:rFonts w:ascii="Arial Narrow" w:hAnsi="Arial Narrow" w:cs="Arial"/>
-                <w:b/>
-              </w:rPr>
-              <w:t>academicInterruptionNone</w:t>
-            </w:r>
-            <w:proofErr w:type="spellEnd"/>
-            <w:r>
-              <w:rPr>
-                <w:rFonts w:ascii="Arial Narrow" w:hAnsi="Arial Narrow" w:cs="Arial"/>
-                <w:b/>
-              </w:rPr>
-              <w:t>})</w:t>
+              <w:t>({academicInterruptionNone})</w:t>
             </w:r>
             <w:r>
               <w:rPr>
@@ -4422,31 +3230,7 @@
                 <w:sz w:val="20"/>
                 <w:u w:val="single"/>
               </w:rPr>
-              <w:t>{</w:t>
-            </w:r>
-            <w:proofErr w:type="spellStart"/>
-            <w:r>
-              <w:rPr>
-                <w:rFonts w:ascii="Arial Narrow" w:hAnsi="Arial Narrow" w:cs="Arial"/>
-                <w:b/>
-                <w:i/>
-                <w:color w:val="ED7D31" w:themeColor="accent2"/>
-                <w:sz w:val="20"/>
-                <w:u w:val="single"/>
-              </w:rPr>
-              <w:t>academicRemarks</w:t>
-            </w:r>
-            <w:proofErr w:type="spellEnd"/>
-            <w:r>
-              <w:rPr>
-                <w:rFonts w:ascii="Arial Narrow" w:hAnsi="Arial Narrow" w:cs="Arial"/>
-                <w:b/>
-                <w:i/>
-                <w:color w:val="ED7D31" w:themeColor="accent2"/>
-                <w:sz w:val="20"/>
-                <w:u w:val="single"/>
-              </w:rPr>
-              <w:t>}</w:t>
+              <w:t>{academicRemarks}</w:t>
             </w:r>
           </w:p>
         </w:tc>
@@ -4475,69 +3259,21 @@
                 <w:rFonts w:ascii="Arial Narrow" w:hAnsi="Arial Narrow" w:cs="Arial"/>
                 <w:b/>
               </w:rPr>
-              <w:t>({</w:t>
-            </w:r>
-            <w:proofErr w:type="spellStart"/>
+              <w:t>({medicalExamYes})</w:t>
+            </w:r>
             <w:r>
               <w:rPr>
                 <w:rFonts w:ascii="Arial Narrow" w:hAnsi="Arial Narrow" w:cs="Arial"/>
                 <w:b/>
               </w:rPr>
-              <w:t>medicalExamYes</w:t>
-            </w:r>
-            <w:proofErr w:type="spellEnd"/>
+              <w:t xml:space="preserve"> Yes  </w:t>
+            </w:r>
             <w:r>
               <w:rPr>
                 <w:rFonts w:ascii="Arial Narrow" w:hAnsi="Arial Narrow" w:cs="Arial"/>
                 <w:b/>
               </w:rPr>
-              <w:t>})</w:t>
-            </w:r>
-            <w:r>
-              <w:rPr>
-                <w:rFonts w:ascii="Arial Narrow" w:hAnsi="Arial Narrow" w:cs="Arial"/>
-                <w:b/>
-              </w:rPr>
-              <w:t xml:space="preserve"> </w:t>
-            </w:r>
-            <w:proofErr w:type="gramStart"/>
-            <w:r>
-              <w:rPr>
-                <w:rFonts w:ascii="Arial Narrow" w:hAnsi="Arial Narrow" w:cs="Arial"/>
-                <w:b/>
-              </w:rPr>
-              <w:t xml:space="preserve">Yes  </w:t>
-            </w:r>
-            <w:r>
-              <w:rPr>
-                <w:rFonts w:ascii="Arial Narrow" w:hAnsi="Arial Narrow" w:cs="Arial"/>
-                <w:b/>
-              </w:rPr>
-              <w:t>(</w:t>
-            </w:r>
-            <w:proofErr w:type="gramEnd"/>
-            <w:r>
-              <w:rPr>
-                <w:rFonts w:ascii="Arial Narrow" w:hAnsi="Arial Narrow" w:cs="Arial"/>
-                <w:b/>
-              </w:rPr>
-              <w:t>{</w:t>
-            </w:r>
-            <w:proofErr w:type="spellStart"/>
-            <w:r>
-              <w:rPr>
-                <w:rFonts w:ascii="Arial Narrow" w:hAnsi="Arial Narrow" w:cs="Arial"/>
-                <w:b/>
-              </w:rPr>
-              <w:t>medicalExamNotApplicable</w:t>
-            </w:r>
-            <w:proofErr w:type="spellEnd"/>
-            <w:r>
-              <w:rPr>
-                <w:rFonts w:ascii="Arial Narrow" w:hAnsi="Arial Narrow" w:cs="Arial"/>
-                <w:b/>
-              </w:rPr>
-              <w:t>})</w:t>
+              <w:t>({medicalExamNotApplicable})</w:t>
             </w:r>
             <w:r>
               <w:rPr>
@@ -4577,17 +3313,16 @@
                 <w:color w:val="ED7D31" w:themeColor="accent2"/>
                 <w:sz w:val="18"/>
               </w:rPr>
-              <w:t>[CMO no. 63 s.2017</w:t>
-            </w:r>
-            <w:proofErr w:type="gramStart"/>
+              <w:t>[CMO no. 63 s.2017]</w:t>
+            </w:r>
             <w:r>
               <w:rPr>
                 <w:rFonts w:ascii="Arial Narrow" w:hAnsi="Arial Narrow" w:cs="Arial"/>
-                <w:i/>
+                <w:b/>
                 <w:color w:val="ED7D31" w:themeColor="accent2"/>
                 <w:sz w:val="18"/>
               </w:rPr>
-              <w:t>]</w:t>
+              <w:t xml:space="preserve"> </w:t>
             </w:r>
             <w:r>
               <w:rPr>
@@ -4602,8 +3337,13 @@
               <w:rPr>
                 <w:rFonts w:ascii="Arial Narrow" w:hAnsi="Arial Narrow" w:cs="Arial"/>
                 <w:b/>
-                <w:color w:val="ED7D31" w:themeColor="accent2"/>
-                <w:sz w:val="18"/>
+              </w:rPr>
+              <w:t>({reportComplianceYes})</w:t>
+            </w:r>
+            <w:r>
+              <w:rPr>
+                <w:rFonts w:ascii="Arial Narrow" w:hAnsi="Arial Narrow" w:cs="Arial"/>
+                <w:b/>
               </w:rPr>
               <w:t xml:space="preserve"> </w:t>
             </w:r>
@@ -4612,84 +3352,21 @@
                 <w:rFonts w:ascii="Arial Narrow" w:hAnsi="Arial Narrow" w:cs="Arial"/>
                 <w:b/>
               </w:rPr>
-              <w:t>(</w:t>
-            </w:r>
-            <w:proofErr w:type="gramEnd"/>
+              <w:t xml:space="preserve">Yes </w:t>
+            </w:r>
             <w:r>
               <w:rPr>
                 <w:rFonts w:ascii="Arial Narrow" w:hAnsi="Arial Narrow" w:cs="Arial"/>
                 <w:b/>
               </w:rPr>
-              <w:t>{</w:t>
-            </w:r>
-            <w:proofErr w:type="spellStart"/>
+              <w:t xml:space="preserve"> </w:t>
+            </w:r>
             <w:r>
               <w:rPr>
                 <w:rFonts w:ascii="Arial Narrow" w:hAnsi="Arial Narrow" w:cs="Arial"/>
                 <w:b/>
               </w:rPr>
-              <w:t>reportComplianceYes</w:t>
-            </w:r>
-            <w:proofErr w:type="spellEnd"/>
-            <w:r>
-              <w:rPr>
-                <w:rFonts w:ascii="Arial Narrow" w:hAnsi="Arial Narrow" w:cs="Arial"/>
-                <w:b/>
-              </w:rPr>
-              <w:t>})</w:t>
-            </w:r>
-            <w:r>
-              <w:rPr>
-                <w:rFonts w:ascii="Arial Narrow" w:hAnsi="Arial Narrow" w:cs="Arial"/>
-                <w:b/>
-              </w:rPr>
-              <w:t xml:space="preserve"> </w:t>
-            </w:r>
-            <w:proofErr w:type="gramStart"/>
-            <w:r>
-              <w:rPr>
-                <w:rFonts w:ascii="Arial Narrow" w:hAnsi="Arial Narrow" w:cs="Arial"/>
-                <w:b/>
-              </w:rPr>
-              <w:t xml:space="preserve">Yes </w:t>
-            </w:r>
-            <w:r>
-              <w:rPr>
-                <w:rFonts w:ascii="Arial Narrow" w:hAnsi="Arial Narrow" w:cs="Arial"/>
-                <w:b/>
-              </w:rPr>
-              <w:t xml:space="preserve"> </w:t>
-            </w:r>
-            <w:r>
-              <w:rPr>
-                <w:rFonts w:ascii="Arial Narrow" w:hAnsi="Arial Narrow" w:cs="Arial"/>
-                <w:b/>
-              </w:rPr>
-              <w:t>(</w:t>
-            </w:r>
-            <w:proofErr w:type="gramEnd"/>
-            <w:r>
-              <w:rPr>
-                <w:rFonts w:ascii="Arial Narrow" w:hAnsi="Arial Narrow" w:cs="Arial"/>
-                <w:b/>
-              </w:rPr>
-              <w:t>{</w:t>
-            </w:r>
-            <w:proofErr w:type="spellStart"/>
-            <w:r>
-              <w:rPr>
-                <w:rFonts w:ascii="Arial Narrow" w:hAnsi="Arial Narrow" w:cs="Arial"/>
-                <w:b/>
-              </w:rPr>
-              <w:t>reportComplianceNotApplicable</w:t>
-            </w:r>
-            <w:proofErr w:type="spellEnd"/>
-            <w:r>
-              <w:rPr>
-                <w:rFonts w:ascii="Arial Narrow" w:hAnsi="Arial Narrow" w:cs="Arial"/>
-                <w:b/>
-              </w:rPr>
-              <w:t>})</w:t>
+              <w:t>({reportComplianceNotApplicable})</w:t>
             </w:r>
             <w:r>
               <w:rPr>
@@ -4733,25 +3410,7 @@
                 <w:b/>
                 <w:u w:val="single"/>
               </w:rPr>
-              <w:t>{</w:t>
-            </w:r>
-            <w:proofErr w:type="spellStart"/>
-            <w:r>
-              <w:rPr>
-                <w:rFonts w:ascii="Arial Narrow" w:hAnsi="Arial Narrow" w:cs="Arial"/>
-                <w:b/>
-                <w:u w:val="single"/>
-              </w:rPr>
-              <w:t>studentPersonnelRatio</w:t>
-            </w:r>
-            <w:proofErr w:type="spellEnd"/>
-            <w:r>
-              <w:rPr>
-                <w:rFonts w:ascii="Arial Narrow" w:hAnsi="Arial Narrow" w:cs="Arial"/>
-                <w:b/>
-                <w:u w:val="single"/>
-              </w:rPr>
-              <w:t>}</w:t>
+              <w:t>{studentPersonnelRatio}</w:t>
             </w:r>
           </w:p>
         </w:tc>
@@ -4878,114 +3537,78 @@
                 <w:b/>
                 <w:bCs/>
               </w:rPr>
-              <w:t>{</w:t>
-            </w:r>
-            <w:proofErr w:type="spellStart"/>
-            <w:r>
+              <w:t>{preparedBy}</w:t>
+            </w:r>
+          </w:p>
+          <w:p>
+            <w:pPr>
+              <w:spacing w:after="0"/>
+              <w:rPr>
+                <w:rFonts w:ascii="Arial Narrow" w:hAnsi="Arial Narrow"/>
+              </w:rPr>
+            </w:pPr>
+            <w:r>
+              <w:rPr>
+                <w:rFonts w:ascii="Arial Narrow" w:hAnsi="Arial Narrow"/>
+              </w:rPr>
+              <w:t>Organization</w:t>
+            </w:r>
+            <w:r>
+              <w:rPr>
+                <w:rFonts w:ascii="Arial Narrow" w:hAnsi="Arial Narrow"/>
+              </w:rPr>
+              <w:t xml:space="preserve">, </w:t>
+            </w:r>
+            <w:r>
+              <w:rPr>
+                <w:rFonts w:ascii="Arial Narrow" w:hAnsi="Arial Narrow"/>
+              </w:rPr>
+              <w:t>Officer</w:t>
+            </w:r>
+          </w:p>
+        </w:tc>
+        <w:tc>
+          <w:tcPr>
+            <w:tcW w:w="3969" w:type="dxa"/>
+          </w:tcPr>
+          <w:p>
+            <w:pPr>
+              <w:spacing w:after="0"/>
+              <w:rPr>
+                <w:rFonts w:ascii="Arial Narrow" w:hAnsi="Arial Narrow"/>
+              </w:rPr>
+            </w:pPr>
+            <w:r>
+              <w:rPr>
+                <w:rFonts w:ascii="Arial Narrow" w:hAnsi="Arial Narrow"/>
+              </w:rPr>
+              <w:t>Reviewed by:</w:t>
+            </w:r>
+          </w:p>
+          <w:p>
+            <w:pPr>
+              <w:spacing w:after="0"/>
+              <w:rPr>
+                <w:rFonts w:ascii="Arial Narrow" w:hAnsi="Arial Narrow"/>
+              </w:rPr>
+            </w:pPr>
+          </w:p>
+          <w:p>
+            <w:pPr>
+              <w:spacing w:after="0"/>
               <w:rPr>
                 <w:rFonts w:ascii="Arial Narrow" w:hAnsi="Arial Narrow"/>
                 <w:b/>
                 <w:bCs/>
               </w:rPr>
-              <w:t>preparedBy</w:t>
-            </w:r>
-            <w:proofErr w:type="spellEnd"/>
+            </w:pPr>
             <w:r>
               <w:rPr>
                 <w:rFonts w:ascii="Arial Narrow" w:hAnsi="Arial Narrow"/>
                 <w:b/>
                 <w:bCs/>
               </w:rPr>
-              <w:t>}</w:t>
-            </w:r>
-          </w:p>
-          <w:p>
-            <w:pPr>
-              <w:spacing w:after="0"/>
-              <w:rPr>
-                <w:rFonts w:ascii="Arial Narrow" w:hAnsi="Arial Narrow"/>
-              </w:rPr>
-            </w:pPr>
-            <w:r>
-              <w:rPr>
-                <w:rFonts w:ascii="Arial Narrow" w:hAnsi="Arial Narrow"/>
-              </w:rPr>
-              <w:t>Organization</w:t>
-            </w:r>
-            <w:r>
-              <w:rPr>
-                <w:rFonts w:ascii="Arial Narrow" w:hAnsi="Arial Narrow"/>
-              </w:rPr>
-              <w:t xml:space="preserve">, </w:t>
-            </w:r>
-            <w:r>
-              <w:rPr>
-                <w:rFonts w:ascii="Arial Narrow" w:hAnsi="Arial Narrow"/>
-              </w:rPr>
-              <w:t>Officer</w:t>
-            </w:r>
-          </w:p>
-        </w:tc>
-        <w:tc>
-          <w:tcPr>
-            <w:tcW w:w="3969" w:type="dxa"/>
-          </w:tcPr>
-          <w:p>
-            <w:pPr>
-              <w:spacing w:after="0"/>
-              <w:rPr>
-                <w:rFonts w:ascii="Arial Narrow" w:hAnsi="Arial Narrow"/>
-              </w:rPr>
-            </w:pPr>
-            <w:r>
-              <w:rPr>
-                <w:rFonts w:ascii="Arial Narrow" w:hAnsi="Arial Narrow"/>
-              </w:rPr>
-              <w:t>Reviewed by:</w:t>
-            </w:r>
-          </w:p>
-          <w:p>
-            <w:pPr>
-              <w:spacing w:after="0"/>
-              <w:rPr>
-                <w:rFonts w:ascii="Arial Narrow" w:hAnsi="Arial Narrow"/>
-              </w:rPr>
-            </w:pPr>
-          </w:p>
-          <w:p>
-            <w:pPr>
-              <w:spacing w:after="0"/>
-              <w:rPr>
-                <w:rFonts w:ascii="Arial Narrow" w:hAnsi="Arial Narrow"/>
-                <w:b/>
-                <w:bCs/>
-              </w:rPr>
-            </w:pPr>
-            <w:r>
-              <w:rPr>
-                <w:rFonts w:ascii="Arial Narrow" w:hAnsi="Arial Narrow"/>
-                <w:b/>
-                <w:bCs/>
-              </w:rPr>
-              <w:t>{</w:t>
-            </w:r>
-            <w:proofErr w:type="spellStart"/>
-            <w:r>
-              <w:rPr>
-                <w:rFonts w:ascii="Arial Narrow" w:hAnsi="Arial Narrow"/>
-                <w:b/>
-                <w:bCs/>
-              </w:rPr>
-              <w:t>adviserName</w:t>
-            </w:r>
-            <w:proofErr w:type="spellEnd"/>
-            <w:r>
-              <w:rPr>
-                <w:rFonts w:ascii="Arial Narrow" w:hAnsi="Arial Narrow"/>
-                <w:b/>
-                <w:bCs/>
-              </w:rPr>
-              <w:t>}</w:t>
+              <w:t>{adviserName}</w:t>
             </w:r>
           </w:p>
           <w:p>
@@ -5047,41 +3670,21 @@
                 <w:bCs/>
                 <w:lang w:val="en-PH"/>
               </w:rPr>
-              <w:t>{</w:t>
-            </w:r>
-            <w:proofErr w:type="spellStart"/>
-            <w:r>
-              <w:rPr>
-                <w:rFonts w:ascii="Arial Narrow" w:hAnsi="Arial Narrow"/>
-                <w:b/>
-                <w:bCs/>
-                <w:lang w:val="en-PH"/>
-              </w:rPr>
-              <w:t>deanName</w:t>
-            </w:r>
-            <w:proofErr w:type="spellEnd"/>
-            <w:r>
-              <w:rPr>
-                <w:rFonts w:ascii="Arial Narrow" w:hAnsi="Arial Narrow"/>
-                <w:b/>
-                <w:bCs/>
-                <w:lang w:val="en-PH"/>
-              </w:rPr>
-              <w:t>}</w:t>
-            </w:r>
-          </w:p>
-          <w:p>
-            <w:pPr>
-              <w:spacing w:after="0"/>
-              <w:rPr>
-                <w:rFonts w:ascii="Arial Narrow" w:hAnsi="Arial Narrow"/>
-              </w:rPr>
-            </w:pPr>
-            <w:r>
-              <w:rPr>
-                <w:rFonts w:ascii="Arial Narrow" w:hAnsi="Arial Narrow"/>
-              </w:rPr>
-              <w:t>Dean, CITE</w:t>
+              <w:t>{deanName}</w:t>
+            </w:r>
+          </w:p>
+          <w:p>
+            <w:pPr>
+              <w:spacing w:after="0"/>
+              <w:rPr>
+                <w:rFonts w:ascii="Arial Narrow" w:hAnsi="Arial Narrow"/>
+              </w:rPr>
+            </w:pPr>
+            <w:r>
+              <w:rPr>
+                <w:rFonts w:ascii="Arial Narrow" w:hAnsi="Arial Narrow"/>
+              </w:rPr>
+              <w:t>{deanTitle}</w:t>
             </w:r>
           </w:p>
         </w:tc>
@@ -5129,23 +3732,7 @@
                 <w:rFonts w:ascii="Arial Narrow" w:hAnsi="Arial Narrow"/>
                 <w:b/>
               </w:rPr>
-              <w:t>{</w:t>
-            </w:r>
-            <w:proofErr w:type="spellStart"/>
-            <w:r>
-              <w:rPr>
-                <w:rFonts w:ascii="Arial Narrow" w:hAnsi="Arial Narrow"/>
-                <w:b/>
-              </w:rPr>
-              <w:t>sdsName</w:t>
-            </w:r>
-            <w:proofErr w:type="spellEnd"/>
-            <w:r>
-              <w:rPr>
-                <w:rFonts w:ascii="Arial Narrow" w:hAnsi="Arial Narrow"/>
-                <w:b/>
-              </w:rPr>
-              <w:t>}</w:t>
+              <w:t>{sdsName}</w:t>
             </w:r>
           </w:p>
           <w:p>
@@ -5208,23 +3795,7 @@
                 <w:rFonts w:ascii="Arial Narrow" w:hAnsi="Arial Narrow"/>
                 <w:b/>
               </w:rPr>
-              <w:t>{</w:t>
-            </w:r>
-            <w:proofErr w:type="spellStart"/>
-            <w:r>
-              <w:rPr>
-                <w:rFonts w:ascii="Arial Narrow" w:hAnsi="Arial Narrow"/>
-                <w:b/>
-              </w:rPr>
-              <w:t>sasName</w:t>
-            </w:r>
-            <w:proofErr w:type="spellEnd"/>
-            <w:r>
-              <w:rPr>
-                <w:rFonts w:ascii="Arial Narrow" w:hAnsi="Arial Narrow"/>
-                <w:b/>
-              </w:rPr>
-              <w:t>}</w:t>
+              <w:t>{sasName}</w:t>
             </w:r>
           </w:p>
           <w:p>
@@ -5293,23 +3864,7 @@
                 <w:rFonts w:ascii="Arial Narrow" w:hAnsi="Arial Narrow"/>
                 <w:b/>
               </w:rPr>
-              <w:t>{</w:t>
-            </w:r>
-            <w:proofErr w:type="spellStart"/>
-            <w:r>
-              <w:rPr>
-                <w:rFonts w:ascii="Arial Narrow" w:hAnsi="Arial Narrow"/>
-                <w:b/>
-              </w:rPr>
-              <w:t>vpaaAsst</w:t>
-            </w:r>
-            <w:proofErr w:type="spellEnd"/>
-            <w:r>
-              <w:rPr>
-                <w:rFonts w:ascii="Arial Narrow" w:hAnsi="Arial Narrow"/>
-                <w:b/>
-              </w:rPr>
-              <w:t>}</w:t>
+              <w:t>{vpaaAsst}</w:t>
             </w:r>
           </w:p>
           <w:p>
@@ -5396,23 +3951,7 @@
                 <w:rFonts w:ascii="Arial Narrow" w:hAnsi="Arial Narrow"/>
                 <w:b/>
               </w:rPr>
-              <w:t>{</w:t>
-            </w:r>
-            <w:proofErr w:type="spellStart"/>
-            <w:r>
-              <w:rPr>
-                <w:rFonts w:ascii="Arial Narrow" w:hAnsi="Arial Narrow"/>
-                <w:b/>
-              </w:rPr>
-              <w:t>presidentName</w:t>
-            </w:r>
-            <w:proofErr w:type="spellEnd"/>
-            <w:r>
-              <w:rPr>
-                <w:rFonts w:ascii="Arial Narrow" w:hAnsi="Arial Narrow"/>
-                <w:b/>
-              </w:rPr>
-              <w:t>}</w:t>
+              <w:t>{presidentName}</w:t>
             </w:r>
           </w:p>
           <w:p>
@@ -5465,23 +4004,7 @@
                 <w:rFonts w:ascii="Arial Narrow" w:hAnsi="Arial Narrow"/>
                 <w:b/>
               </w:rPr>
-              <w:t>{</w:t>
-            </w:r>
-            <w:proofErr w:type="spellStart"/>
-            <w:r>
-              <w:rPr>
-                <w:rFonts w:ascii="Arial Narrow" w:hAnsi="Arial Narrow"/>
-                <w:b/>
-              </w:rPr>
-              <w:t>vpaaName</w:t>
-            </w:r>
-            <w:proofErr w:type="spellEnd"/>
-            <w:r>
-              <w:rPr>
-                <w:rFonts w:ascii="Arial Narrow" w:hAnsi="Arial Narrow"/>
-                <w:b/>
-              </w:rPr>
-              <w:t>}</w:t>
+              <w:t>{vpaaName}</w:t>
             </w:r>
           </w:p>
           <w:p>
@@ -5723,21 +4246,7 @@
               <w:rPr>
                 <w:rFonts w:ascii="Arial Narrow" w:hAnsi="Arial Narrow"/>
               </w:rPr>
-              <w:t xml:space="preserve"> {</w:t>
-            </w:r>
-            <w:proofErr w:type="spellStart"/>
-            <w:r>
-              <w:rPr>
-                <w:rFonts w:ascii="Arial Narrow" w:hAnsi="Arial Narrow"/>
-              </w:rPr>
-              <w:t>conductedRemarks</w:t>
-            </w:r>
-            <w:proofErr w:type="spellEnd"/>
-            <w:r>
-              <w:rPr>
-                <w:rFonts w:ascii="Arial Narrow" w:hAnsi="Arial Narrow"/>
-              </w:rPr>
-              <w:t>}</w:t>
+              <w:t xml:space="preserve"> {conductedRemarks}</w:t>
             </w:r>
           </w:p>
         </w:tc>
@@ -5763,21 +4272,7 @@
               <w:rPr>
                 <w:rFonts w:ascii="Arial Narrow" w:hAnsi="Arial Narrow"/>
               </w:rPr>
-              <w:t xml:space="preserve"> {</w:t>
-            </w:r>
-            <w:proofErr w:type="spellStart"/>
-            <w:r>
-              <w:rPr>
-                <w:rFonts w:ascii="Arial Narrow" w:hAnsi="Arial Narrow"/>
-              </w:rPr>
-              <w:t>cancelledRemarks</w:t>
-            </w:r>
-            <w:proofErr w:type="spellEnd"/>
-            <w:r>
-              <w:rPr>
-                <w:rFonts w:ascii="Arial Narrow" w:hAnsi="Arial Narrow"/>
-              </w:rPr>
-              <w:t>}</w:t>
+              <w:t xml:space="preserve"> {cancelledRemarks}</w:t>
             </w:r>
           </w:p>
         </w:tc>

</xml_diff>

<commit_message>
feat: add additional signatories handling in SAPF document generation and update seed data
Co-authored-by: Copilot <copilot@github.com>
</commit_message>
<xml_diff>
--- a/public/templates/student-activity-proposal-form-v2.docx
+++ b/public/templates/student-activity-proposal-form-v2.docx
@@ -211,7 +211,7 @@
           <w:szCs w:val="28"/>
         </w:rPr>
         <w:drawing>
-          <wp:anchor distT="0" distB="0" distL="114300" distR="114300" simplePos="0" relativeHeight="251665408" behindDoc="0" locked="0" layoutInCell="1" allowOverlap="1" wp14:anchorId="4D66C737" wp14:editId="44959F2E">
+          <wp:anchor distT="0" distB="0" distL="114300" distR="114300" simplePos="0" relativeHeight="251665408" behindDoc="0" locked="0" layoutInCell="1" allowOverlap="1" wp14:anchorId="4D66C737" wp14:editId="0085B87D">
             <wp:simplePos x="0" y="0"/>
             <wp:positionH relativeFrom="column">
               <wp:posOffset>190004</wp:posOffset>
@@ -276,7 +276,7 @@
           <w:szCs w:val="28"/>
         </w:rPr>
         <w:drawing>
-          <wp:anchor distT="0" distB="0" distL="114300" distR="114300" simplePos="0" relativeHeight="251659264" behindDoc="0" locked="0" layoutInCell="1" allowOverlap="1" wp14:anchorId="31EB85D4" wp14:editId="76FF8B73">
+          <wp:anchor distT="0" distB="0" distL="114300" distR="114300" simplePos="0" relativeHeight="251659264" behindDoc="0" locked="0" layoutInCell="1" allowOverlap="1" wp14:anchorId="31EB85D4" wp14:editId="7880CEAD">
             <wp:simplePos x="0" y="0"/>
             <wp:positionH relativeFrom="column">
               <wp:posOffset>-474914</wp:posOffset>
@@ -561,7 +561,77 @@
               <w:rPr>
                 <w:rFonts w:ascii="Arial Narrow" w:hAnsi="Arial Narrow"/>
               </w:rPr>
-              <w:t>({departmentCollege}) College  ({departmentAltEd}) Alternative Education  ({departmentGraduate}) Graduate Studies  ({departmentExtensions}) Extensions Office  ({departmentCom}) COM</w:t>
+              <w:t>({</w:t>
+            </w:r>
+            <w:proofErr w:type="spellStart"/>
+            <w:r>
+              <w:rPr>
+                <w:rFonts w:ascii="Arial Narrow" w:hAnsi="Arial Narrow"/>
+              </w:rPr>
+              <w:t>departmentCollege</w:t>
+            </w:r>
+            <w:proofErr w:type="spellEnd"/>
+            <w:r>
+              <w:rPr>
+                <w:rFonts w:ascii="Arial Narrow" w:hAnsi="Arial Narrow"/>
+              </w:rPr>
+              <w:t>}) College  ({</w:t>
+            </w:r>
+            <w:proofErr w:type="spellStart"/>
+            <w:r>
+              <w:rPr>
+                <w:rFonts w:ascii="Arial Narrow" w:hAnsi="Arial Narrow"/>
+              </w:rPr>
+              <w:t>departmentAltEd</w:t>
+            </w:r>
+            <w:proofErr w:type="spellEnd"/>
+            <w:r>
+              <w:rPr>
+                <w:rFonts w:ascii="Arial Narrow" w:hAnsi="Arial Narrow"/>
+              </w:rPr>
+              <w:t>}) Alternative Education  ({</w:t>
+            </w:r>
+            <w:proofErr w:type="spellStart"/>
+            <w:r>
+              <w:rPr>
+                <w:rFonts w:ascii="Arial Narrow" w:hAnsi="Arial Narrow"/>
+              </w:rPr>
+              <w:t>departmentGraduate</w:t>
+            </w:r>
+            <w:proofErr w:type="spellEnd"/>
+            <w:r>
+              <w:rPr>
+                <w:rFonts w:ascii="Arial Narrow" w:hAnsi="Arial Narrow"/>
+              </w:rPr>
+              <w:t>}) Graduate Studies  ({</w:t>
+            </w:r>
+            <w:proofErr w:type="spellStart"/>
+            <w:r>
+              <w:rPr>
+                <w:rFonts w:ascii="Arial Narrow" w:hAnsi="Arial Narrow"/>
+              </w:rPr>
+              <w:t>departmentExtensions</w:t>
+            </w:r>
+            <w:proofErr w:type="spellEnd"/>
+            <w:r>
+              <w:rPr>
+                <w:rFonts w:ascii="Arial Narrow" w:hAnsi="Arial Narrow"/>
+              </w:rPr>
+              <w:t>}) Extensions Office  ({</w:t>
+            </w:r>
+            <w:proofErr w:type="spellStart"/>
+            <w:r>
+              <w:rPr>
+                <w:rFonts w:ascii="Arial Narrow" w:hAnsi="Arial Narrow"/>
+              </w:rPr>
+              <w:t>departmentCom</w:t>
+            </w:r>
+            <w:proofErr w:type="spellEnd"/>
+            <w:r>
+              <w:rPr>
+                <w:rFonts w:ascii="Arial Narrow" w:hAnsi="Arial Narrow"/>
+              </w:rPr>
+              <w:t>}) COM</w:t>
             </w:r>
           </w:p>
         </w:tc>
@@ -605,7 +675,27 @@
           <w:szCs w:val="20"/>
           <w:u w:val="single"/>
         </w:rPr>
-        <w:t>{proposalDate}</w:t>
+        <w:t>{</w:t>
+      </w:r>
+      <w:proofErr w:type="spellStart"/>
+      <w:r>
+        <w:rPr>
+          <w:rFonts w:ascii="Arial" w:eastAsia="Arial" w:hAnsi="Arial" w:cs="Arial"/>
+          <w:sz w:val="20"/>
+          <w:szCs w:val="20"/>
+          <w:u w:val="single"/>
+        </w:rPr>
+        <w:t>proposalDate</w:t>
+      </w:r>
+      <w:proofErr w:type="spellEnd"/>
+      <w:r>
+        <w:rPr>
+          <w:rFonts w:ascii="Arial" w:eastAsia="Arial" w:hAnsi="Arial" w:cs="Arial"/>
+          <w:sz w:val="20"/>
+          <w:szCs w:val="20"/>
+          <w:u w:val="single"/>
+        </w:rPr>
+        <w:t>}</w:t>
       </w:r>
     </w:p>
     <w:p>
@@ -780,7 +870,23 @@
                                       <w:sz w:val="20"/>
                                       <w:szCs w:val="20"/>
                                     </w:rPr>
-                                    <w:t>{offCampAgree}</w:t>
+                                    <w:t>{</w:t>
+                                  </w:r>
+                                  <w:proofErr w:type="spellStart"/>
+                                  <w:r>
+                                    <w:rPr>
+                                      <w:sz w:val="20"/>
+                                      <w:szCs w:val="20"/>
+                                    </w:rPr>
+                                    <w:t>offCampAgree</w:t>
+                                  </w:r>
+                                  <w:proofErr w:type="spellEnd"/>
+                                  <w:r>
+                                    <w:rPr>
+                                      <w:sz w:val="20"/>
+                                      <w:szCs w:val="20"/>
+                                    </w:rPr>
+                                    <w:t>}</w:t>
                                   </w:r>
                                 </w:p>
                               </w:txbxContent>
@@ -1041,7 +1147,21 @@
               <w:rPr>
                 <w:rFonts w:ascii="Arial Narrow" w:hAnsi="Arial Narrow"/>
               </w:rPr>
-              <w:t>{activityTitle}</w:t>
+              <w:t>{</w:t>
+            </w:r>
+            <w:proofErr w:type="spellStart"/>
+            <w:r>
+              <w:rPr>
+                <w:rFonts w:ascii="Arial Narrow" w:hAnsi="Arial Narrow"/>
+              </w:rPr>
+              <w:t>activityTitle</w:t>
+            </w:r>
+            <w:proofErr w:type="spellEnd"/>
+            <w:r>
+              <w:rPr>
+                <w:rFonts w:ascii="Arial Narrow" w:hAnsi="Arial Narrow"/>
+              </w:rPr>
+              <w:t>}</w:t>
             </w:r>
           </w:p>
         </w:tc>
@@ -1131,7 +1251,21 @@
               <w:rPr>
                 <w:rFonts w:ascii="Arial Narrow" w:hAnsi="Arial Narrow"/>
               </w:rPr>
-              <w:t>{activityTime}</w:t>
+              <w:t>{</w:t>
+            </w:r>
+            <w:proofErr w:type="spellStart"/>
+            <w:r>
+              <w:rPr>
+                <w:rFonts w:ascii="Arial Narrow" w:hAnsi="Arial Narrow"/>
+              </w:rPr>
+              <w:t>activityTime</w:t>
+            </w:r>
+            <w:proofErr w:type="spellEnd"/>
+            <w:r>
+              <w:rPr>
+                <w:rFonts w:ascii="Arial Narrow" w:hAnsi="Arial Narrow"/>
+              </w:rPr>
+              <w:t>}</w:t>
             </w:r>
           </w:p>
         </w:tc>
@@ -1188,7 +1322,25 @@
                 <w:b/>
                 <w:bCs/>
               </w:rPr>
-              <w:t>{activityDate}</w:t>
+              <w:t>{</w:t>
+            </w:r>
+            <w:proofErr w:type="spellStart"/>
+            <w:r>
+              <w:rPr>
+                <w:rFonts w:ascii="Arial Narrow" w:hAnsi="Arial Narrow"/>
+                <w:b/>
+                <w:bCs/>
+              </w:rPr>
+              <w:t>activityDate</w:t>
+            </w:r>
+            <w:proofErr w:type="spellEnd"/>
+            <w:r>
+              <w:rPr>
+                <w:rFonts w:ascii="Arial Narrow" w:hAnsi="Arial Narrow"/>
+                <w:b/>
+                <w:bCs/>
+              </w:rPr>
+              <w:t>}</w:t>
             </w:r>
           </w:p>
         </w:tc>
@@ -1230,7 +1382,21 @@
               <w:rPr>
                 <w:rFonts w:ascii="Arial Narrow" w:hAnsi="Arial Narrow"/>
               </w:rPr>
-              <w:t xml:space="preserve">({modalityFaceToFace}) Face-to-face </w:t>
+              <w:t>({</w:t>
+            </w:r>
+            <w:proofErr w:type="spellStart"/>
+            <w:r>
+              <w:rPr>
+                <w:rFonts w:ascii="Arial Narrow" w:hAnsi="Arial Narrow"/>
+              </w:rPr>
+              <w:t>modalityFaceToFace</w:t>
+            </w:r>
+            <w:proofErr w:type="spellEnd"/>
+            <w:r>
+              <w:rPr>
+                <w:rFonts w:ascii="Arial Narrow" w:hAnsi="Arial Narrow"/>
+              </w:rPr>
+              <w:t xml:space="preserve">}) Face-to-face </w:t>
             </w:r>
           </w:p>
           <w:p>
@@ -1244,7 +1410,35 @@
               <w:rPr>
                 <w:rFonts w:ascii="Arial Narrow" w:hAnsi="Arial Narrow"/>
               </w:rPr>
-              <w:t>({modalityOnline}) Online        ({modalityHybrid}) Hybrid</w:t>
+              <w:t>({</w:t>
+            </w:r>
+            <w:proofErr w:type="spellStart"/>
+            <w:r>
+              <w:rPr>
+                <w:rFonts w:ascii="Arial Narrow" w:hAnsi="Arial Narrow"/>
+              </w:rPr>
+              <w:t>modalityOnline</w:t>
+            </w:r>
+            <w:proofErr w:type="spellEnd"/>
+            <w:r>
+              <w:rPr>
+                <w:rFonts w:ascii="Arial Narrow" w:hAnsi="Arial Narrow"/>
+              </w:rPr>
+              <w:t>}) Online        ({</w:t>
+            </w:r>
+            <w:proofErr w:type="spellStart"/>
+            <w:r>
+              <w:rPr>
+                <w:rFonts w:ascii="Arial Narrow" w:hAnsi="Arial Narrow"/>
+              </w:rPr>
+              <w:t>modalityHybrid</w:t>
+            </w:r>
+            <w:proofErr w:type="spellEnd"/>
+            <w:r>
+              <w:rPr>
+                <w:rFonts w:ascii="Arial Narrow" w:hAnsi="Arial Narrow"/>
+              </w:rPr>
+              <w:t>}) Hybrid</w:t>
             </w:r>
           </w:p>
         </w:tc>
@@ -1291,7 +1485,21 @@
               <w:rPr>
                 <w:rFonts w:ascii="Arial Narrow" w:hAnsi="Arial Narrow"/>
               </w:rPr>
-              <w:t>{programCourse}</w:t>
+              <w:t>{</w:t>
+            </w:r>
+            <w:proofErr w:type="spellStart"/>
+            <w:r>
+              <w:rPr>
+                <w:rFonts w:ascii="Arial Narrow" w:hAnsi="Arial Narrow"/>
+              </w:rPr>
+              <w:t>programCourse</w:t>
+            </w:r>
+            <w:proofErr w:type="spellEnd"/>
+            <w:r>
+              <w:rPr>
+                <w:rFonts w:ascii="Arial Narrow" w:hAnsi="Arial Narrow"/>
+              </w:rPr>
+              <w:t>}</w:t>
             </w:r>
           </w:p>
         </w:tc>
@@ -1426,7 +1634,21 @@
               <w:rPr>
                 <w:rFonts w:ascii="Arial Narrow" w:hAnsi="Arial Narrow"/>
               </w:rPr>
-              <w:t>({settingInCampus}) In-Campus</w:t>
+              <w:t>({</w:t>
+            </w:r>
+            <w:proofErr w:type="spellStart"/>
+            <w:r>
+              <w:rPr>
+                <w:rFonts w:ascii="Arial Narrow" w:hAnsi="Arial Narrow"/>
+              </w:rPr>
+              <w:t>settingInCampus</w:t>
+            </w:r>
+            <w:proofErr w:type="spellEnd"/>
+            <w:r>
+              <w:rPr>
+                <w:rFonts w:ascii="Arial Narrow" w:hAnsi="Arial Narrow"/>
+              </w:rPr>
+              <w:t>}) In-Campus</w:t>
             </w:r>
           </w:p>
         </w:tc>
@@ -1448,7 +1670,21 @@
               <w:rPr>
                 <w:rFonts w:ascii="Arial Narrow" w:hAnsi="Arial Narrow"/>
               </w:rPr>
-              <w:t>({settingOffCampus}) Off-Campus</w:t>
+              <w:t>({</w:t>
+            </w:r>
+            <w:proofErr w:type="spellStart"/>
+            <w:r>
+              <w:rPr>
+                <w:rFonts w:ascii="Arial Narrow" w:hAnsi="Arial Narrow"/>
+              </w:rPr>
+              <w:t>settingOffCampus</w:t>
+            </w:r>
+            <w:proofErr w:type="spellEnd"/>
+            <w:r>
+              <w:rPr>
+                <w:rFonts w:ascii="Arial Narrow" w:hAnsi="Arial Narrow"/>
+              </w:rPr>
+              <w:t>}) Off-Campus</w:t>
             </w:r>
           </w:p>
         </w:tc>
@@ -1585,7 +1821,35 @@
               <w:rPr>
                 <w:rFonts w:ascii="Arial Narrow" w:hAnsi="Arial Narrow"/>
               </w:rPr>
-              <w:t>({activityTypeCoCurricular}) Co-Curricular   ({activityTypeExtraCurricular}) Extra-Curricular</w:t>
+              <w:t>({</w:t>
+            </w:r>
+            <w:proofErr w:type="spellStart"/>
+            <w:r>
+              <w:rPr>
+                <w:rFonts w:ascii="Arial Narrow" w:hAnsi="Arial Narrow"/>
+              </w:rPr>
+              <w:t>activityTypeCoCurricular</w:t>
+            </w:r>
+            <w:proofErr w:type="spellEnd"/>
+            <w:r>
+              <w:rPr>
+                <w:rFonts w:ascii="Arial Narrow" w:hAnsi="Arial Narrow"/>
+              </w:rPr>
+              <w:t>}) Co-Curricular   ({</w:t>
+            </w:r>
+            <w:proofErr w:type="spellStart"/>
+            <w:r>
+              <w:rPr>
+                <w:rFonts w:ascii="Arial Narrow" w:hAnsi="Arial Narrow"/>
+              </w:rPr>
+              <w:t>activityTypeExtraCurricular</w:t>
+            </w:r>
+            <w:proofErr w:type="spellEnd"/>
+            <w:r>
+              <w:rPr>
+                <w:rFonts w:ascii="Arial Narrow" w:hAnsi="Arial Narrow"/>
+              </w:rPr>
+              <w:t>}) Extra-Curricular</w:t>
             </w:r>
           </w:p>
         </w:tc>
@@ -1677,7 +1941,35 @@
               <w:rPr>
                 <w:rFonts w:ascii="Arial Narrow" w:hAnsi="Arial Narrow"/>
               </w:rPr>
-              <w:t>({scopeOrganizational}) Organizational     ({scopeInstitutional})</w:t>
+              <w:t>({</w:t>
+            </w:r>
+            <w:proofErr w:type="spellStart"/>
+            <w:r>
+              <w:rPr>
+                <w:rFonts w:ascii="Arial Narrow" w:hAnsi="Arial Narrow"/>
+              </w:rPr>
+              <w:t>scopeOrganizational</w:t>
+            </w:r>
+            <w:proofErr w:type="spellEnd"/>
+            <w:r>
+              <w:rPr>
+                <w:rFonts w:ascii="Arial Narrow" w:hAnsi="Arial Narrow"/>
+              </w:rPr>
+              <w:t>}) Organizational     ({</w:t>
+            </w:r>
+            <w:proofErr w:type="spellStart"/>
+            <w:r>
+              <w:rPr>
+                <w:rFonts w:ascii="Arial Narrow" w:hAnsi="Arial Narrow"/>
+              </w:rPr>
+              <w:t>scopeInstitutional</w:t>
+            </w:r>
+            <w:proofErr w:type="spellEnd"/>
+            <w:r>
+              <w:rPr>
+                <w:rFonts w:ascii="Arial Narrow" w:hAnsi="Arial Narrow"/>
+              </w:rPr>
+              <w:t>})</w:t>
             </w:r>
           </w:p>
           <w:p>
@@ -1692,7 +1984,35 @@
               <w:rPr>
                 <w:rFonts w:ascii="Arial Narrow" w:hAnsi="Arial Narrow"/>
               </w:rPr>
-              <w:t xml:space="preserve"> Institutional     ({scopeRegional}) Regional     ({scopeNational}) National</w:t>
+              <w:t xml:space="preserve"> Institutional     ({</w:t>
+            </w:r>
+            <w:proofErr w:type="spellStart"/>
+            <w:r>
+              <w:rPr>
+                <w:rFonts w:ascii="Arial Narrow" w:hAnsi="Arial Narrow"/>
+              </w:rPr>
+              <w:t>scopeRegional</w:t>
+            </w:r>
+            <w:proofErr w:type="spellEnd"/>
+            <w:r>
+              <w:rPr>
+                <w:rFonts w:ascii="Arial Narrow" w:hAnsi="Arial Narrow"/>
+              </w:rPr>
+              <w:t>}) Regional     ({</w:t>
+            </w:r>
+            <w:proofErr w:type="spellStart"/>
+            <w:r>
+              <w:rPr>
+                <w:rFonts w:ascii="Arial Narrow" w:hAnsi="Arial Narrow"/>
+              </w:rPr>
+              <w:t>scopeNational</w:t>
+            </w:r>
+            <w:proofErr w:type="spellEnd"/>
+            <w:r>
+              <w:rPr>
+                <w:rFonts w:ascii="Arial Narrow" w:hAnsi="Arial Narrow"/>
+              </w:rPr>
+              <w:t>}) National</w:t>
             </w:r>
           </w:p>
         </w:tc>
@@ -1734,7 +2054,21 @@
               <w:rPr>
                 <w:rFonts w:ascii="Arial Narrow" w:hAnsi="Arial Narrow"/>
               </w:rPr>
-              <w:t>{noOfParticipants}</w:t>
+              <w:t>{</w:t>
+            </w:r>
+            <w:proofErr w:type="spellStart"/>
+            <w:r>
+              <w:rPr>
+                <w:rFonts w:ascii="Arial Narrow" w:hAnsi="Arial Narrow"/>
+              </w:rPr>
+              <w:t>noOfParticipants</w:t>
+            </w:r>
+            <w:proofErr w:type="spellEnd"/>
+            <w:r>
+              <w:rPr>
+                <w:rFonts w:ascii="Arial Narrow" w:hAnsi="Arial Narrow"/>
+              </w:rPr>
+              <w:t>}</w:t>
             </w:r>
           </w:p>
         </w:tc>
@@ -1782,7 +2116,63 @@
               <w:rPr>
                 <w:rFonts w:ascii="Arial Narrow" w:hAnsi="Arial Narrow"/>
               </w:rPr>
-              <w:t xml:space="preserve">({programTeamBuilding}) Team Building     ({programLeadershipSummit}) Leadership Summit     ({programGeneralAssembly}) General Assembly     ({programCompetition}) </w:t>
+              <w:t>({</w:t>
+            </w:r>
+            <w:proofErr w:type="spellStart"/>
+            <w:r>
+              <w:rPr>
+                <w:rFonts w:ascii="Arial Narrow" w:hAnsi="Arial Narrow"/>
+              </w:rPr>
+              <w:t>programTeamBuilding</w:t>
+            </w:r>
+            <w:proofErr w:type="spellEnd"/>
+            <w:r>
+              <w:rPr>
+                <w:rFonts w:ascii="Arial Narrow" w:hAnsi="Arial Narrow"/>
+              </w:rPr>
+              <w:t>}) Team Building     ({</w:t>
+            </w:r>
+            <w:proofErr w:type="spellStart"/>
+            <w:r>
+              <w:rPr>
+                <w:rFonts w:ascii="Arial Narrow" w:hAnsi="Arial Narrow"/>
+              </w:rPr>
+              <w:t>programLeadershipSummit</w:t>
+            </w:r>
+            <w:proofErr w:type="spellEnd"/>
+            <w:r>
+              <w:rPr>
+                <w:rFonts w:ascii="Arial Narrow" w:hAnsi="Arial Narrow"/>
+              </w:rPr>
+              <w:t>}) Leadership Summit     ({</w:t>
+            </w:r>
+            <w:proofErr w:type="spellStart"/>
+            <w:r>
+              <w:rPr>
+                <w:rFonts w:ascii="Arial Narrow" w:hAnsi="Arial Narrow"/>
+              </w:rPr>
+              <w:t>programGeneralAssembly</w:t>
+            </w:r>
+            <w:proofErr w:type="spellEnd"/>
+            <w:r>
+              <w:rPr>
+                <w:rFonts w:ascii="Arial Narrow" w:hAnsi="Arial Narrow"/>
+              </w:rPr>
+              <w:t>}) General Assembly     ({</w:t>
+            </w:r>
+            <w:proofErr w:type="spellStart"/>
+            <w:r>
+              <w:rPr>
+                <w:rFonts w:ascii="Arial Narrow" w:hAnsi="Arial Narrow"/>
+              </w:rPr>
+              <w:t>programCompetition</w:t>
+            </w:r>
+            <w:proofErr w:type="spellEnd"/>
+            <w:r>
+              <w:rPr>
+                <w:rFonts w:ascii="Arial Narrow" w:hAnsi="Arial Narrow"/>
+              </w:rPr>
+              <w:t xml:space="preserve">}) </w:t>
             </w:r>
           </w:p>
           <w:p>
@@ -1797,7 +2187,49 @@
               <w:rPr>
                 <w:rFonts w:ascii="Arial Narrow" w:hAnsi="Arial Narrow"/>
               </w:rPr>
-              <w:t>Competition     ({programPressConference}) Press Conference     ({programSeminarConvention}) Seminar/Convention     Others: {programOther}</w:t>
+              <w:t>Competition     ({</w:t>
+            </w:r>
+            <w:proofErr w:type="spellStart"/>
+            <w:r>
+              <w:rPr>
+                <w:rFonts w:ascii="Arial Narrow" w:hAnsi="Arial Narrow"/>
+              </w:rPr>
+              <w:t>programPressConference</w:t>
+            </w:r>
+            <w:proofErr w:type="spellEnd"/>
+            <w:r>
+              <w:rPr>
+                <w:rFonts w:ascii="Arial Narrow" w:hAnsi="Arial Narrow"/>
+              </w:rPr>
+              <w:t>}) Press Conference     ({</w:t>
+            </w:r>
+            <w:proofErr w:type="spellStart"/>
+            <w:r>
+              <w:rPr>
+                <w:rFonts w:ascii="Arial Narrow" w:hAnsi="Arial Narrow"/>
+              </w:rPr>
+              <w:t>programSeminarConvention</w:t>
+            </w:r>
+            <w:proofErr w:type="spellEnd"/>
+            <w:r>
+              <w:rPr>
+                <w:rFonts w:ascii="Arial Narrow" w:hAnsi="Arial Narrow"/>
+              </w:rPr>
+              <w:t>}) Seminar/Convention     Others: {</w:t>
+            </w:r>
+            <w:proofErr w:type="spellStart"/>
+            <w:r>
+              <w:rPr>
+                <w:rFonts w:ascii="Arial Narrow" w:hAnsi="Arial Narrow"/>
+              </w:rPr>
+              <w:t>programOther</w:t>
+            </w:r>
+            <w:proofErr w:type="spellEnd"/>
+            <w:r>
+              <w:rPr>
+                <w:rFonts w:ascii="Arial Narrow" w:hAnsi="Arial Narrow"/>
+              </w:rPr>
+              <w:t>}</w:t>
             </w:r>
           </w:p>
         </w:tc>
@@ -1950,7 +2382,91 @@
               <w:rPr>
                 <w:rFonts w:ascii="Arial Narrow" w:hAnsi="Arial Narrow"/>
               </w:rPr>
-              <w:t>({coreCourage}) Courage  ({coreCompassion}) Compassion  ({coreCommunityOriented}) Community-Oriented  ({coreHumility}) Humility  ({coreInteriority}) Interiority  ({coreMissionarySpirit}) Missionary Spirit</w:t>
+              <w:t>({</w:t>
+            </w:r>
+            <w:proofErr w:type="spellStart"/>
+            <w:r>
+              <w:rPr>
+                <w:rFonts w:ascii="Arial Narrow" w:hAnsi="Arial Narrow"/>
+              </w:rPr>
+              <w:t>coreCourage</w:t>
+            </w:r>
+            <w:proofErr w:type="spellEnd"/>
+            <w:r>
+              <w:rPr>
+                <w:rFonts w:ascii="Arial Narrow" w:hAnsi="Arial Narrow"/>
+              </w:rPr>
+              <w:t>}) Courage  ({</w:t>
+            </w:r>
+            <w:proofErr w:type="spellStart"/>
+            <w:r>
+              <w:rPr>
+                <w:rFonts w:ascii="Arial Narrow" w:hAnsi="Arial Narrow"/>
+              </w:rPr>
+              <w:t>coreCompassion</w:t>
+            </w:r>
+            <w:proofErr w:type="spellEnd"/>
+            <w:r>
+              <w:rPr>
+                <w:rFonts w:ascii="Arial Narrow" w:hAnsi="Arial Narrow"/>
+              </w:rPr>
+              <w:t>}) Compassion  ({</w:t>
+            </w:r>
+            <w:proofErr w:type="spellStart"/>
+            <w:r>
+              <w:rPr>
+                <w:rFonts w:ascii="Arial Narrow" w:hAnsi="Arial Narrow"/>
+              </w:rPr>
+              <w:t>coreCommunityOriented</w:t>
+            </w:r>
+            <w:proofErr w:type="spellEnd"/>
+            <w:r>
+              <w:rPr>
+                <w:rFonts w:ascii="Arial Narrow" w:hAnsi="Arial Narrow"/>
+              </w:rPr>
+              <w:t>}) Community-Oriented  ({</w:t>
+            </w:r>
+            <w:proofErr w:type="spellStart"/>
+            <w:r>
+              <w:rPr>
+                <w:rFonts w:ascii="Arial Narrow" w:hAnsi="Arial Narrow"/>
+              </w:rPr>
+              <w:t>coreHumility</w:t>
+            </w:r>
+            <w:proofErr w:type="spellEnd"/>
+            <w:r>
+              <w:rPr>
+                <w:rFonts w:ascii="Arial Narrow" w:hAnsi="Arial Narrow"/>
+              </w:rPr>
+              <w:t>}) Humility  ({</w:t>
+            </w:r>
+            <w:proofErr w:type="spellStart"/>
+            <w:r>
+              <w:rPr>
+                <w:rFonts w:ascii="Arial Narrow" w:hAnsi="Arial Narrow"/>
+              </w:rPr>
+              <w:t>coreInteriority</w:t>
+            </w:r>
+            <w:proofErr w:type="spellEnd"/>
+            <w:r>
+              <w:rPr>
+                <w:rFonts w:ascii="Arial Narrow" w:hAnsi="Arial Narrow"/>
+              </w:rPr>
+              <w:t>}) Interiority  ({</w:t>
+            </w:r>
+            <w:proofErr w:type="spellStart"/>
+            <w:r>
+              <w:rPr>
+                <w:rFonts w:ascii="Arial Narrow" w:hAnsi="Arial Narrow"/>
+              </w:rPr>
+              <w:t>coreMissionarySpirit</w:t>
+            </w:r>
+            <w:proofErr w:type="spellEnd"/>
+            <w:r>
+              <w:rPr>
+                <w:rFonts w:ascii="Arial Narrow" w:hAnsi="Arial Narrow"/>
+              </w:rPr>
+              <w:t>}) Missionary Spirit</w:t>
             </w:r>
           </w:p>
         </w:tc>
@@ -1997,7 +2513,21 @@
               <w:rPr>
                 <w:rFonts w:ascii="Arial Narrow" w:hAnsi="Arial Narrow"/>
               </w:rPr>
-              <w:t xml:space="preserve">({egaCriticalCreative}) EGA 1: Critical and Creative Thinker </w:t>
+              <w:t>({</w:t>
+            </w:r>
+            <w:proofErr w:type="spellStart"/>
+            <w:r>
+              <w:rPr>
+                <w:rFonts w:ascii="Arial Narrow" w:hAnsi="Arial Narrow"/>
+              </w:rPr>
+              <w:t>egaCriticalCreative</w:t>
+            </w:r>
+            <w:proofErr w:type="spellEnd"/>
+            <w:r>
+              <w:rPr>
+                <w:rFonts w:ascii="Arial Narrow" w:hAnsi="Arial Narrow"/>
+              </w:rPr>
+              <w:t xml:space="preserve">}) EGA 1: Critical and Creative Thinker </w:t>
             </w:r>
           </w:p>
           <w:p>
@@ -2012,7 +2542,21 @@
               <w:rPr>
                 <w:rFonts w:ascii="Arial Narrow" w:hAnsi="Arial Narrow"/>
               </w:rPr>
-              <w:t>({egaCatholicProfessional}) EGA 2: Competent Catholic Augustinian-Marian Professional</w:t>
+              <w:t>({</w:t>
+            </w:r>
+            <w:proofErr w:type="spellStart"/>
+            <w:r>
+              <w:rPr>
+                <w:rFonts w:ascii="Arial Narrow" w:hAnsi="Arial Narrow"/>
+              </w:rPr>
+              <w:t>egaCatholicProfessional</w:t>
+            </w:r>
+            <w:proofErr w:type="spellEnd"/>
+            <w:r>
+              <w:rPr>
+                <w:rFonts w:ascii="Arial Narrow" w:hAnsi="Arial Narrow"/>
+              </w:rPr>
+              <w:t>}) EGA 2: Competent Catholic Augustinian-Marian Professional</w:t>
             </w:r>
           </w:p>
           <w:p>
@@ -2027,7 +2571,21 @@
               <w:rPr>
                 <w:rFonts w:ascii="Arial Narrow" w:hAnsi="Arial Narrow"/>
               </w:rPr>
-              <w:t>({egaResponsiveSteward}) EGA 3: Socially Responsive Steward</w:t>
+              <w:t>({</w:t>
+            </w:r>
+            <w:proofErr w:type="spellStart"/>
+            <w:r>
+              <w:rPr>
+                <w:rFonts w:ascii="Arial Narrow" w:hAnsi="Arial Narrow"/>
+              </w:rPr>
+              <w:t>egaResponsiveSteward</w:t>
+            </w:r>
+            <w:proofErr w:type="spellEnd"/>
+            <w:r>
+              <w:rPr>
+                <w:rFonts w:ascii="Arial Narrow" w:hAnsi="Arial Narrow"/>
+              </w:rPr>
+              <w:t>}) EGA 3: Socially Responsive Steward</w:t>
             </w:r>
           </w:p>
           <w:p>
@@ -2042,7 +2600,21 @@
               <w:rPr>
                 <w:rFonts w:ascii="Arial Narrow" w:hAnsi="Arial Narrow"/>
               </w:rPr>
-              <w:t>({egaLifelongLearner}) EGA 4: Transformative Lifelong Learner</w:t>
+              <w:t>({</w:t>
+            </w:r>
+            <w:proofErr w:type="spellStart"/>
+            <w:r>
+              <w:rPr>
+                <w:rFonts w:ascii="Arial Narrow" w:hAnsi="Arial Narrow"/>
+              </w:rPr>
+              <w:t>egaLifelongLearner</w:t>
+            </w:r>
+            <w:proofErr w:type="spellEnd"/>
+            <w:r>
+              <w:rPr>
+                <w:rFonts w:ascii="Arial Narrow" w:hAnsi="Arial Narrow"/>
+              </w:rPr>
+              <w:t>}) EGA 4: Transformative Lifelong Learner</w:t>
             </w:r>
           </w:p>
         </w:tc>
@@ -2093,7 +2665,25 @@
                 <w:i/>
                 <w:iCs/>
               </w:rPr>
-              <w:t>{programFlow}</w:t>
+              <w:t>{</w:t>
+            </w:r>
+            <w:proofErr w:type="spellStart"/>
+            <w:r>
+              <w:rPr>
+                <w:rFonts w:ascii="Arial Narrow" w:hAnsi="Arial Narrow"/>
+                <w:i/>
+                <w:iCs/>
+              </w:rPr>
+              <w:t>programFlow</w:t>
+            </w:r>
+            <w:proofErr w:type="spellEnd"/>
+            <w:r>
+              <w:rPr>
+                <w:rFonts w:ascii="Arial Narrow" w:hAnsi="Arial Narrow"/>
+                <w:i/>
+                <w:iCs/>
+              </w:rPr>
+              <w:t>}</w:t>
             </w:r>
           </w:p>
         </w:tc>
@@ -2142,7 +2732,23 @@
                 <w:rFonts w:ascii="Arial Narrow" w:hAnsi="Arial Narrow"/>
                 <w:lang w:val="en-PH"/>
               </w:rPr>
-              <w:t>{emergencyPlan}</w:t>
+              <w:t>{</w:t>
+            </w:r>
+            <w:proofErr w:type="spellStart"/>
+            <w:r>
+              <w:rPr>
+                <w:rFonts w:ascii="Arial Narrow" w:hAnsi="Arial Narrow"/>
+                <w:lang w:val="en-PH"/>
+              </w:rPr>
+              <w:t>emergencyPlan</w:t>
+            </w:r>
+            <w:proofErr w:type="spellEnd"/>
+            <w:r>
+              <w:rPr>
+                <w:rFonts w:ascii="Arial Narrow" w:hAnsi="Arial Narrow"/>
+                <w:lang w:val="en-PH"/>
+              </w:rPr>
+              <w:t>}</w:t>
             </w:r>
           </w:p>
         </w:tc>
@@ -2258,7 +2864,29 @@
                 <w:sz w:val="24"/>
                 <w:szCs w:val="24"/>
               </w:rPr>
-              <w:t>{sourceOfBudget}</w:t>
+              <w:t>{</w:t>
+            </w:r>
+            <w:proofErr w:type="spellStart"/>
+            <w:r>
+              <w:rPr>
+                <w:rFonts w:ascii="Arial Narrow" w:hAnsi="Arial Narrow"/>
+                <w:b/>
+                <w:bCs/>
+                <w:sz w:val="24"/>
+                <w:szCs w:val="24"/>
+              </w:rPr>
+              <w:t>sourceOfBudget</w:t>
+            </w:r>
+            <w:proofErr w:type="spellEnd"/>
+            <w:r>
+              <w:rPr>
+                <w:rFonts w:ascii="Arial Narrow" w:hAnsi="Arial Narrow"/>
+                <w:b/>
+                <w:bCs/>
+                <w:sz w:val="24"/>
+                <w:szCs w:val="24"/>
+              </w:rPr>
+              <w:t>}</w:t>
             </w:r>
           </w:p>
         </w:tc>
@@ -2345,7 +2973,39 @@
                 <w:rFonts w:ascii="Arial Narrow" w:hAnsi="Arial Narrow"/>
                 <w:b/>
               </w:rPr>
-              <w:t>({supportBudget}) BUDGET: {budgetDetails}</w:t>
+              <w:t>({</w:t>
+            </w:r>
+            <w:proofErr w:type="spellStart"/>
+            <w:r>
+              <w:rPr>
+                <w:rFonts w:ascii="Arial Narrow" w:hAnsi="Arial Narrow"/>
+                <w:b/>
+              </w:rPr>
+              <w:t>supportBudget</w:t>
+            </w:r>
+            <w:proofErr w:type="spellEnd"/>
+            <w:r>
+              <w:rPr>
+                <w:rFonts w:ascii="Arial Narrow" w:hAnsi="Arial Narrow"/>
+                <w:b/>
+              </w:rPr>
+              <w:t>}) BUDGET: {</w:t>
+            </w:r>
+            <w:proofErr w:type="spellStart"/>
+            <w:r>
+              <w:rPr>
+                <w:rFonts w:ascii="Arial Narrow" w:hAnsi="Arial Narrow"/>
+                <w:b/>
+              </w:rPr>
+              <w:t>budgetDetails</w:t>
+            </w:r>
+            <w:proofErr w:type="spellEnd"/>
+            <w:r>
+              <w:rPr>
+                <w:rFonts w:ascii="Arial Narrow" w:hAnsi="Arial Narrow"/>
+                <w:b/>
+              </w:rPr>
+              <w:t>}</w:t>
             </w:r>
           </w:p>
         </w:tc>
@@ -2366,7 +3026,23 @@
                 <w:rFonts w:ascii="Arial Narrow" w:hAnsi="Arial Narrow"/>
                 <w:b/>
               </w:rPr>
-              <w:t xml:space="preserve">({supportVehicle}) </w:t>
+              <w:t>({</w:t>
+            </w:r>
+            <w:proofErr w:type="spellStart"/>
+            <w:r>
+              <w:rPr>
+                <w:rFonts w:ascii="Arial Narrow" w:hAnsi="Arial Narrow"/>
+                <w:b/>
+              </w:rPr>
+              <w:t>supportVehicle</w:t>
+            </w:r>
+            <w:proofErr w:type="spellEnd"/>
+            <w:r>
+              <w:rPr>
+                <w:rFonts w:ascii="Arial Narrow" w:hAnsi="Arial Narrow"/>
+                <w:b/>
+              </w:rPr>
+              <w:t xml:space="preserve">}) </w:t>
             </w:r>
             <w:r>
               <w:rPr>
@@ -2404,7 +3080,25 @@
                 <w:b/>
                 <w:u w:val="single"/>
               </w:rPr>
-              <w:t>{vehiclePassengers}</w:t>
+              <w:t>{</w:t>
+            </w:r>
+            <w:proofErr w:type="spellStart"/>
+            <w:r>
+              <w:rPr>
+                <w:rFonts w:ascii="Arial Narrow" w:hAnsi="Arial Narrow"/>
+                <w:b/>
+                <w:u w:val="single"/>
+              </w:rPr>
+              <w:t>vehiclePassengers</w:t>
+            </w:r>
+            <w:proofErr w:type="spellEnd"/>
+            <w:r>
+              <w:rPr>
+                <w:rFonts w:ascii="Arial Narrow" w:hAnsi="Arial Narrow"/>
+                <w:b/>
+                <w:u w:val="single"/>
+              </w:rPr>
+              <w:t>}</w:t>
             </w:r>
           </w:p>
           <w:p>
@@ -2472,7 +3166,23 @@
                 <w:rFonts w:ascii="Arial Narrow" w:hAnsi="Arial Narrow"/>
                 <w:b/>
               </w:rPr>
-              <w:t>({supportFoodSnacks})</w:t>
+              <w:t>({</w:t>
+            </w:r>
+            <w:proofErr w:type="spellStart"/>
+            <w:r>
+              <w:rPr>
+                <w:rFonts w:ascii="Arial Narrow" w:hAnsi="Arial Narrow"/>
+                <w:b/>
+              </w:rPr>
+              <w:t>supportFoodSnacks</w:t>
+            </w:r>
+            <w:proofErr w:type="spellEnd"/>
+            <w:r>
+              <w:rPr>
+                <w:rFonts w:ascii="Arial Narrow" w:hAnsi="Arial Narrow"/>
+                <w:b/>
+              </w:rPr>
+              <w:t>})</w:t>
             </w:r>
             <w:r>
               <w:rPr>
@@ -2515,7 +3225,25 @@
                 <w:b/>
                 <w:u w:val="single"/>
               </w:rPr>
-              <w:t>{foodPax}</w:t>
+              <w:t>{</w:t>
+            </w:r>
+            <w:proofErr w:type="spellStart"/>
+            <w:r>
+              <w:rPr>
+                <w:rFonts w:ascii="Arial Narrow" w:hAnsi="Arial Narrow"/>
+                <w:b/>
+                <w:u w:val="single"/>
+              </w:rPr>
+              <w:t>foodPax</w:t>
+            </w:r>
+            <w:proofErr w:type="spellEnd"/>
+            <w:r>
+              <w:rPr>
+                <w:rFonts w:ascii="Arial Narrow" w:hAnsi="Arial Narrow"/>
+                <w:b/>
+                <w:u w:val="single"/>
+              </w:rPr>
+              <w:t>}</w:t>
             </w:r>
           </w:p>
           <w:p>
@@ -2564,7 +3292,23 @@
                 <w:rFonts w:ascii="Arial Narrow" w:hAnsi="Arial Narrow"/>
                 <w:b/>
               </w:rPr>
-              <w:t>({supportRoomVenue})</w:t>
+              <w:t>({</w:t>
+            </w:r>
+            <w:proofErr w:type="spellStart"/>
+            <w:r>
+              <w:rPr>
+                <w:rFonts w:ascii="Arial Narrow" w:hAnsi="Arial Narrow"/>
+                <w:b/>
+              </w:rPr>
+              <w:t>supportRoomVenue</w:t>
+            </w:r>
+            <w:proofErr w:type="spellEnd"/>
+            <w:r>
+              <w:rPr>
+                <w:rFonts w:ascii="Arial Narrow" w:hAnsi="Arial Narrow"/>
+                <w:b/>
+              </w:rPr>
+              <w:t>})</w:t>
             </w:r>
             <w:r>
               <w:rPr>
@@ -2600,7 +3344,25 @@
                 <w:b/>
                 <w:u w:val="single"/>
               </w:rPr>
-              <w:t>{roomVenueDetails}</w:t>
+              <w:t>{</w:t>
+            </w:r>
+            <w:proofErr w:type="spellStart"/>
+            <w:r>
+              <w:rPr>
+                <w:rFonts w:ascii="Arial Narrow" w:hAnsi="Arial Narrow"/>
+                <w:b/>
+                <w:u w:val="single"/>
+              </w:rPr>
+              <w:t>roomVenueDetails</w:t>
+            </w:r>
+            <w:proofErr w:type="spellEnd"/>
+            <w:r>
+              <w:rPr>
+                <w:rFonts w:ascii="Arial Narrow" w:hAnsi="Arial Narrow"/>
+                <w:b/>
+                <w:u w:val="single"/>
+              </w:rPr>
+              <w:t>}</w:t>
             </w:r>
           </w:p>
           <w:p>
@@ -2654,7 +3416,23 @@
                 <w:rFonts w:ascii="Arial Narrow" w:hAnsi="Arial Narrow"/>
                 <w:b/>
               </w:rPr>
-              <w:t xml:space="preserve">({supportSoundSystem}) </w:t>
+              <w:t>({</w:t>
+            </w:r>
+            <w:proofErr w:type="spellStart"/>
+            <w:r>
+              <w:rPr>
+                <w:rFonts w:ascii="Arial Narrow" w:hAnsi="Arial Narrow"/>
+                <w:b/>
+              </w:rPr>
+              <w:t>supportSoundSystem</w:t>
+            </w:r>
+            <w:proofErr w:type="spellEnd"/>
+            <w:r>
+              <w:rPr>
+                <w:rFonts w:ascii="Arial Narrow" w:hAnsi="Arial Narrow"/>
+                <w:b/>
+              </w:rPr>
+              <w:t xml:space="preserve">}) </w:t>
             </w:r>
             <w:r>
               <w:rPr>
@@ -2685,7 +3463,23 @@
                 <w:rFonts w:ascii="Arial Narrow" w:hAnsi="Arial Narrow"/>
                 <w:b/>
               </w:rPr>
-              <w:t xml:space="preserve">({supportMicrophone}) </w:t>
+              <w:t>({</w:t>
+            </w:r>
+            <w:proofErr w:type="spellStart"/>
+            <w:r>
+              <w:rPr>
+                <w:rFonts w:ascii="Arial Narrow" w:hAnsi="Arial Narrow"/>
+                <w:b/>
+              </w:rPr>
+              <w:t>supportMicrophone</w:t>
+            </w:r>
+            <w:proofErr w:type="spellEnd"/>
+            <w:r>
+              <w:rPr>
+                <w:rFonts w:ascii="Arial Narrow" w:hAnsi="Arial Narrow"/>
+                <w:b/>
+              </w:rPr>
+              <w:t xml:space="preserve">}) </w:t>
             </w:r>
             <w:r>
               <w:rPr>
@@ -2725,7 +3519,23 @@
                 <w:rFonts w:ascii="Arial Narrow" w:hAnsi="Arial Narrow"/>
                 <w:b/>
               </w:rPr>
-              <w:t xml:space="preserve">({supportLcdProjector}) </w:t>
+              <w:t>({</w:t>
+            </w:r>
+            <w:proofErr w:type="spellStart"/>
+            <w:r>
+              <w:rPr>
+                <w:rFonts w:ascii="Arial Narrow" w:hAnsi="Arial Narrow"/>
+                <w:b/>
+              </w:rPr>
+              <w:t>supportLcdProjector</w:t>
+            </w:r>
+            <w:proofErr w:type="spellEnd"/>
+            <w:r>
+              <w:rPr>
+                <w:rFonts w:ascii="Arial Narrow" w:hAnsi="Arial Narrow"/>
+                <w:b/>
+              </w:rPr>
+              <w:t xml:space="preserve">}) </w:t>
             </w:r>
             <w:r>
               <w:rPr>
@@ -2757,7 +3567,23 @@
                 <w:rFonts w:ascii="Arial Narrow" w:hAnsi="Arial Narrow"/>
                 <w:b/>
               </w:rPr>
-              <w:t>{supportLongTable}</w:t>
+              <w:t>{</w:t>
+            </w:r>
+            <w:proofErr w:type="spellStart"/>
+            <w:r>
+              <w:rPr>
+                <w:rFonts w:ascii="Arial Narrow" w:hAnsi="Arial Narrow"/>
+                <w:b/>
+              </w:rPr>
+              <w:t>supportLongTable</w:t>
+            </w:r>
+            <w:proofErr w:type="spellEnd"/>
+            <w:r>
+              <w:rPr>
+                <w:rFonts w:ascii="Arial Narrow" w:hAnsi="Arial Narrow"/>
+                <w:b/>
+              </w:rPr>
+              <w:t>}</w:t>
             </w:r>
             <w:r>
               <w:rPr>
@@ -2816,6 +3642,7 @@
               </w:rPr>
               <w:t xml:space="preserve"> {</w:t>
             </w:r>
+            <w:proofErr w:type="spellStart"/>
             <w:r>
               <w:rPr>
                 <w:rFonts w:ascii="Arial Narrow" w:hAnsi="Arial Narrow"/>
@@ -2823,6 +3650,7 @@
               </w:rPr>
               <w:t>otherSupport</w:t>
             </w:r>
+            <w:proofErr w:type="spellEnd"/>
             <w:r>
               <w:rPr>
                 <w:rFonts w:ascii="Arial Narrow" w:hAnsi="Arial Narrow"/>
@@ -2868,7 +3696,23 @@
                 <w:rFonts w:ascii="Arial Narrow" w:hAnsi="Arial Narrow"/>
                 <w:b/>
               </w:rPr>
-              <w:t xml:space="preserve"> {extraProvisions}</w:t>
+              <w:t xml:space="preserve"> {</w:t>
+            </w:r>
+            <w:proofErr w:type="spellStart"/>
+            <w:r>
+              <w:rPr>
+                <w:rFonts w:ascii="Arial Narrow" w:hAnsi="Arial Narrow"/>
+                <w:b/>
+              </w:rPr>
+              <w:t>extraProvisions</w:t>
+            </w:r>
+            <w:proofErr w:type="spellEnd"/>
+            <w:r>
+              <w:rPr>
+                <w:rFonts w:ascii="Arial Narrow" w:hAnsi="Arial Narrow"/>
+                <w:b/>
+              </w:rPr>
+              <w:t>}</w:t>
             </w:r>
           </w:p>
         </w:tc>
@@ -2956,7 +3800,25 @@
           <w:bCs/>
           <w:sz w:val="20"/>
         </w:rPr>
-        <w:t>{otherDetailsText}</w:t>
+        <w:t>{</w:t>
+      </w:r>
+      <w:proofErr w:type="spellStart"/>
+      <w:r>
+        <w:rPr>
+          <w:rFonts w:ascii="Century Gothic" w:hAnsi="Century Gothic"/>
+          <w:bCs/>
+          <w:sz w:val="20"/>
+        </w:rPr>
+        <w:t>otherDetailsText</w:t>
+      </w:r>
+      <w:proofErr w:type="spellEnd"/>
+      <w:r>
+        <w:rPr>
+          <w:rFonts w:ascii="Century Gothic" w:hAnsi="Century Gothic"/>
+          <w:bCs/>
+          <w:sz w:val="20"/>
+        </w:rPr>
+        <w:t>}</w:t>
       </w:r>
     </w:p>
     <w:p>
@@ -3064,13 +3926,29 @@
                 <w:rFonts w:ascii="Arial Narrow" w:hAnsi="Arial Narrow" w:cs="Arial"/>
                 <w:b/>
               </w:rPr>
-              <w:t>({parentsConsentYes})</w:t>
-            </w:r>
+              <w:t>({</w:t>
+            </w:r>
+            <w:proofErr w:type="spellStart"/>
             <w:r>
               <w:rPr>
                 <w:rFonts w:ascii="Arial Narrow" w:hAnsi="Arial Narrow" w:cs="Arial"/>
                 <w:b/>
               </w:rPr>
+              <w:t>parentsConsentYes</w:t>
+            </w:r>
+            <w:proofErr w:type="spellEnd"/>
+            <w:r>
+              <w:rPr>
+                <w:rFonts w:ascii="Arial Narrow" w:hAnsi="Arial Narrow" w:cs="Arial"/>
+                <w:b/>
+              </w:rPr>
+              <w:t>})</w:t>
+            </w:r>
+            <w:r>
+              <w:rPr>
+                <w:rFonts w:ascii="Arial Narrow" w:hAnsi="Arial Narrow" w:cs="Arial"/>
+                <w:b/>
+              </w:rPr>
               <w:t xml:space="preserve"> Yes</w:t>
             </w:r>
             <w:r>
@@ -3085,7 +3963,23 @@
                 <w:rFonts w:ascii="Arial Narrow" w:hAnsi="Arial Narrow" w:cs="Arial"/>
                 <w:b/>
               </w:rPr>
-              <w:t>({parentsConsentNotApplicable})</w:t>
+              <w:t>({</w:t>
+            </w:r>
+            <w:proofErr w:type="spellStart"/>
+            <w:r>
+              <w:rPr>
+                <w:rFonts w:ascii="Arial Narrow" w:hAnsi="Arial Narrow" w:cs="Arial"/>
+                <w:b/>
+              </w:rPr>
+              <w:t>parentsConsentNotApplicable</w:t>
+            </w:r>
+            <w:proofErr w:type="spellEnd"/>
+            <w:r>
+              <w:rPr>
+                <w:rFonts w:ascii="Arial Narrow" w:hAnsi="Arial Narrow" w:cs="Arial"/>
+                <w:b/>
+              </w:rPr>
+              <w:t>})</w:t>
             </w:r>
             <w:r>
               <w:rPr>
@@ -3167,13 +4061,29 @@
                 <w:rFonts w:ascii="Arial Narrow" w:hAnsi="Arial Narrow" w:cs="Arial"/>
                 <w:b/>
               </w:rPr>
-              <w:t>({parentsConsentYes})</w:t>
-            </w:r>
+              <w:t>({</w:t>
+            </w:r>
+            <w:proofErr w:type="spellStart"/>
             <w:r>
               <w:rPr>
                 <w:rFonts w:ascii="Arial Narrow" w:hAnsi="Arial Narrow" w:cs="Arial"/>
                 <w:b/>
               </w:rPr>
+              <w:t>parentsConsentYes</w:t>
+            </w:r>
+            <w:proofErr w:type="spellEnd"/>
+            <w:r>
+              <w:rPr>
+                <w:rFonts w:ascii="Arial Narrow" w:hAnsi="Arial Narrow" w:cs="Arial"/>
+                <w:b/>
+              </w:rPr>
+              <w:t>})</w:t>
+            </w:r>
+            <w:r>
+              <w:rPr>
+                <w:rFonts w:ascii="Arial Narrow" w:hAnsi="Arial Narrow" w:cs="Arial"/>
+                <w:b/>
+              </w:rPr>
               <w:t xml:space="preserve"> Yes </w:t>
             </w:r>
             <w:r>
@@ -3181,7 +4091,23 @@
                 <w:rFonts w:ascii="Arial Narrow" w:hAnsi="Arial Narrow" w:cs="Arial"/>
                 <w:b/>
               </w:rPr>
-              <w:t>({academicInterruptionNone})</w:t>
+              <w:t>({</w:t>
+            </w:r>
+            <w:proofErr w:type="spellStart"/>
+            <w:r>
+              <w:rPr>
+                <w:rFonts w:ascii="Arial Narrow" w:hAnsi="Arial Narrow" w:cs="Arial"/>
+                <w:b/>
+              </w:rPr>
+              <w:t>academicInterruptionNone</w:t>
+            </w:r>
+            <w:proofErr w:type="spellEnd"/>
+            <w:r>
+              <w:rPr>
+                <w:rFonts w:ascii="Arial Narrow" w:hAnsi="Arial Narrow" w:cs="Arial"/>
+                <w:b/>
+              </w:rPr>
+              <w:t>})</w:t>
             </w:r>
             <w:r>
               <w:rPr>
@@ -3230,7 +4156,31 @@
                 <w:sz w:val="20"/>
                 <w:u w:val="single"/>
               </w:rPr>
-              <w:t>{academicRemarks}</w:t>
+              <w:t>{</w:t>
+            </w:r>
+            <w:proofErr w:type="spellStart"/>
+            <w:r>
+              <w:rPr>
+                <w:rFonts w:ascii="Arial Narrow" w:hAnsi="Arial Narrow" w:cs="Arial"/>
+                <w:b/>
+                <w:i/>
+                <w:color w:val="ED7D31" w:themeColor="accent2"/>
+                <w:sz w:val="20"/>
+                <w:u w:val="single"/>
+              </w:rPr>
+              <w:t>academicRemarks</w:t>
+            </w:r>
+            <w:proofErr w:type="spellEnd"/>
+            <w:r>
+              <w:rPr>
+                <w:rFonts w:ascii="Arial Narrow" w:hAnsi="Arial Narrow" w:cs="Arial"/>
+                <w:b/>
+                <w:i/>
+                <w:color w:val="ED7D31" w:themeColor="accent2"/>
+                <w:sz w:val="20"/>
+                <w:u w:val="single"/>
+              </w:rPr>
+              <w:t>}</w:t>
             </w:r>
           </w:p>
         </w:tc>
@@ -3259,13 +4209,29 @@
                 <w:rFonts w:ascii="Arial Narrow" w:hAnsi="Arial Narrow" w:cs="Arial"/>
                 <w:b/>
               </w:rPr>
-              <w:t>({medicalExamYes})</w:t>
-            </w:r>
+              <w:t>({</w:t>
+            </w:r>
+            <w:proofErr w:type="spellStart"/>
             <w:r>
               <w:rPr>
                 <w:rFonts w:ascii="Arial Narrow" w:hAnsi="Arial Narrow" w:cs="Arial"/>
                 <w:b/>
               </w:rPr>
+              <w:t>medicalExamYes</w:t>
+            </w:r>
+            <w:proofErr w:type="spellEnd"/>
+            <w:r>
+              <w:rPr>
+                <w:rFonts w:ascii="Arial Narrow" w:hAnsi="Arial Narrow" w:cs="Arial"/>
+                <w:b/>
+              </w:rPr>
+              <w:t>})</w:t>
+            </w:r>
+            <w:r>
+              <w:rPr>
+                <w:rFonts w:ascii="Arial Narrow" w:hAnsi="Arial Narrow" w:cs="Arial"/>
+                <w:b/>
+              </w:rPr>
               <w:t xml:space="preserve"> Yes  </w:t>
             </w:r>
             <w:r>
@@ -3273,7 +4239,23 @@
                 <w:rFonts w:ascii="Arial Narrow" w:hAnsi="Arial Narrow" w:cs="Arial"/>
                 <w:b/>
               </w:rPr>
-              <w:t>({medicalExamNotApplicable})</w:t>
+              <w:t>({</w:t>
+            </w:r>
+            <w:proofErr w:type="spellStart"/>
+            <w:r>
+              <w:rPr>
+                <w:rFonts w:ascii="Arial Narrow" w:hAnsi="Arial Narrow" w:cs="Arial"/>
+                <w:b/>
+              </w:rPr>
+              <w:t>medicalExamNotApplicable</w:t>
+            </w:r>
+            <w:proofErr w:type="spellEnd"/>
+            <w:r>
+              <w:rPr>
+                <w:rFonts w:ascii="Arial Narrow" w:hAnsi="Arial Narrow" w:cs="Arial"/>
+                <w:b/>
+              </w:rPr>
+              <w:t>})</w:t>
             </w:r>
             <w:r>
               <w:rPr>
@@ -3338,13 +4320,29 @@
                 <w:rFonts w:ascii="Arial Narrow" w:hAnsi="Arial Narrow" w:cs="Arial"/>
                 <w:b/>
               </w:rPr>
-              <w:t>({reportComplianceYes})</w:t>
-            </w:r>
+              <w:t>({</w:t>
+            </w:r>
+            <w:proofErr w:type="spellStart"/>
             <w:r>
               <w:rPr>
                 <w:rFonts w:ascii="Arial Narrow" w:hAnsi="Arial Narrow" w:cs="Arial"/>
                 <w:b/>
               </w:rPr>
+              <w:t>reportComplianceYes</w:t>
+            </w:r>
+            <w:proofErr w:type="spellEnd"/>
+            <w:r>
+              <w:rPr>
+                <w:rFonts w:ascii="Arial Narrow" w:hAnsi="Arial Narrow" w:cs="Arial"/>
+                <w:b/>
+              </w:rPr>
+              <w:t>})</w:t>
+            </w:r>
+            <w:r>
+              <w:rPr>
+                <w:rFonts w:ascii="Arial Narrow" w:hAnsi="Arial Narrow" w:cs="Arial"/>
+                <w:b/>
+              </w:rPr>
               <w:t xml:space="preserve"> </w:t>
             </w:r>
             <w:r>
@@ -3366,7 +4364,23 @@
                 <w:rFonts w:ascii="Arial Narrow" w:hAnsi="Arial Narrow" w:cs="Arial"/>
                 <w:b/>
               </w:rPr>
-              <w:t>({reportComplianceNotApplicable})</w:t>
+              <w:t>({</w:t>
+            </w:r>
+            <w:proofErr w:type="spellStart"/>
+            <w:r>
+              <w:rPr>
+                <w:rFonts w:ascii="Arial Narrow" w:hAnsi="Arial Narrow" w:cs="Arial"/>
+                <w:b/>
+              </w:rPr>
+              <w:t>reportComplianceNotApplicable</w:t>
+            </w:r>
+            <w:proofErr w:type="spellEnd"/>
+            <w:r>
+              <w:rPr>
+                <w:rFonts w:ascii="Arial Narrow" w:hAnsi="Arial Narrow" w:cs="Arial"/>
+                <w:b/>
+              </w:rPr>
+              <w:t>})</w:t>
             </w:r>
             <w:r>
               <w:rPr>
@@ -3410,7 +4424,25 @@
                 <w:b/>
                 <w:u w:val="single"/>
               </w:rPr>
-              <w:t>{studentPersonnelRatio}</w:t>
+              <w:t>{</w:t>
+            </w:r>
+            <w:proofErr w:type="spellStart"/>
+            <w:r>
+              <w:rPr>
+                <w:rFonts w:ascii="Arial Narrow" w:hAnsi="Arial Narrow" w:cs="Arial"/>
+                <w:b/>
+                <w:u w:val="single"/>
+              </w:rPr>
+              <w:t>studentPersonnelRatio</w:t>
+            </w:r>
+            <w:proofErr w:type="spellEnd"/>
+            <w:r>
+              <w:rPr>
+                <w:rFonts w:ascii="Arial Narrow" w:hAnsi="Arial Narrow" w:cs="Arial"/>
+                <w:b/>
+                <w:u w:val="single"/>
+              </w:rPr>
+              <w:t>}</w:t>
             </w:r>
           </w:p>
         </w:tc>
@@ -3537,7 +4569,25 @@
                 <w:b/>
                 <w:bCs/>
               </w:rPr>
-              <w:t>{preparedBy}</w:t>
+              <w:t>{</w:t>
+            </w:r>
+            <w:proofErr w:type="spellStart"/>
+            <w:r>
+              <w:rPr>
+                <w:rFonts w:ascii="Arial Narrow" w:hAnsi="Arial Narrow"/>
+                <w:b/>
+                <w:bCs/>
+              </w:rPr>
+              <w:t>preparedBy</w:t>
+            </w:r>
+            <w:proofErr w:type="spellEnd"/>
+            <w:r>
+              <w:rPr>
+                <w:rFonts w:ascii="Arial Narrow" w:hAnsi="Arial Narrow"/>
+                <w:b/>
+                <w:bCs/>
+              </w:rPr>
+              <w:t>}</w:t>
             </w:r>
           </w:p>
           <w:p>
@@ -3608,7 +4658,25 @@
                 <w:b/>
                 <w:bCs/>
               </w:rPr>
-              <w:t>{adviserName}</w:t>
+              <w:t>{</w:t>
+            </w:r>
+            <w:proofErr w:type="spellStart"/>
+            <w:r>
+              <w:rPr>
+                <w:rFonts w:ascii="Arial Narrow" w:hAnsi="Arial Narrow"/>
+                <w:b/>
+                <w:bCs/>
+              </w:rPr>
+              <w:t>adviserName</w:t>
+            </w:r>
+            <w:proofErr w:type="spellEnd"/>
+            <w:r>
+              <w:rPr>
+                <w:rFonts w:ascii="Arial Narrow" w:hAnsi="Arial Narrow"/>
+                <w:b/>
+                <w:bCs/>
+              </w:rPr>
+              <w:t>}</w:t>
             </w:r>
           </w:p>
           <w:p>
@@ -3670,21 +4738,55 @@
                 <w:bCs/>
                 <w:lang w:val="en-PH"/>
               </w:rPr>
-              <w:t>{deanName}</w:t>
-            </w:r>
-          </w:p>
-          <w:p>
-            <w:pPr>
-              <w:spacing w:after="0"/>
-              <w:rPr>
-                <w:rFonts w:ascii="Arial Narrow" w:hAnsi="Arial Narrow"/>
-              </w:rPr>
-            </w:pPr>
-            <w:r>
-              <w:rPr>
-                <w:rFonts w:ascii="Arial Narrow" w:hAnsi="Arial Narrow"/>
-              </w:rPr>
-              <w:t>{deanTitle}</w:t>
+              <w:t>{</w:t>
+            </w:r>
+            <w:proofErr w:type="spellStart"/>
+            <w:r>
+              <w:rPr>
+                <w:rFonts w:ascii="Arial Narrow" w:hAnsi="Arial Narrow"/>
+                <w:b/>
+                <w:bCs/>
+                <w:lang w:val="en-PH"/>
+              </w:rPr>
+              <w:t>deanName</w:t>
+            </w:r>
+            <w:proofErr w:type="spellEnd"/>
+            <w:r>
+              <w:rPr>
+                <w:rFonts w:ascii="Arial Narrow" w:hAnsi="Arial Narrow"/>
+                <w:b/>
+                <w:bCs/>
+                <w:lang w:val="en-PH"/>
+              </w:rPr>
+              <w:t>}</w:t>
+            </w:r>
+          </w:p>
+          <w:p>
+            <w:pPr>
+              <w:spacing w:after="0"/>
+              <w:rPr>
+                <w:rFonts w:ascii="Arial Narrow" w:hAnsi="Arial Narrow"/>
+              </w:rPr>
+            </w:pPr>
+            <w:r>
+              <w:rPr>
+                <w:rFonts w:ascii="Arial Narrow" w:hAnsi="Arial Narrow"/>
+              </w:rPr>
+              <w:t>{</w:t>
+            </w:r>
+            <w:proofErr w:type="spellStart"/>
+            <w:r>
+              <w:rPr>
+                <w:rFonts w:ascii="Arial Narrow" w:hAnsi="Arial Narrow"/>
+              </w:rPr>
+              <w:t>deanTitle</w:t>
+            </w:r>
+            <w:proofErr w:type="spellEnd"/>
+            <w:r>
+              <w:rPr>
+                <w:rFonts w:ascii="Arial Narrow" w:hAnsi="Arial Narrow"/>
+              </w:rPr>
+              <w:t>}</w:t>
             </w:r>
           </w:p>
         </w:tc>
@@ -3732,7 +4834,23 @@
                 <w:rFonts w:ascii="Arial Narrow" w:hAnsi="Arial Narrow"/>
                 <w:b/>
               </w:rPr>
-              <w:t>{sdsName}</w:t>
+              <w:t>{</w:t>
+            </w:r>
+            <w:proofErr w:type="spellStart"/>
+            <w:r>
+              <w:rPr>
+                <w:rFonts w:ascii="Arial Narrow" w:hAnsi="Arial Narrow"/>
+                <w:b/>
+              </w:rPr>
+              <w:t>sdsName</w:t>
+            </w:r>
+            <w:proofErr w:type="spellEnd"/>
+            <w:r>
+              <w:rPr>
+                <w:rFonts w:ascii="Arial Narrow" w:hAnsi="Arial Narrow"/>
+                <w:b/>
+              </w:rPr>
+              <w:t>}</w:t>
             </w:r>
           </w:p>
           <w:p>
@@ -3795,7 +4913,23 @@
                 <w:rFonts w:ascii="Arial Narrow" w:hAnsi="Arial Narrow"/>
                 <w:b/>
               </w:rPr>
-              <w:t>{sasName}</w:t>
+              <w:t>{</w:t>
+            </w:r>
+            <w:proofErr w:type="spellStart"/>
+            <w:r>
+              <w:rPr>
+                <w:rFonts w:ascii="Arial Narrow" w:hAnsi="Arial Narrow"/>
+                <w:b/>
+              </w:rPr>
+              <w:t>sasName</w:t>
+            </w:r>
+            <w:proofErr w:type="spellEnd"/>
+            <w:r>
+              <w:rPr>
+                <w:rFonts w:ascii="Arial Narrow" w:hAnsi="Arial Narrow"/>
+                <w:b/>
+              </w:rPr>
+              <w:t>}</w:t>
             </w:r>
           </w:p>
           <w:p>
@@ -3864,7 +4998,23 @@
                 <w:rFonts w:ascii="Arial Narrow" w:hAnsi="Arial Narrow"/>
                 <w:b/>
               </w:rPr>
-              <w:t>{vpaaAsst}</w:t>
+              <w:t>{</w:t>
+            </w:r>
+            <w:proofErr w:type="spellStart"/>
+            <w:r>
+              <w:rPr>
+                <w:rFonts w:ascii="Arial Narrow" w:hAnsi="Arial Narrow"/>
+                <w:b/>
+              </w:rPr>
+              <w:t>vpaaAsst</w:t>
+            </w:r>
+            <w:proofErr w:type="spellEnd"/>
+            <w:r>
+              <w:rPr>
+                <w:rFonts w:ascii="Arial Narrow" w:hAnsi="Arial Narrow"/>
+                <w:b/>
+              </w:rPr>
+              <w:t>}</w:t>
             </w:r>
           </w:p>
           <w:p>
@@ -3909,6 +5059,134 @@
               <w:t>Recommending Approval:</w:t>
             </w:r>
           </w:p>
+          <w:p>
+            <w:pPr>
+              <w:spacing w:after="0"/>
+              <w:jc w:val="center"/>
+              <w:rPr>
+                <w:rFonts w:ascii="Arial Narrow" w:hAnsi="Arial Narrow"/>
+              </w:rPr>
+            </w:pPr>
+          </w:p>
+          <w:p>
+            <w:pPr>
+              <w:spacing w:after="0"/>
+              <w:jc w:val="center"/>
+              <w:rPr>
+                <w:rFonts w:ascii="Arial Narrow" w:hAnsi="Arial Narrow"/>
+              </w:rPr>
+            </w:pPr>
+            <w:r>
+              <w:rPr>
+                <w:rFonts w:ascii="Arial Narrow" w:hAnsi="Arial Narrow"/>
+              </w:rPr>
+              <w:t>{#additionalAssignatories}</w:t>
+            </w:r>
+          </w:p>
+          <w:p>
+            <w:pPr>
+              <w:spacing w:after="0"/>
+              <w:jc w:val="center"/>
+              <w:rPr>
+                <w:rFonts w:ascii="Arial Narrow" w:hAnsi="Arial Narrow"/>
+                <w:b/>
+                <w:bCs/>
+              </w:rPr>
+            </w:pPr>
+            <w:r>
+              <w:rPr>
+                <w:rFonts w:ascii="Arial Narrow" w:hAnsi="Arial Narrow"/>
+                <w:b/>
+                <w:bCs/>
+              </w:rPr>
+              <w:t>{</w:t>
+            </w:r>
+            <w:proofErr w:type="spellStart"/>
+            <w:r>
+              <w:rPr>
+                <w:rFonts w:ascii="Arial Narrow" w:hAnsi="Arial Narrow"/>
+                <w:b/>
+                <w:bCs/>
+              </w:rPr>
+              <w:t>signatoryName</w:t>
+            </w:r>
+            <w:proofErr w:type="spellEnd"/>
+            <w:r>
+              <w:rPr>
+                <w:rFonts w:ascii="Arial Narrow" w:hAnsi="Arial Narrow"/>
+                <w:b/>
+                <w:bCs/>
+              </w:rPr>
+              <w:t>}</w:t>
+            </w:r>
+          </w:p>
+          <w:p>
+            <w:pPr>
+              <w:spacing w:after="0"/>
+              <w:jc w:val="center"/>
+              <w:rPr>
+                <w:rFonts w:ascii="Arial Narrow" w:hAnsi="Arial Narrow"/>
+              </w:rPr>
+            </w:pPr>
+            <w:r>
+              <w:rPr>
+                <w:rFonts w:ascii="Arial Narrow" w:hAnsi="Arial Narrow"/>
+              </w:rPr>
+              <w:t>{</w:t>
+            </w:r>
+            <w:proofErr w:type="spellStart"/>
+            <w:r>
+              <w:rPr>
+                <w:rFonts w:ascii="Arial Narrow" w:hAnsi="Arial Narrow"/>
+              </w:rPr>
+              <w:t>signatoryTitle</w:t>
+            </w:r>
+            <w:proofErr w:type="spellEnd"/>
+            <w:r>
+              <w:rPr>
+                <w:rFonts w:ascii="Arial Narrow" w:hAnsi="Arial Narrow"/>
+              </w:rPr>
+              <w:t>}</w:t>
+            </w:r>
+          </w:p>
+          <w:p>
+            <w:pPr>
+              <w:spacing w:after="0"/>
+              <w:jc w:val="center"/>
+              <w:rPr>
+                <w:rFonts w:ascii="Arial Narrow" w:hAnsi="Arial Narrow"/>
+              </w:rPr>
+            </w:pPr>
+          </w:p>
+          <w:p>
+            <w:pPr>
+              <w:spacing w:after="0"/>
+              <w:jc w:val="center"/>
+              <w:rPr>
+                <w:rFonts w:ascii="Arial Narrow" w:hAnsi="Arial Narrow"/>
+              </w:rPr>
+            </w:pPr>
+            <w:r>
+              <w:rPr>
+                <w:rFonts w:ascii="Arial Narrow" w:hAnsi="Arial Narrow"/>
+              </w:rPr>
+              <w:t>{/</w:t>
+            </w:r>
+            <w:proofErr w:type="spellStart"/>
+            <w:r>
+              <w:rPr>
+                <w:rFonts w:ascii="Arial Narrow" w:hAnsi="Arial Narrow"/>
+              </w:rPr>
+              <w:t>additionalAssignatories</w:t>
+            </w:r>
+            <w:proofErr w:type="spellEnd"/>
+            <w:r>
+              <w:rPr>
+                <w:rFonts w:ascii="Arial Narrow" w:hAnsi="Arial Narrow"/>
+              </w:rPr>
+              <w:t>}</w:t>
+            </w:r>
+          </w:p>
         </w:tc>
         <w:tc>
           <w:tcPr>
@@ -3951,7 +5229,23 @@
                 <w:rFonts w:ascii="Arial Narrow" w:hAnsi="Arial Narrow"/>
                 <w:b/>
               </w:rPr>
-              <w:t>{presidentName}</w:t>
+              <w:t>{</w:t>
+            </w:r>
+            <w:proofErr w:type="spellStart"/>
+            <w:r>
+              <w:rPr>
+                <w:rFonts w:ascii="Arial Narrow" w:hAnsi="Arial Narrow"/>
+                <w:b/>
+              </w:rPr>
+              <w:t>presidentName</w:t>
+            </w:r>
+            <w:proofErr w:type="spellEnd"/>
+            <w:r>
+              <w:rPr>
+                <w:rFonts w:ascii="Arial Narrow" w:hAnsi="Arial Narrow"/>
+                <w:b/>
+              </w:rPr>
+              <w:t>}</w:t>
             </w:r>
           </w:p>
           <w:p>
@@ -4004,7 +5298,23 @@
                 <w:rFonts w:ascii="Arial Narrow" w:hAnsi="Arial Narrow"/>
                 <w:b/>
               </w:rPr>
-              <w:t>{vpaaName}</w:t>
+              <w:t>{</w:t>
+            </w:r>
+            <w:proofErr w:type="spellStart"/>
+            <w:r>
+              <w:rPr>
+                <w:rFonts w:ascii="Arial Narrow" w:hAnsi="Arial Narrow"/>
+                <w:b/>
+              </w:rPr>
+              <w:t>vpaaName</w:t>
+            </w:r>
+            <w:proofErr w:type="spellEnd"/>
+            <w:r>
+              <w:rPr>
+                <w:rFonts w:ascii="Arial Narrow" w:hAnsi="Arial Narrow"/>
+                <w:b/>
+              </w:rPr>
+              <w:t>}</w:t>
             </w:r>
           </w:p>
           <w:p>
@@ -4246,7 +5556,21 @@
               <w:rPr>
                 <w:rFonts w:ascii="Arial Narrow" w:hAnsi="Arial Narrow"/>
               </w:rPr>
-              <w:t xml:space="preserve"> {conductedRemarks}</w:t>
+              <w:t xml:space="preserve"> {</w:t>
+            </w:r>
+            <w:proofErr w:type="spellStart"/>
+            <w:r>
+              <w:rPr>
+                <w:rFonts w:ascii="Arial Narrow" w:hAnsi="Arial Narrow"/>
+              </w:rPr>
+              <w:t>conductedRemarks</w:t>
+            </w:r>
+            <w:proofErr w:type="spellEnd"/>
+            <w:r>
+              <w:rPr>
+                <w:rFonts w:ascii="Arial Narrow" w:hAnsi="Arial Narrow"/>
+              </w:rPr>
+              <w:t>}</w:t>
             </w:r>
           </w:p>
         </w:tc>
@@ -4272,7 +5596,21 @@
               <w:rPr>
                 <w:rFonts w:ascii="Arial Narrow" w:hAnsi="Arial Narrow"/>
               </w:rPr>
-              <w:t xml:space="preserve"> {cancelledRemarks}</w:t>
+              <w:t xml:space="preserve"> {</w:t>
+            </w:r>
+            <w:proofErr w:type="spellStart"/>
+            <w:r>
+              <w:rPr>
+                <w:rFonts w:ascii="Arial Narrow" w:hAnsi="Arial Narrow"/>
+              </w:rPr>
+              <w:t>cancelledRemarks</w:t>
+            </w:r>
+            <w:proofErr w:type="spellEnd"/>
+            <w:r>
+              <w:rPr>
+                <w:rFonts w:ascii="Arial Narrow" w:hAnsi="Arial Narrow"/>
+              </w:rPr>
+              <w:t>}</w:t>
             </w:r>
           </w:p>
         </w:tc>

</xml_diff>

<commit_message>
feat: add TypeScript definitions for docxtemplater-image-module-free
- Introduced a new declaration file for the docxtemplater-image-module-free.
- Defined ImageModuleOptions type with properties for image handling.
- Created ImageModule class implementing DXT.Module with a constructor accepting ImageModuleOptions.
</commit_message>
<xml_diff>
--- a/public/templates/student-activity-proposal-form-v2.docx
+++ b/public/templates/student-activity-proposal-form-v2.docx
@@ -211,7 +211,7 @@
           <w:szCs w:val="28"/>
         </w:rPr>
         <w:drawing>
-          <wp:anchor distT="0" distB="0" distL="114300" distR="114300" simplePos="0" relativeHeight="251665408" behindDoc="0" locked="0" layoutInCell="1" allowOverlap="1" wp14:anchorId="4D66C737" wp14:editId="0085B87D">
+          <wp:anchor distT="0" distB="0" distL="114300" distR="114300" simplePos="0" relativeHeight="251665408" behindDoc="0" locked="0" layoutInCell="1" allowOverlap="1" wp14:anchorId="4D66C737" wp14:editId="053BE956">
             <wp:simplePos x="0" y="0"/>
             <wp:positionH relativeFrom="column">
               <wp:posOffset>190004</wp:posOffset>
@@ -276,7 +276,7 @@
           <w:szCs w:val="28"/>
         </w:rPr>
         <w:drawing>
-          <wp:anchor distT="0" distB="0" distL="114300" distR="114300" simplePos="0" relativeHeight="251659264" behindDoc="0" locked="0" layoutInCell="1" allowOverlap="1" wp14:anchorId="31EB85D4" wp14:editId="7880CEAD">
+          <wp:anchor distT="0" distB="0" distL="114300" distR="114300" simplePos="0" relativeHeight="251659264" behindDoc="0" locked="0" layoutInCell="1" allowOverlap="1" wp14:anchorId="31EB85D4" wp14:editId="7F053129">
             <wp:simplePos x="0" y="0"/>
             <wp:positionH relativeFrom="column">
               <wp:posOffset>-474914</wp:posOffset>
@@ -575,7 +575,21 @@
               <w:rPr>
                 <w:rFonts w:ascii="Arial Narrow" w:hAnsi="Arial Narrow"/>
               </w:rPr>
-              <w:t>}) College  ({</w:t>
+              <w:t xml:space="preserve">}) </w:t>
+            </w:r>
+            <w:proofErr w:type="gramStart"/>
+            <w:r>
+              <w:rPr>
+                <w:rFonts w:ascii="Arial Narrow" w:hAnsi="Arial Narrow"/>
+              </w:rPr>
+              <w:t>College  (</w:t>
+            </w:r>
+            <w:proofErr w:type="gramEnd"/>
+            <w:r>
+              <w:rPr>
+                <w:rFonts w:ascii="Arial Narrow" w:hAnsi="Arial Narrow"/>
+              </w:rPr>
+              <w:t>{</w:t>
             </w:r>
             <w:proofErr w:type="spellStart"/>
             <w:r>
@@ -589,7 +603,21 @@
               <w:rPr>
                 <w:rFonts w:ascii="Arial Narrow" w:hAnsi="Arial Narrow"/>
               </w:rPr>
-              <w:t>}) Alternative Education  ({</w:t>
+              <w:t xml:space="preserve">}) Alternative </w:t>
+            </w:r>
+            <w:proofErr w:type="gramStart"/>
+            <w:r>
+              <w:rPr>
+                <w:rFonts w:ascii="Arial Narrow" w:hAnsi="Arial Narrow"/>
+              </w:rPr>
+              <w:t>Education  (</w:t>
+            </w:r>
+            <w:proofErr w:type="gramEnd"/>
+            <w:r>
+              <w:rPr>
+                <w:rFonts w:ascii="Arial Narrow" w:hAnsi="Arial Narrow"/>
+              </w:rPr>
+              <w:t>{</w:t>
             </w:r>
             <w:proofErr w:type="spellStart"/>
             <w:r>
@@ -603,7 +631,21 @@
               <w:rPr>
                 <w:rFonts w:ascii="Arial Narrow" w:hAnsi="Arial Narrow"/>
               </w:rPr>
-              <w:t>}) Graduate Studies  ({</w:t>
+              <w:t xml:space="preserve">}) Graduate </w:t>
+            </w:r>
+            <w:proofErr w:type="gramStart"/>
+            <w:r>
+              <w:rPr>
+                <w:rFonts w:ascii="Arial Narrow" w:hAnsi="Arial Narrow"/>
+              </w:rPr>
+              <w:t>Studies  (</w:t>
+            </w:r>
+            <w:proofErr w:type="gramEnd"/>
+            <w:r>
+              <w:rPr>
+                <w:rFonts w:ascii="Arial Narrow" w:hAnsi="Arial Narrow"/>
+              </w:rPr>
+              <w:t>{</w:t>
             </w:r>
             <w:proofErr w:type="spellStart"/>
             <w:r>
@@ -617,7 +659,21 @@
               <w:rPr>
                 <w:rFonts w:ascii="Arial Narrow" w:hAnsi="Arial Narrow"/>
               </w:rPr>
-              <w:t>}) Extensions Office  ({</w:t>
+              <w:t xml:space="preserve">}) Extensions </w:t>
+            </w:r>
+            <w:proofErr w:type="gramStart"/>
+            <w:r>
+              <w:rPr>
+                <w:rFonts w:ascii="Arial Narrow" w:hAnsi="Arial Narrow"/>
+              </w:rPr>
+              <w:t>Office  (</w:t>
+            </w:r>
+            <w:proofErr w:type="gramEnd"/>
+            <w:r>
+              <w:rPr>
+                <w:rFonts w:ascii="Arial Narrow" w:hAnsi="Arial Narrow"/>
+              </w:rPr>
+              <w:t>{</w:t>
             </w:r>
             <w:proofErr w:type="spellStart"/>
             <w:r>
@@ -1424,7 +1480,21 @@
               <w:rPr>
                 <w:rFonts w:ascii="Arial Narrow" w:hAnsi="Arial Narrow"/>
               </w:rPr>
-              <w:t>}) Online        ({</w:t>
+              <w:t xml:space="preserve">}) Online     </w:t>
+            </w:r>
+            <w:proofErr w:type="gramStart"/>
+            <w:r>
+              <w:rPr>
+                <w:rFonts w:ascii="Arial Narrow" w:hAnsi="Arial Narrow"/>
+              </w:rPr>
+              <w:t xml:space="preserve">   (</w:t>
+            </w:r>
+            <w:proofErr w:type="gramEnd"/>
+            <w:r>
+              <w:rPr>
+                <w:rFonts w:ascii="Arial Narrow" w:hAnsi="Arial Narrow"/>
+              </w:rPr>
+              <w:t>{</w:t>
             </w:r>
             <w:proofErr w:type="spellStart"/>
             <w:r>
@@ -1835,7 +1905,21 @@
               <w:rPr>
                 <w:rFonts w:ascii="Arial Narrow" w:hAnsi="Arial Narrow"/>
               </w:rPr>
-              <w:t>}) Co-Curricular   ({</w:t>
+              <w:t>}) Co-Curricular</w:t>
+            </w:r>
+            <w:proofErr w:type="gramStart"/>
+            <w:r>
+              <w:rPr>
+                <w:rFonts w:ascii="Arial Narrow" w:hAnsi="Arial Narrow"/>
+              </w:rPr>
+              <w:t xml:space="preserve">   (</w:t>
+            </w:r>
+            <w:proofErr w:type="gramEnd"/>
+            <w:r>
+              <w:rPr>
+                <w:rFonts w:ascii="Arial Narrow" w:hAnsi="Arial Narrow"/>
+              </w:rPr>
+              <w:t>{</w:t>
             </w:r>
             <w:proofErr w:type="spellStart"/>
             <w:r>
@@ -1955,7 +2039,21 @@
               <w:rPr>
                 <w:rFonts w:ascii="Arial Narrow" w:hAnsi="Arial Narrow"/>
               </w:rPr>
-              <w:t>}) Organizational     ({</w:t>
+              <w:t xml:space="preserve">}) Organizational  </w:t>
+            </w:r>
+            <w:proofErr w:type="gramStart"/>
+            <w:r>
+              <w:rPr>
+                <w:rFonts w:ascii="Arial Narrow" w:hAnsi="Arial Narrow"/>
+              </w:rPr>
+              <w:t xml:space="preserve">   (</w:t>
+            </w:r>
+            <w:proofErr w:type="gramEnd"/>
+            <w:r>
+              <w:rPr>
+                <w:rFonts w:ascii="Arial Narrow" w:hAnsi="Arial Narrow"/>
+              </w:rPr>
+              <w:t>{</w:t>
             </w:r>
             <w:proofErr w:type="spellStart"/>
             <w:r>
@@ -1984,7 +2082,21 @@
               <w:rPr>
                 <w:rFonts w:ascii="Arial Narrow" w:hAnsi="Arial Narrow"/>
               </w:rPr>
-              <w:t xml:space="preserve"> Institutional     ({</w:t>
+              <w:t xml:space="preserve"> Institutional  </w:t>
+            </w:r>
+            <w:proofErr w:type="gramStart"/>
+            <w:r>
+              <w:rPr>
+                <w:rFonts w:ascii="Arial Narrow" w:hAnsi="Arial Narrow"/>
+              </w:rPr>
+              <w:t xml:space="preserve">   (</w:t>
+            </w:r>
+            <w:proofErr w:type="gramEnd"/>
+            <w:r>
+              <w:rPr>
+                <w:rFonts w:ascii="Arial Narrow" w:hAnsi="Arial Narrow"/>
+              </w:rPr>
+              <w:t>{</w:t>
             </w:r>
             <w:proofErr w:type="spellStart"/>
             <w:r>
@@ -1998,7 +2110,21 @@
               <w:rPr>
                 <w:rFonts w:ascii="Arial Narrow" w:hAnsi="Arial Narrow"/>
               </w:rPr>
-              <w:t>}) Regional     ({</w:t>
+              <w:t xml:space="preserve">}) Regional  </w:t>
+            </w:r>
+            <w:proofErr w:type="gramStart"/>
+            <w:r>
+              <w:rPr>
+                <w:rFonts w:ascii="Arial Narrow" w:hAnsi="Arial Narrow"/>
+              </w:rPr>
+              <w:t xml:space="preserve">   (</w:t>
+            </w:r>
+            <w:proofErr w:type="gramEnd"/>
+            <w:r>
+              <w:rPr>
+                <w:rFonts w:ascii="Arial Narrow" w:hAnsi="Arial Narrow"/>
+              </w:rPr>
+              <w:t>{</w:t>
             </w:r>
             <w:proofErr w:type="spellStart"/>
             <w:r>
@@ -2130,7 +2256,21 @@
               <w:rPr>
                 <w:rFonts w:ascii="Arial Narrow" w:hAnsi="Arial Narrow"/>
               </w:rPr>
-              <w:t>}) Team Building     ({</w:t>
+              <w:t xml:space="preserve">}) Team Building  </w:t>
+            </w:r>
+            <w:proofErr w:type="gramStart"/>
+            <w:r>
+              <w:rPr>
+                <w:rFonts w:ascii="Arial Narrow" w:hAnsi="Arial Narrow"/>
+              </w:rPr>
+              <w:t xml:space="preserve">   (</w:t>
+            </w:r>
+            <w:proofErr w:type="gramEnd"/>
+            <w:r>
+              <w:rPr>
+                <w:rFonts w:ascii="Arial Narrow" w:hAnsi="Arial Narrow"/>
+              </w:rPr>
+              <w:t>{</w:t>
             </w:r>
             <w:proofErr w:type="spellStart"/>
             <w:r>
@@ -2144,7 +2284,21 @@
               <w:rPr>
                 <w:rFonts w:ascii="Arial Narrow" w:hAnsi="Arial Narrow"/>
               </w:rPr>
-              <w:t>}) Leadership Summit     ({</w:t>
+              <w:t xml:space="preserve">}) Leadership Summit  </w:t>
+            </w:r>
+            <w:proofErr w:type="gramStart"/>
+            <w:r>
+              <w:rPr>
+                <w:rFonts w:ascii="Arial Narrow" w:hAnsi="Arial Narrow"/>
+              </w:rPr>
+              <w:t xml:space="preserve">   (</w:t>
+            </w:r>
+            <w:proofErr w:type="gramEnd"/>
+            <w:r>
+              <w:rPr>
+                <w:rFonts w:ascii="Arial Narrow" w:hAnsi="Arial Narrow"/>
+              </w:rPr>
+              <w:t>{</w:t>
             </w:r>
             <w:proofErr w:type="spellStart"/>
             <w:r>
@@ -2158,7 +2312,21 @@
               <w:rPr>
                 <w:rFonts w:ascii="Arial Narrow" w:hAnsi="Arial Narrow"/>
               </w:rPr>
-              <w:t>}) General Assembly     ({</w:t>
+              <w:t xml:space="preserve">}) General Assembly  </w:t>
+            </w:r>
+            <w:proofErr w:type="gramStart"/>
+            <w:r>
+              <w:rPr>
+                <w:rFonts w:ascii="Arial Narrow" w:hAnsi="Arial Narrow"/>
+              </w:rPr>
+              <w:t xml:space="preserve">   (</w:t>
+            </w:r>
+            <w:proofErr w:type="gramEnd"/>
+            <w:r>
+              <w:rPr>
+                <w:rFonts w:ascii="Arial Narrow" w:hAnsi="Arial Narrow"/>
+              </w:rPr>
+              <w:t>{</w:t>
             </w:r>
             <w:proofErr w:type="spellStart"/>
             <w:r>
@@ -2187,7 +2355,21 @@
               <w:rPr>
                 <w:rFonts w:ascii="Arial Narrow" w:hAnsi="Arial Narrow"/>
               </w:rPr>
-              <w:t>Competition     ({</w:t>
+              <w:t xml:space="preserve">Competition  </w:t>
+            </w:r>
+            <w:proofErr w:type="gramStart"/>
+            <w:r>
+              <w:rPr>
+                <w:rFonts w:ascii="Arial Narrow" w:hAnsi="Arial Narrow"/>
+              </w:rPr>
+              <w:t xml:space="preserve">   (</w:t>
+            </w:r>
+            <w:proofErr w:type="gramEnd"/>
+            <w:r>
+              <w:rPr>
+                <w:rFonts w:ascii="Arial Narrow" w:hAnsi="Arial Narrow"/>
+              </w:rPr>
+              <w:t>{</w:t>
             </w:r>
             <w:proofErr w:type="spellStart"/>
             <w:r>
@@ -2201,7 +2383,21 @@
               <w:rPr>
                 <w:rFonts w:ascii="Arial Narrow" w:hAnsi="Arial Narrow"/>
               </w:rPr>
-              <w:t>}) Press Conference     ({</w:t>
+              <w:t xml:space="preserve">}) Press Conference  </w:t>
+            </w:r>
+            <w:proofErr w:type="gramStart"/>
+            <w:r>
+              <w:rPr>
+                <w:rFonts w:ascii="Arial Narrow" w:hAnsi="Arial Narrow"/>
+              </w:rPr>
+              <w:t xml:space="preserve">   (</w:t>
+            </w:r>
+            <w:proofErr w:type="gramEnd"/>
+            <w:r>
+              <w:rPr>
+                <w:rFonts w:ascii="Arial Narrow" w:hAnsi="Arial Narrow"/>
+              </w:rPr>
+              <w:t>{</w:t>
             </w:r>
             <w:proofErr w:type="spellStart"/>
             <w:r>
@@ -2396,7 +2592,21 @@
               <w:rPr>
                 <w:rFonts w:ascii="Arial Narrow" w:hAnsi="Arial Narrow"/>
               </w:rPr>
-              <w:t>}) Courage  ({</w:t>
+              <w:t xml:space="preserve">}) </w:t>
+            </w:r>
+            <w:proofErr w:type="gramStart"/>
+            <w:r>
+              <w:rPr>
+                <w:rFonts w:ascii="Arial Narrow" w:hAnsi="Arial Narrow"/>
+              </w:rPr>
+              <w:t>Courage  (</w:t>
+            </w:r>
+            <w:proofErr w:type="gramEnd"/>
+            <w:r>
+              <w:rPr>
+                <w:rFonts w:ascii="Arial Narrow" w:hAnsi="Arial Narrow"/>
+              </w:rPr>
+              <w:t>{</w:t>
             </w:r>
             <w:proofErr w:type="spellStart"/>
             <w:r>
@@ -2410,7 +2620,21 @@
               <w:rPr>
                 <w:rFonts w:ascii="Arial Narrow" w:hAnsi="Arial Narrow"/>
               </w:rPr>
-              <w:t>}) Compassion  ({</w:t>
+              <w:t xml:space="preserve">}) </w:t>
+            </w:r>
+            <w:proofErr w:type="gramStart"/>
+            <w:r>
+              <w:rPr>
+                <w:rFonts w:ascii="Arial Narrow" w:hAnsi="Arial Narrow"/>
+              </w:rPr>
+              <w:t>Compassion  (</w:t>
+            </w:r>
+            <w:proofErr w:type="gramEnd"/>
+            <w:r>
+              <w:rPr>
+                <w:rFonts w:ascii="Arial Narrow" w:hAnsi="Arial Narrow"/>
+              </w:rPr>
+              <w:t>{</w:t>
             </w:r>
             <w:proofErr w:type="spellStart"/>
             <w:r>
@@ -2424,7 +2648,21 @@
               <w:rPr>
                 <w:rFonts w:ascii="Arial Narrow" w:hAnsi="Arial Narrow"/>
               </w:rPr>
-              <w:t>}) Community-Oriented  ({</w:t>
+              <w:t>}) Community-</w:t>
+            </w:r>
+            <w:proofErr w:type="gramStart"/>
+            <w:r>
+              <w:rPr>
+                <w:rFonts w:ascii="Arial Narrow" w:hAnsi="Arial Narrow"/>
+              </w:rPr>
+              <w:t>Oriented  (</w:t>
+            </w:r>
+            <w:proofErr w:type="gramEnd"/>
+            <w:r>
+              <w:rPr>
+                <w:rFonts w:ascii="Arial Narrow" w:hAnsi="Arial Narrow"/>
+              </w:rPr>
+              <w:t>{</w:t>
             </w:r>
             <w:proofErr w:type="spellStart"/>
             <w:r>
@@ -2438,7 +2676,21 @@
               <w:rPr>
                 <w:rFonts w:ascii="Arial Narrow" w:hAnsi="Arial Narrow"/>
               </w:rPr>
-              <w:t>}) Humility  ({</w:t>
+              <w:t xml:space="preserve">}) </w:t>
+            </w:r>
+            <w:proofErr w:type="gramStart"/>
+            <w:r>
+              <w:rPr>
+                <w:rFonts w:ascii="Arial Narrow" w:hAnsi="Arial Narrow"/>
+              </w:rPr>
+              <w:t>Humility  (</w:t>
+            </w:r>
+            <w:proofErr w:type="gramEnd"/>
+            <w:r>
+              <w:rPr>
+                <w:rFonts w:ascii="Arial Narrow" w:hAnsi="Arial Narrow"/>
+              </w:rPr>
+              <w:t>{</w:t>
             </w:r>
             <w:proofErr w:type="spellStart"/>
             <w:r>
@@ -2452,7 +2704,21 @@
               <w:rPr>
                 <w:rFonts w:ascii="Arial Narrow" w:hAnsi="Arial Narrow"/>
               </w:rPr>
-              <w:t>}) Interiority  ({</w:t>
+              <w:t xml:space="preserve">}) </w:t>
+            </w:r>
+            <w:proofErr w:type="gramStart"/>
+            <w:r>
+              <w:rPr>
+                <w:rFonts w:ascii="Arial Narrow" w:hAnsi="Arial Narrow"/>
+              </w:rPr>
+              <w:t>Interiority  (</w:t>
+            </w:r>
+            <w:proofErr w:type="gramEnd"/>
+            <w:r>
+              <w:rPr>
+                <w:rFonts w:ascii="Arial Narrow" w:hAnsi="Arial Narrow"/>
+              </w:rPr>
+              <w:t>{</w:t>
             </w:r>
             <w:proofErr w:type="spellStart"/>
             <w:r>
@@ -4232,14 +4498,30 @@
                 <w:rFonts w:ascii="Arial Narrow" w:hAnsi="Arial Narrow" w:cs="Arial"/>
                 <w:b/>
               </w:rPr>
-              <w:t xml:space="preserve"> Yes  </w:t>
-            </w:r>
+              <w:t xml:space="preserve"> </w:t>
+            </w:r>
+            <w:proofErr w:type="gramStart"/>
             <w:r>
               <w:rPr>
                 <w:rFonts w:ascii="Arial Narrow" w:hAnsi="Arial Narrow" w:cs="Arial"/>
                 <w:b/>
               </w:rPr>
-              <w:t>({</w:t>
+              <w:t xml:space="preserve">Yes  </w:t>
+            </w:r>
+            <w:r>
+              <w:rPr>
+                <w:rFonts w:ascii="Arial Narrow" w:hAnsi="Arial Narrow" w:cs="Arial"/>
+                <w:b/>
+              </w:rPr>
+              <w:t>(</w:t>
+            </w:r>
+            <w:proofErr w:type="gramEnd"/>
+            <w:r>
+              <w:rPr>
+                <w:rFonts w:ascii="Arial Narrow" w:hAnsi="Arial Narrow" w:cs="Arial"/>
+                <w:b/>
+              </w:rPr>
+              <w:t>{</w:t>
             </w:r>
             <w:proofErr w:type="spellStart"/>
             <w:r>
@@ -4295,16 +4577,17 @@
                 <w:color w:val="ED7D31" w:themeColor="accent2"/>
                 <w:sz w:val="18"/>
               </w:rPr>
-              <w:t>[CMO no. 63 s.2017]</w:t>
-            </w:r>
+              <w:t>[CMO no. 63 s.2017</w:t>
+            </w:r>
+            <w:proofErr w:type="gramStart"/>
             <w:r>
               <w:rPr>
                 <w:rFonts w:ascii="Arial Narrow" w:hAnsi="Arial Narrow" w:cs="Arial"/>
-                <w:b/>
+                <w:i/>
                 <w:color w:val="ED7D31" w:themeColor="accent2"/>
                 <w:sz w:val="18"/>
               </w:rPr>
-              <w:t xml:space="preserve"> </w:t>
+              <w:t>]</w:t>
             </w:r>
             <w:r>
               <w:rPr>
@@ -4319,15 +4602,32 @@
               <w:rPr>
                 <w:rFonts w:ascii="Arial Narrow" w:hAnsi="Arial Narrow" w:cs="Arial"/>
                 <w:b/>
-              </w:rPr>
-              <w:t>({</w:t>
-            </w:r>
-            <w:proofErr w:type="spellStart"/>
+                <w:color w:val="ED7D31" w:themeColor="accent2"/>
+                <w:sz w:val="18"/>
+              </w:rPr>
+              <w:t xml:space="preserve"> </w:t>
+            </w:r>
             <w:r>
               <w:rPr>
                 <w:rFonts w:ascii="Arial Narrow" w:hAnsi="Arial Narrow" w:cs="Arial"/>
                 <w:b/>
               </w:rPr>
+              <w:t>(</w:t>
+            </w:r>
+            <w:proofErr w:type="gramEnd"/>
+            <w:r>
+              <w:rPr>
+                <w:rFonts w:ascii="Arial Narrow" w:hAnsi="Arial Narrow" w:cs="Arial"/>
+                <w:b/>
+              </w:rPr>
+              <w:t>{</w:t>
+            </w:r>
+            <w:proofErr w:type="spellStart"/>
+            <w:r>
+              <w:rPr>
+                <w:rFonts w:ascii="Arial Narrow" w:hAnsi="Arial Narrow" w:cs="Arial"/>
+                <w:b/>
+              </w:rPr>
               <w:t>reportComplianceYes</w:t>
             </w:r>
             <w:proofErr w:type="spellEnd"/>
@@ -4345,6 +4645,7 @@
               </w:rPr>
               <w:t xml:space="preserve"> </w:t>
             </w:r>
+            <w:proofErr w:type="gramStart"/>
             <w:r>
               <w:rPr>
                 <w:rFonts w:ascii="Arial Narrow" w:hAnsi="Arial Narrow" w:cs="Arial"/>
@@ -4364,7 +4665,15 @@
                 <w:rFonts w:ascii="Arial Narrow" w:hAnsi="Arial Narrow" w:cs="Arial"/>
                 <w:b/>
               </w:rPr>
-              <w:t>({</w:t>
+              <w:t>(</w:t>
+            </w:r>
+            <w:proofErr w:type="gramEnd"/>
+            <w:r>
+              <w:rPr>
+                <w:rFonts w:ascii="Arial Narrow" w:hAnsi="Arial Narrow" w:cs="Arial"/>
+                <w:b/>
+              </w:rPr>
+              <w:t>{</w:t>
             </w:r>
             <w:proofErr w:type="spellStart"/>
             <w:r>
@@ -4557,6 +4866,7 @@
           <w:p>
             <w:pPr>
               <w:spacing w:after="0"/>
+              <w:jc w:val="center"/>
               <w:rPr>
                 <w:rFonts w:ascii="Arial Narrow" w:hAnsi="Arial Narrow"/>
                 <w:b/>
@@ -4593,6 +4903,7 @@
           <w:p>
             <w:pPr>
               <w:spacing w:after="0"/>
+              <w:jc w:val="center"/>
               <w:rPr>
                 <w:rFonts w:ascii="Arial Narrow" w:hAnsi="Arial Narrow"/>
               </w:rPr>
@@ -4638,14 +4949,36 @@
           <w:p>
             <w:pPr>
               <w:spacing w:after="0"/>
-              <w:rPr>
-                <w:rFonts w:ascii="Arial Narrow" w:hAnsi="Arial Narrow"/>
-              </w:rPr>
-            </w:pPr>
-          </w:p>
-          <w:p>
-            <w:pPr>
-              <w:spacing w:after="0"/>
+              <w:jc w:val="center"/>
+              <w:rPr>
+                <w:rFonts w:ascii="Arial Narrow" w:hAnsi="Arial Narrow"/>
+              </w:rPr>
+            </w:pPr>
+            <w:r>
+              <w:rPr>
+                <w:rFonts w:ascii="Arial Narrow" w:hAnsi="Arial Narrow"/>
+              </w:rPr>
+              <w:t>{%</w:t>
+            </w:r>
+            <w:proofErr w:type="spellStart"/>
+            <w:r>
+              <w:rPr>
+                <w:rFonts w:ascii="Arial Narrow" w:hAnsi="Arial Narrow"/>
+              </w:rPr>
+              <w:t>adviserApproval</w:t>
+            </w:r>
+            <w:proofErr w:type="spellEnd"/>
+            <w:r>
+              <w:rPr>
+                <w:rFonts w:ascii="Arial Narrow" w:hAnsi="Arial Narrow"/>
+              </w:rPr>
+              <w:t>}</w:t>
+            </w:r>
+          </w:p>
+          <w:p>
+            <w:pPr>
+              <w:spacing w:after="0"/>
+              <w:jc w:val="center"/>
               <w:rPr>
                 <w:rFonts w:ascii="Arial Narrow" w:hAnsi="Arial Narrow"/>
                 <w:b/>
@@ -4682,6 +5015,7 @@
           <w:p>
             <w:pPr>
               <w:spacing w:after="0"/>
+              <w:jc w:val="center"/>
               <w:rPr>
                 <w:rFonts w:ascii="Arial Narrow" w:hAnsi="Arial Narrow"/>
               </w:rPr>
@@ -4715,22 +5049,55 @@
           <w:p>
             <w:pPr>
               <w:spacing w:after="0"/>
+              <w:jc w:val="center"/>
+              <w:rPr>
+                <w:rFonts w:ascii="Arial Narrow" w:hAnsi="Arial Narrow"/>
+                <w:lang w:val="en-PH"/>
+              </w:rPr>
+            </w:pPr>
+            <w:r>
+              <w:rPr>
+                <w:rFonts w:ascii="Arial Narrow" w:hAnsi="Arial Narrow"/>
+                <w:lang w:val="en-PH"/>
+              </w:rPr>
+              <w:t>{%</w:t>
+            </w:r>
+            <w:proofErr w:type="spellStart"/>
+            <w:r>
+              <w:rPr>
+                <w:rFonts w:ascii="Arial Narrow" w:hAnsi="Arial Narrow"/>
+                <w:lang w:val="en-PH"/>
+              </w:rPr>
+              <w:t>deanApproval</w:t>
+            </w:r>
+            <w:proofErr w:type="spellEnd"/>
+            <w:r>
+              <w:rPr>
+                <w:rFonts w:ascii="Arial Narrow" w:hAnsi="Arial Narrow"/>
+                <w:lang w:val="en-PH"/>
+              </w:rPr>
+              <w:t>}</w:t>
+            </w:r>
+          </w:p>
+          <w:p>
+            <w:pPr>
+              <w:spacing w:after="0"/>
+              <w:jc w:val="center"/>
+              <w:rPr>
+                <w:rFonts w:ascii="Arial Narrow" w:hAnsi="Arial Narrow"/>
+                <w:lang w:val="en-PH"/>
+              </w:rPr>
+            </w:pPr>
+            <w:r>
               <w:rPr>
                 <w:rFonts w:ascii="Arial Narrow" w:hAnsi="Arial Narrow"/>
                 <w:b/>
                 <w:bCs/>
                 <w:lang w:val="en-PH"/>
               </w:rPr>
-            </w:pPr>
-          </w:p>
-          <w:p>
-            <w:pPr>
-              <w:spacing w:after="0"/>
-              <w:rPr>
-                <w:rFonts w:ascii="Arial Narrow" w:hAnsi="Arial Narrow"/>
-                <w:lang w:val="en-PH"/>
-              </w:rPr>
-            </w:pPr>
+              <w:t>{</w:t>
+            </w:r>
+            <w:proofErr w:type="spellStart"/>
             <w:r>
               <w:rPr>
                 <w:rFonts w:ascii="Arial Narrow" w:hAnsi="Arial Narrow"/>
@@ -4738,9 +5105,9 @@
                 <w:bCs/>
                 <w:lang w:val="en-PH"/>
               </w:rPr>
-              <w:t>{</w:t>
-            </w:r>
-            <w:proofErr w:type="spellStart"/>
+              <w:t>deanName</w:t>
+            </w:r>
+            <w:proofErr w:type="spellEnd"/>
             <w:r>
               <w:rPr>
                 <w:rFonts w:ascii="Arial Narrow" w:hAnsi="Arial Narrow"/>
@@ -4748,22 +5115,13 @@
                 <w:bCs/>
                 <w:lang w:val="en-PH"/>
               </w:rPr>
-              <w:t>deanName</w:t>
-            </w:r>
-            <w:proofErr w:type="spellEnd"/>
-            <w:r>
-              <w:rPr>
-                <w:rFonts w:ascii="Arial Narrow" w:hAnsi="Arial Narrow"/>
-                <w:b/>
-                <w:bCs/>
-                <w:lang w:val="en-PH"/>
-              </w:rPr>
               <w:t>}</w:t>
             </w:r>
           </w:p>
           <w:p>
             <w:pPr>
               <w:spacing w:after="0"/>
+              <w:jc w:val="center"/>
               <w:rPr>
                 <w:rFonts w:ascii="Arial Narrow" w:hAnsi="Arial Narrow"/>
               </w:rPr>
@@ -4816,14 +5174,36 @@
           <w:p>
             <w:pPr>
               <w:spacing w:after="0"/>
-              <w:rPr>
-                <w:rFonts w:ascii="Arial Narrow" w:hAnsi="Arial Narrow"/>
-              </w:rPr>
-            </w:pPr>
-          </w:p>
-          <w:p>
-            <w:pPr>
-              <w:spacing w:after="0"/>
+              <w:jc w:val="center"/>
+              <w:rPr>
+                <w:rFonts w:ascii="Arial Narrow" w:hAnsi="Arial Narrow"/>
+              </w:rPr>
+            </w:pPr>
+            <w:r>
+              <w:rPr>
+                <w:rFonts w:ascii="Arial Narrow" w:hAnsi="Arial Narrow"/>
+              </w:rPr>
+              <w:t>{%</w:t>
+            </w:r>
+            <w:proofErr w:type="spellStart"/>
+            <w:r>
+              <w:rPr>
+                <w:rFonts w:ascii="Arial Narrow" w:hAnsi="Arial Narrow"/>
+              </w:rPr>
+              <w:t>sdsApproval</w:t>
+            </w:r>
+            <w:proofErr w:type="spellEnd"/>
+            <w:r>
+              <w:rPr>
+                <w:rFonts w:ascii="Arial Narrow" w:hAnsi="Arial Narrow"/>
+              </w:rPr>
+              <w:t>}</w:t>
+            </w:r>
+          </w:p>
+          <w:p>
+            <w:pPr>
+              <w:spacing w:after="0"/>
+              <w:jc w:val="center"/>
               <w:rPr>
                 <w:rFonts w:ascii="Arial Narrow" w:hAnsi="Arial Narrow"/>
                 <w:b/>
@@ -4856,6 +5236,7 @@
           <w:p>
             <w:pPr>
               <w:spacing w:after="0"/>
+              <w:jc w:val="center"/>
               <w:rPr>
                 <w:rFonts w:ascii="Arial Narrow" w:hAnsi="Arial Narrow"/>
               </w:rPr>
@@ -4895,14 +5276,36 @@
           <w:p>
             <w:pPr>
               <w:spacing w:after="0"/>
-              <w:rPr>
-                <w:rFonts w:ascii="Arial Narrow" w:hAnsi="Arial Narrow"/>
-              </w:rPr>
-            </w:pPr>
-          </w:p>
-          <w:p>
-            <w:pPr>
-              <w:spacing w:after="0"/>
+              <w:jc w:val="center"/>
+              <w:rPr>
+                <w:rFonts w:ascii="Arial Narrow" w:hAnsi="Arial Narrow"/>
+              </w:rPr>
+            </w:pPr>
+            <w:r>
+              <w:rPr>
+                <w:rFonts w:ascii="Arial Narrow" w:hAnsi="Arial Narrow"/>
+              </w:rPr>
+              <w:t>{%</w:t>
+            </w:r>
+            <w:proofErr w:type="spellStart"/>
+            <w:r>
+              <w:rPr>
+                <w:rFonts w:ascii="Arial Narrow" w:hAnsi="Arial Narrow"/>
+              </w:rPr>
+              <w:t>sasApproval</w:t>
+            </w:r>
+            <w:proofErr w:type="spellEnd"/>
+            <w:r>
+              <w:rPr>
+                <w:rFonts w:ascii="Arial Narrow" w:hAnsi="Arial Narrow"/>
+              </w:rPr>
+              <w:t>}</w:t>
+            </w:r>
+          </w:p>
+          <w:p>
+            <w:pPr>
+              <w:spacing w:after="0"/>
+              <w:jc w:val="center"/>
               <w:rPr>
                 <w:rFonts w:ascii="Arial Narrow" w:hAnsi="Arial Narrow"/>
                 <w:b/>
@@ -4935,6 +5338,7 @@
           <w:p>
             <w:pPr>
               <w:spacing w:after="0"/>
+              <w:jc w:val="center"/>
               <w:rPr>
                 <w:rFonts w:ascii="Arial Narrow" w:hAnsi="Arial Narrow"/>
               </w:rPr>
@@ -4980,14 +5384,36 @@
           <w:p>
             <w:pPr>
               <w:spacing w:after="0"/>
-              <w:rPr>
-                <w:rFonts w:ascii="Arial Narrow" w:hAnsi="Arial Narrow"/>
-              </w:rPr>
-            </w:pPr>
-          </w:p>
-          <w:p>
-            <w:pPr>
-              <w:spacing w:after="0"/>
+              <w:jc w:val="center"/>
+              <w:rPr>
+                <w:rFonts w:ascii="Arial Narrow" w:hAnsi="Arial Narrow"/>
+              </w:rPr>
+            </w:pPr>
+            <w:r>
+              <w:rPr>
+                <w:rFonts w:ascii="Arial Narrow" w:hAnsi="Arial Narrow"/>
+              </w:rPr>
+              <w:t>{%</w:t>
+            </w:r>
+            <w:proofErr w:type="spellStart"/>
+            <w:r>
+              <w:rPr>
+                <w:rFonts w:ascii="Arial Narrow" w:hAnsi="Arial Narrow"/>
+              </w:rPr>
+              <w:t>vpaaAsstApproval</w:t>
+            </w:r>
+            <w:proofErr w:type="spellEnd"/>
+            <w:r>
+              <w:rPr>
+                <w:rFonts w:ascii="Arial Narrow" w:hAnsi="Arial Narrow"/>
+              </w:rPr>
+              <w:t>}</w:t>
+            </w:r>
+          </w:p>
+          <w:p>
+            <w:pPr>
+              <w:spacing w:after="0"/>
+              <w:jc w:val="center"/>
               <w:rPr>
                 <w:rFonts w:ascii="Arial Narrow" w:hAnsi="Arial Narrow"/>
                 <w:b/>
@@ -5020,6 +5446,7 @@
           <w:p>
             <w:pPr>
               <w:spacing w:after="0"/>
+              <w:jc w:val="center"/>
               <w:rPr>
                 <w:rFonts w:ascii="Arial Narrow" w:hAnsi="Arial Narrow"/>
               </w:rPr>
@@ -5089,6 +5516,35 @@
               <w:jc w:val="center"/>
               <w:rPr>
                 <w:rFonts w:ascii="Arial Narrow" w:hAnsi="Arial Narrow"/>
+              </w:rPr>
+            </w:pPr>
+            <w:r>
+              <w:rPr>
+                <w:rFonts w:ascii="Arial Narrow" w:hAnsi="Arial Narrow"/>
+              </w:rPr>
+              <w:t>{%</w:t>
+            </w:r>
+            <w:proofErr w:type="spellStart"/>
+            <w:r>
+              <w:rPr>
+                <w:rFonts w:ascii="Arial Narrow" w:hAnsi="Arial Narrow"/>
+              </w:rPr>
+              <w:t>signatoryApproval</w:t>
+            </w:r>
+            <w:proofErr w:type="spellEnd"/>
+            <w:r>
+              <w:rPr>
+                <w:rFonts w:ascii="Arial Narrow" w:hAnsi="Arial Narrow"/>
+              </w:rPr>
+              <w:t>}</w:t>
+            </w:r>
+          </w:p>
+          <w:p>
+            <w:pPr>
+              <w:spacing w:after="0"/>
+              <w:jc w:val="center"/>
+              <w:rPr>
+                <w:rFonts w:ascii="Arial Narrow" w:hAnsi="Arial Narrow"/>
                 <w:b/>
                 <w:bCs/>
               </w:rPr>
@@ -5211,14 +5667,36 @@
           <w:p>
             <w:pPr>
               <w:spacing w:after="0"/>
-              <w:rPr>
-                <w:rFonts w:ascii="Arial Narrow" w:hAnsi="Arial Narrow"/>
-              </w:rPr>
-            </w:pPr>
-          </w:p>
-          <w:p>
-            <w:pPr>
-              <w:spacing w:after="0"/>
+              <w:jc w:val="center"/>
+              <w:rPr>
+                <w:rFonts w:ascii="Arial Narrow" w:hAnsi="Arial Narrow"/>
+              </w:rPr>
+            </w:pPr>
+            <w:r>
+              <w:rPr>
+                <w:rFonts w:ascii="Arial Narrow" w:hAnsi="Arial Narrow"/>
+              </w:rPr>
+              <w:t>{%</w:t>
+            </w:r>
+            <w:proofErr w:type="spellStart"/>
+            <w:r>
+              <w:rPr>
+                <w:rFonts w:ascii="Arial Narrow" w:hAnsi="Arial Narrow"/>
+              </w:rPr>
+              <w:t>presidentApproval</w:t>
+            </w:r>
+            <w:proofErr w:type="spellEnd"/>
+            <w:r>
+              <w:rPr>
+                <w:rFonts w:ascii="Arial Narrow" w:hAnsi="Arial Narrow"/>
+              </w:rPr>
+              <w:t>}</w:t>
+            </w:r>
+          </w:p>
+          <w:p>
+            <w:pPr>
+              <w:spacing w:after="0"/>
+              <w:jc w:val="center"/>
               <w:rPr>
                 <w:rFonts w:ascii="Arial Narrow" w:hAnsi="Arial Narrow"/>
                 <w:b/>
@@ -5251,6 +5729,7 @@
           <w:p>
             <w:pPr>
               <w:spacing w:after="0"/>
+              <w:jc w:val="center"/>
               <w:rPr>
                 <w:rFonts w:ascii="Arial Narrow" w:hAnsi="Arial Narrow"/>
               </w:rPr>
@@ -5278,11 +5757,35 @@
           <w:p>
             <w:pPr>
               <w:spacing w:after="0"/>
-              <w:rPr>
-                <w:rFonts w:ascii="Arial Narrow" w:hAnsi="Arial Narrow"/>
-                <w:b/>
-              </w:rPr>
-            </w:pPr>
+              <w:jc w:val="center"/>
+              <w:rPr>
+                <w:rFonts w:ascii="Arial Narrow" w:hAnsi="Arial Narrow"/>
+                <w:bCs/>
+              </w:rPr>
+            </w:pPr>
+            <w:r>
+              <w:rPr>
+                <w:rFonts w:ascii="Arial Narrow" w:hAnsi="Arial Narrow"/>
+                <w:bCs/>
+              </w:rPr>
+              <w:t>{%</w:t>
+            </w:r>
+            <w:proofErr w:type="spellStart"/>
+            <w:r>
+              <w:rPr>
+                <w:rFonts w:ascii="Arial Narrow" w:hAnsi="Arial Narrow"/>
+                <w:bCs/>
+              </w:rPr>
+              <w:t>vpaaAprroval</w:t>
+            </w:r>
+            <w:proofErr w:type="spellEnd"/>
+            <w:r>
+              <w:rPr>
+                <w:rFonts w:ascii="Arial Narrow" w:hAnsi="Arial Narrow"/>
+                <w:bCs/>
+              </w:rPr>
+              <w:t>}</w:t>
+            </w:r>
           </w:p>
           <w:p>
             <w:pPr>

</xml_diff>

<commit_message>
feat(SAPF): update approval section formatting in student activity proposal template
</commit_message>
<xml_diff>
--- a/public/templates/student-activity-proposal-form-v2.docx
+++ b/public/templates/student-activity-proposal-form-v2.docx
@@ -211,7 +211,7 @@
           <w:szCs w:val="28"/>
         </w:rPr>
         <w:drawing>
-          <wp:anchor distT="0" distB="0" distL="114300" distR="114300" simplePos="0" relativeHeight="251665408" behindDoc="0" locked="0" layoutInCell="1" allowOverlap="1" wp14:anchorId="4D66C737" wp14:editId="053BE956">
+          <wp:anchor distT="0" distB="0" distL="114300" distR="114300" simplePos="0" relativeHeight="251665408" behindDoc="0" locked="0" layoutInCell="1" allowOverlap="1" wp14:anchorId="4D66C737" wp14:editId="3530755E">
             <wp:simplePos x="0" y="0"/>
             <wp:positionH relativeFrom="column">
               <wp:posOffset>190004</wp:posOffset>
@@ -276,7 +276,7 @@
           <w:szCs w:val="28"/>
         </w:rPr>
         <w:drawing>
-          <wp:anchor distT="0" distB="0" distL="114300" distR="114300" simplePos="0" relativeHeight="251659264" behindDoc="0" locked="0" layoutInCell="1" allowOverlap="1" wp14:anchorId="31EB85D4" wp14:editId="7F053129">
+          <wp:anchor distT="0" distB="0" distL="114300" distR="114300" simplePos="0" relativeHeight="251659264" behindDoc="0" locked="0" layoutInCell="1" allowOverlap="1" wp14:anchorId="31EB85D4" wp14:editId="6C3E82E5">
             <wp:simplePos x="0" y="0"/>
             <wp:positionH relativeFrom="column">
               <wp:posOffset>-474914</wp:posOffset>
@@ -575,21 +575,7 @@
               <w:rPr>
                 <w:rFonts w:ascii="Arial Narrow" w:hAnsi="Arial Narrow"/>
               </w:rPr>
-              <w:t xml:space="preserve">}) </w:t>
-            </w:r>
-            <w:proofErr w:type="gramStart"/>
-            <w:r>
-              <w:rPr>
-                <w:rFonts w:ascii="Arial Narrow" w:hAnsi="Arial Narrow"/>
-              </w:rPr>
-              <w:t>College  (</w:t>
-            </w:r>
-            <w:proofErr w:type="gramEnd"/>
-            <w:r>
-              <w:rPr>
-                <w:rFonts w:ascii="Arial Narrow" w:hAnsi="Arial Narrow"/>
-              </w:rPr>
-              <w:t>{</w:t>
+              <w:t>}) College  ({</w:t>
             </w:r>
             <w:proofErr w:type="spellStart"/>
             <w:r>
@@ -603,21 +589,7 @@
               <w:rPr>
                 <w:rFonts w:ascii="Arial Narrow" w:hAnsi="Arial Narrow"/>
               </w:rPr>
-              <w:t xml:space="preserve">}) Alternative </w:t>
-            </w:r>
-            <w:proofErr w:type="gramStart"/>
-            <w:r>
-              <w:rPr>
-                <w:rFonts w:ascii="Arial Narrow" w:hAnsi="Arial Narrow"/>
-              </w:rPr>
-              <w:t>Education  (</w:t>
-            </w:r>
-            <w:proofErr w:type="gramEnd"/>
-            <w:r>
-              <w:rPr>
-                <w:rFonts w:ascii="Arial Narrow" w:hAnsi="Arial Narrow"/>
-              </w:rPr>
-              <w:t>{</w:t>
+              <w:t>}) Alternative Education  ({</w:t>
             </w:r>
             <w:proofErr w:type="spellStart"/>
             <w:r>
@@ -631,21 +603,7 @@
               <w:rPr>
                 <w:rFonts w:ascii="Arial Narrow" w:hAnsi="Arial Narrow"/>
               </w:rPr>
-              <w:t xml:space="preserve">}) Graduate </w:t>
-            </w:r>
-            <w:proofErr w:type="gramStart"/>
-            <w:r>
-              <w:rPr>
-                <w:rFonts w:ascii="Arial Narrow" w:hAnsi="Arial Narrow"/>
-              </w:rPr>
-              <w:t>Studies  (</w:t>
-            </w:r>
-            <w:proofErr w:type="gramEnd"/>
-            <w:r>
-              <w:rPr>
-                <w:rFonts w:ascii="Arial Narrow" w:hAnsi="Arial Narrow"/>
-              </w:rPr>
-              <w:t>{</w:t>
+              <w:t>}) Graduate Studies  ({</w:t>
             </w:r>
             <w:proofErr w:type="spellStart"/>
             <w:r>
@@ -659,21 +617,7 @@
               <w:rPr>
                 <w:rFonts w:ascii="Arial Narrow" w:hAnsi="Arial Narrow"/>
               </w:rPr>
-              <w:t xml:space="preserve">}) Extensions </w:t>
-            </w:r>
-            <w:proofErr w:type="gramStart"/>
-            <w:r>
-              <w:rPr>
-                <w:rFonts w:ascii="Arial Narrow" w:hAnsi="Arial Narrow"/>
-              </w:rPr>
-              <w:t>Office  (</w:t>
-            </w:r>
-            <w:proofErr w:type="gramEnd"/>
-            <w:r>
-              <w:rPr>
-                <w:rFonts w:ascii="Arial Narrow" w:hAnsi="Arial Narrow"/>
-              </w:rPr>
-              <w:t>{</w:t>
+              <w:t>}) Extensions Office  ({</w:t>
             </w:r>
             <w:proofErr w:type="spellStart"/>
             <w:r>
@@ -1480,21 +1424,7 @@
               <w:rPr>
                 <w:rFonts w:ascii="Arial Narrow" w:hAnsi="Arial Narrow"/>
               </w:rPr>
-              <w:t xml:space="preserve">}) Online     </w:t>
-            </w:r>
-            <w:proofErr w:type="gramStart"/>
-            <w:r>
-              <w:rPr>
-                <w:rFonts w:ascii="Arial Narrow" w:hAnsi="Arial Narrow"/>
-              </w:rPr>
-              <w:t xml:space="preserve">   (</w:t>
-            </w:r>
-            <w:proofErr w:type="gramEnd"/>
-            <w:r>
-              <w:rPr>
-                <w:rFonts w:ascii="Arial Narrow" w:hAnsi="Arial Narrow"/>
-              </w:rPr>
-              <w:t>{</w:t>
+              <w:t>}) Online        ({</w:t>
             </w:r>
             <w:proofErr w:type="spellStart"/>
             <w:r>
@@ -1905,21 +1835,7 @@
               <w:rPr>
                 <w:rFonts w:ascii="Arial Narrow" w:hAnsi="Arial Narrow"/>
               </w:rPr>
-              <w:t>}) Co-Curricular</w:t>
-            </w:r>
-            <w:proofErr w:type="gramStart"/>
-            <w:r>
-              <w:rPr>
-                <w:rFonts w:ascii="Arial Narrow" w:hAnsi="Arial Narrow"/>
-              </w:rPr>
-              <w:t xml:space="preserve">   (</w:t>
-            </w:r>
-            <w:proofErr w:type="gramEnd"/>
-            <w:r>
-              <w:rPr>
-                <w:rFonts w:ascii="Arial Narrow" w:hAnsi="Arial Narrow"/>
-              </w:rPr>
-              <w:t>{</w:t>
+              <w:t>}) Co-Curricular   ({</w:t>
             </w:r>
             <w:proofErr w:type="spellStart"/>
             <w:r>
@@ -2039,21 +1955,7 @@
               <w:rPr>
                 <w:rFonts w:ascii="Arial Narrow" w:hAnsi="Arial Narrow"/>
               </w:rPr>
-              <w:t xml:space="preserve">}) Organizational  </w:t>
-            </w:r>
-            <w:proofErr w:type="gramStart"/>
-            <w:r>
-              <w:rPr>
-                <w:rFonts w:ascii="Arial Narrow" w:hAnsi="Arial Narrow"/>
-              </w:rPr>
-              <w:t xml:space="preserve">   (</w:t>
-            </w:r>
-            <w:proofErr w:type="gramEnd"/>
-            <w:r>
-              <w:rPr>
-                <w:rFonts w:ascii="Arial Narrow" w:hAnsi="Arial Narrow"/>
-              </w:rPr>
-              <w:t>{</w:t>
+              <w:t>}) Organizational     ({</w:t>
             </w:r>
             <w:proofErr w:type="spellStart"/>
             <w:r>
@@ -2082,21 +1984,7 @@
               <w:rPr>
                 <w:rFonts w:ascii="Arial Narrow" w:hAnsi="Arial Narrow"/>
               </w:rPr>
-              <w:t xml:space="preserve"> Institutional  </w:t>
-            </w:r>
-            <w:proofErr w:type="gramStart"/>
-            <w:r>
-              <w:rPr>
-                <w:rFonts w:ascii="Arial Narrow" w:hAnsi="Arial Narrow"/>
-              </w:rPr>
-              <w:t xml:space="preserve">   (</w:t>
-            </w:r>
-            <w:proofErr w:type="gramEnd"/>
-            <w:r>
-              <w:rPr>
-                <w:rFonts w:ascii="Arial Narrow" w:hAnsi="Arial Narrow"/>
-              </w:rPr>
-              <w:t>{</w:t>
+              <w:t xml:space="preserve"> Institutional     ({</w:t>
             </w:r>
             <w:proofErr w:type="spellStart"/>
             <w:r>
@@ -2110,21 +1998,7 @@
               <w:rPr>
                 <w:rFonts w:ascii="Arial Narrow" w:hAnsi="Arial Narrow"/>
               </w:rPr>
-              <w:t xml:space="preserve">}) Regional  </w:t>
-            </w:r>
-            <w:proofErr w:type="gramStart"/>
-            <w:r>
-              <w:rPr>
-                <w:rFonts w:ascii="Arial Narrow" w:hAnsi="Arial Narrow"/>
-              </w:rPr>
-              <w:t xml:space="preserve">   (</w:t>
-            </w:r>
-            <w:proofErr w:type="gramEnd"/>
-            <w:r>
-              <w:rPr>
-                <w:rFonts w:ascii="Arial Narrow" w:hAnsi="Arial Narrow"/>
-              </w:rPr>
-              <w:t>{</w:t>
+              <w:t>}) Regional     ({</w:t>
             </w:r>
             <w:proofErr w:type="spellStart"/>
             <w:r>
@@ -2256,21 +2130,7 @@
               <w:rPr>
                 <w:rFonts w:ascii="Arial Narrow" w:hAnsi="Arial Narrow"/>
               </w:rPr>
-              <w:t xml:space="preserve">}) Team Building  </w:t>
-            </w:r>
-            <w:proofErr w:type="gramStart"/>
-            <w:r>
-              <w:rPr>
-                <w:rFonts w:ascii="Arial Narrow" w:hAnsi="Arial Narrow"/>
-              </w:rPr>
-              <w:t xml:space="preserve">   (</w:t>
-            </w:r>
-            <w:proofErr w:type="gramEnd"/>
-            <w:r>
-              <w:rPr>
-                <w:rFonts w:ascii="Arial Narrow" w:hAnsi="Arial Narrow"/>
-              </w:rPr>
-              <w:t>{</w:t>
+              <w:t>}) Team Building     ({</w:t>
             </w:r>
             <w:proofErr w:type="spellStart"/>
             <w:r>
@@ -2284,21 +2144,7 @@
               <w:rPr>
                 <w:rFonts w:ascii="Arial Narrow" w:hAnsi="Arial Narrow"/>
               </w:rPr>
-              <w:t xml:space="preserve">}) Leadership Summit  </w:t>
-            </w:r>
-            <w:proofErr w:type="gramStart"/>
-            <w:r>
-              <w:rPr>
-                <w:rFonts w:ascii="Arial Narrow" w:hAnsi="Arial Narrow"/>
-              </w:rPr>
-              <w:t xml:space="preserve">   (</w:t>
-            </w:r>
-            <w:proofErr w:type="gramEnd"/>
-            <w:r>
-              <w:rPr>
-                <w:rFonts w:ascii="Arial Narrow" w:hAnsi="Arial Narrow"/>
-              </w:rPr>
-              <w:t>{</w:t>
+              <w:t>}) Leadership Summit     ({</w:t>
             </w:r>
             <w:proofErr w:type="spellStart"/>
             <w:r>
@@ -2312,21 +2158,7 @@
               <w:rPr>
                 <w:rFonts w:ascii="Arial Narrow" w:hAnsi="Arial Narrow"/>
               </w:rPr>
-              <w:t xml:space="preserve">}) General Assembly  </w:t>
-            </w:r>
-            <w:proofErr w:type="gramStart"/>
-            <w:r>
-              <w:rPr>
-                <w:rFonts w:ascii="Arial Narrow" w:hAnsi="Arial Narrow"/>
-              </w:rPr>
-              <w:t xml:space="preserve">   (</w:t>
-            </w:r>
-            <w:proofErr w:type="gramEnd"/>
-            <w:r>
-              <w:rPr>
-                <w:rFonts w:ascii="Arial Narrow" w:hAnsi="Arial Narrow"/>
-              </w:rPr>
-              <w:t>{</w:t>
+              <w:t>}) General Assembly     ({</w:t>
             </w:r>
             <w:proofErr w:type="spellStart"/>
             <w:r>
@@ -2355,21 +2187,7 @@
               <w:rPr>
                 <w:rFonts w:ascii="Arial Narrow" w:hAnsi="Arial Narrow"/>
               </w:rPr>
-              <w:t xml:space="preserve">Competition  </w:t>
-            </w:r>
-            <w:proofErr w:type="gramStart"/>
-            <w:r>
-              <w:rPr>
-                <w:rFonts w:ascii="Arial Narrow" w:hAnsi="Arial Narrow"/>
-              </w:rPr>
-              <w:t xml:space="preserve">   (</w:t>
-            </w:r>
-            <w:proofErr w:type="gramEnd"/>
-            <w:r>
-              <w:rPr>
-                <w:rFonts w:ascii="Arial Narrow" w:hAnsi="Arial Narrow"/>
-              </w:rPr>
-              <w:t>{</w:t>
+              <w:t>Competition     ({</w:t>
             </w:r>
             <w:proofErr w:type="spellStart"/>
             <w:r>
@@ -2383,21 +2201,7 @@
               <w:rPr>
                 <w:rFonts w:ascii="Arial Narrow" w:hAnsi="Arial Narrow"/>
               </w:rPr>
-              <w:t xml:space="preserve">}) Press Conference  </w:t>
-            </w:r>
-            <w:proofErr w:type="gramStart"/>
-            <w:r>
-              <w:rPr>
-                <w:rFonts w:ascii="Arial Narrow" w:hAnsi="Arial Narrow"/>
-              </w:rPr>
-              <w:t xml:space="preserve">   (</w:t>
-            </w:r>
-            <w:proofErr w:type="gramEnd"/>
-            <w:r>
-              <w:rPr>
-                <w:rFonts w:ascii="Arial Narrow" w:hAnsi="Arial Narrow"/>
-              </w:rPr>
-              <w:t>{</w:t>
+              <w:t>}) Press Conference     ({</w:t>
             </w:r>
             <w:proofErr w:type="spellStart"/>
             <w:r>
@@ -2592,21 +2396,7 @@
               <w:rPr>
                 <w:rFonts w:ascii="Arial Narrow" w:hAnsi="Arial Narrow"/>
               </w:rPr>
-              <w:t xml:space="preserve">}) </w:t>
-            </w:r>
-            <w:proofErr w:type="gramStart"/>
-            <w:r>
-              <w:rPr>
-                <w:rFonts w:ascii="Arial Narrow" w:hAnsi="Arial Narrow"/>
-              </w:rPr>
-              <w:t>Courage  (</w:t>
-            </w:r>
-            <w:proofErr w:type="gramEnd"/>
-            <w:r>
-              <w:rPr>
-                <w:rFonts w:ascii="Arial Narrow" w:hAnsi="Arial Narrow"/>
-              </w:rPr>
-              <w:t>{</w:t>
+              <w:t>}) Courage  ({</w:t>
             </w:r>
             <w:proofErr w:type="spellStart"/>
             <w:r>
@@ -2620,21 +2410,7 @@
               <w:rPr>
                 <w:rFonts w:ascii="Arial Narrow" w:hAnsi="Arial Narrow"/>
               </w:rPr>
-              <w:t xml:space="preserve">}) </w:t>
-            </w:r>
-            <w:proofErr w:type="gramStart"/>
-            <w:r>
-              <w:rPr>
-                <w:rFonts w:ascii="Arial Narrow" w:hAnsi="Arial Narrow"/>
-              </w:rPr>
-              <w:t>Compassion  (</w:t>
-            </w:r>
-            <w:proofErr w:type="gramEnd"/>
-            <w:r>
-              <w:rPr>
-                <w:rFonts w:ascii="Arial Narrow" w:hAnsi="Arial Narrow"/>
-              </w:rPr>
-              <w:t>{</w:t>
+              <w:t>}) Compassion  ({</w:t>
             </w:r>
             <w:proofErr w:type="spellStart"/>
             <w:r>
@@ -2648,21 +2424,7 @@
               <w:rPr>
                 <w:rFonts w:ascii="Arial Narrow" w:hAnsi="Arial Narrow"/>
               </w:rPr>
-              <w:t>}) Community-</w:t>
-            </w:r>
-            <w:proofErr w:type="gramStart"/>
-            <w:r>
-              <w:rPr>
-                <w:rFonts w:ascii="Arial Narrow" w:hAnsi="Arial Narrow"/>
-              </w:rPr>
-              <w:t>Oriented  (</w:t>
-            </w:r>
-            <w:proofErr w:type="gramEnd"/>
-            <w:r>
-              <w:rPr>
-                <w:rFonts w:ascii="Arial Narrow" w:hAnsi="Arial Narrow"/>
-              </w:rPr>
-              <w:t>{</w:t>
+              <w:t>}) Community-Oriented  ({</w:t>
             </w:r>
             <w:proofErr w:type="spellStart"/>
             <w:r>
@@ -2676,21 +2438,7 @@
               <w:rPr>
                 <w:rFonts w:ascii="Arial Narrow" w:hAnsi="Arial Narrow"/>
               </w:rPr>
-              <w:t xml:space="preserve">}) </w:t>
-            </w:r>
-            <w:proofErr w:type="gramStart"/>
-            <w:r>
-              <w:rPr>
-                <w:rFonts w:ascii="Arial Narrow" w:hAnsi="Arial Narrow"/>
-              </w:rPr>
-              <w:t>Humility  (</w:t>
-            </w:r>
-            <w:proofErr w:type="gramEnd"/>
-            <w:r>
-              <w:rPr>
-                <w:rFonts w:ascii="Arial Narrow" w:hAnsi="Arial Narrow"/>
-              </w:rPr>
-              <w:t>{</w:t>
+              <w:t>}) Humility  ({</w:t>
             </w:r>
             <w:proofErr w:type="spellStart"/>
             <w:r>
@@ -2704,21 +2452,7 @@
               <w:rPr>
                 <w:rFonts w:ascii="Arial Narrow" w:hAnsi="Arial Narrow"/>
               </w:rPr>
-              <w:t xml:space="preserve">}) </w:t>
-            </w:r>
-            <w:proofErr w:type="gramStart"/>
-            <w:r>
-              <w:rPr>
-                <w:rFonts w:ascii="Arial Narrow" w:hAnsi="Arial Narrow"/>
-              </w:rPr>
-              <w:t>Interiority  (</w:t>
-            </w:r>
-            <w:proofErr w:type="gramEnd"/>
-            <w:r>
-              <w:rPr>
-                <w:rFonts w:ascii="Arial Narrow" w:hAnsi="Arial Narrow"/>
-              </w:rPr>
-              <w:t>{</w:t>
+              <w:t>}) Interiority  ({</w:t>
             </w:r>
             <w:proofErr w:type="spellStart"/>
             <w:r>
@@ -4498,30 +4232,14 @@
                 <w:rFonts w:ascii="Arial Narrow" w:hAnsi="Arial Narrow" w:cs="Arial"/>
                 <w:b/>
               </w:rPr>
-              <w:t xml:space="preserve"> </w:t>
-            </w:r>
-            <w:proofErr w:type="gramStart"/>
+              <w:t xml:space="preserve"> Yes  </w:t>
+            </w:r>
             <w:r>
               <w:rPr>
                 <w:rFonts w:ascii="Arial Narrow" w:hAnsi="Arial Narrow" w:cs="Arial"/>
                 <w:b/>
               </w:rPr>
-              <w:t xml:space="preserve">Yes  </w:t>
-            </w:r>
-            <w:r>
-              <w:rPr>
-                <w:rFonts w:ascii="Arial Narrow" w:hAnsi="Arial Narrow" w:cs="Arial"/>
-                <w:b/>
-              </w:rPr>
-              <w:t>(</w:t>
-            </w:r>
-            <w:proofErr w:type="gramEnd"/>
-            <w:r>
-              <w:rPr>
-                <w:rFonts w:ascii="Arial Narrow" w:hAnsi="Arial Narrow" w:cs="Arial"/>
-                <w:b/>
-              </w:rPr>
-              <w:t>{</w:t>
+              <w:t>({</w:t>
             </w:r>
             <w:proofErr w:type="spellStart"/>
             <w:r>
@@ -4577,17 +4295,16 @@
                 <w:color w:val="ED7D31" w:themeColor="accent2"/>
                 <w:sz w:val="18"/>
               </w:rPr>
-              <w:t>[CMO no. 63 s.2017</w:t>
-            </w:r>
-            <w:proofErr w:type="gramStart"/>
+              <w:t>[CMO no. 63 s.2017]</w:t>
+            </w:r>
             <w:r>
               <w:rPr>
                 <w:rFonts w:ascii="Arial Narrow" w:hAnsi="Arial Narrow" w:cs="Arial"/>
-                <w:i/>
+                <w:b/>
                 <w:color w:val="ED7D31" w:themeColor="accent2"/>
                 <w:sz w:val="18"/>
               </w:rPr>
-              <w:t>]</w:t>
+              <w:t xml:space="preserve"> </w:t>
             </w:r>
             <w:r>
               <w:rPr>
@@ -4602,8 +4319,29 @@
               <w:rPr>
                 <w:rFonts w:ascii="Arial Narrow" w:hAnsi="Arial Narrow" w:cs="Arial"/>
                 <w:b/>
-                <w:color w:val="ED7D31" w:themeColor="accent2"/>
-                <w:sz w:val="18"/>
+              </w:rPr>
+              <w:t>({</w:t>
+            </w:r>
+            <w:proofErr w:type="spellStart"/>
+            <w:r>
+              <w:rPr>
+                <w:rFonts w:ascii="Arial Narrow" w:hAnsi="Arial Narrow" w:cs="Arial"/>
+                <w:b/>
+              </w:rPr>
+              <w:t>reportComplianceYes</w:t>
+            </w:r>
+            <w:proofErr w:type="spellEnd"/>
+            <w:r>
+              <w:rPr>
+                <w:rFonts w:ascii="Arial Narrow" w:hAnsi="Arial Narrow" w:cs="Arial"/>
+                <w:b/>
+              </w:rPr>
+              <w:t>})</w:t>
+            </w:r>
+            <w:r>
+              <w:rPr>
+                <w:rFonts w:ascii="Arial Narrow" w:hAnsi="Arial Narrow" w:cs="Arial"/>
+                <w:b/>
               </w:rPr>
               <w:t xml:space="preserve"> </w:t>
             </w:r>
@@ -4612,68 +4350,21 @@
                 <w:rFonts w:ascii="Arial Narrow" w:hAnsi="Arial Narrow" w:cs="Arial"/>
                 <w:b/>
               </w:rPr>
-              <w:t>(</w:t>
-            </w:r>
-            <w:proofErr w:type="gramEnd"/>
+              <w:t xml:space="preserve">Yes </w:t>
+            </w:r>
             <w:r>
               <w:rPr>
                 <w:rFonts w:ascii="Arial Narrow" w:hAnsi="Arial Narrow" w:cs="Arial"/>
                 <w:b/>
               </w:rPr>
-              <w:t>{</w:t>
-            </w:r>
-            <w:proofErr w:type="spellStart"/>
+              <w:t xml:space="preserve"> </w:t>
+            </w:r>
             <w:r>
               <w:rPr>
                 <w:rFonts w:ascii="Arial Narrow" w:hAnsi="Arial Narrow" w:cs="Arial"/>
                 <w:b/>
               </w:rPr>
-              <w:t>reportComplianceYes</w:t>
-            </w:r>
-            <w:proofErr w:type="spellEnd"/>
-            <w:r>
-              <w:rPr>
-                <w:rFonts w:ascii="Arial Narrow" w:hAnsi="Arial Narrow" w:cs="Arial"/>
-                <w:b/>
-              </w:rPr>
-              <w:t>})</w:t>
-            </w:r>
-            <w:r>
-              <w:rPr>
-                <w:rFonts w:ascii="Arial Narrow" w:hAnsi="Arial Narrow" w:cs="Arial"/>
-                <w:b/>
-              </w:rPr>
-              <w:t xml:space="preserve"> </w:t>
-            </w:r>
-            <w:proofErr w:type="gramStart"/>
-            <w:r>
-              <w:rPr>
-                <w:rFonts w:ascii="Arial Narrow" w:hAnsi="Arial Narrow" w:cs="Arial"/>
-                <w:b/>
-              </w:rPr>
-              <w:t xml:space="preserve">Yes </w:t>
-            </w:r>
-            <w:r>
-              <w:rPr>
-                <w:rFonts w:ascii="Arial Narrow" w:hAnsi="Arial Narrow" w:cs="Arial"/>
-                <w:b/>
-              </w:rPr>
-              <w:t xml:space="preserve"> </w:t>
-            </w:r>
-            <w:r>
-              <w:rPr>
-                <w:rFonts w:ascii="Arial Narrow" w:hAnsi="Arial Narrow" w:cs="Arial"/>
-                <w:b/>
-              </w:rPr>
-              <w:t>(</w:t>
-            </w:r>
-            <w:proofErr w:type="gramEnd"/>
-            <w:r>
-              <w:rPr>
-                <w:rFonts w:ascii="Arial Narrow" w:hAnsi="Arial Narrow" w:cs="Arial"/>
-                <w:b/>
-              </w:rPr>
-              <w:t>{</w:t>
+              <w:t>({</w:t>
             </w:r>
             <w:proofErr w:type="spellStart"/>
             <w:r>
@@ -4949,9 +4640,19 @@
           <w:p>
             <w:pPr>
               <w:spacing w:after="0"/>
+              <w:rPr>
+                <w:rFonts w:ascii="Arial Narrow" w:hAnsi="Arial Narrow"/>
+              </w:rPr>
+            </w:pPr>
+          </w:p>
+          <w:p>
+            <w:pPr>
+              <w:spacing w:after="0"/>
               <w:jc w:val="center"/>
               <w:rPr>
                 <w:rFonts w:ascii="Arial Narrow" w:hAnsi="Arial Narrow"/>
+                <w:b/>
+                <w:bCs/>
               </w:rPr>
             </w:pPr>
             <w:r>
@@ -4974,6 +4675,32 @@
               </w:rPr>
               <w:t>}</w:t>
             </w:r>
+            <w:r>
+              <w:rPr>
+                <w:rFonts w:ascii="Arial Narrow" w:hAnsi="Arial Narrow"/>
+                <w:b/>
+                <w:bCs/>
+              </w:rPr>
+              <w:t>{</w:t>
+            </w:r>
+            <w:proofErr w:type="spellStart"/>
+            <w:r>
+              <w:rPr>
+                <w:rFonts w:ascii="Arial Narrow" w:hAnsi="Arial Narrow"/>
+                <w:b/>
+                <w:bCs/>
+              </w:rPr>
+              <w:t>adviserName</w:t>
+            </w:r>
+            <w:proofErr w:type="spellEnd"/>
+            <w:r>
+              <w:rPr>
+                <w:rFonts w:ascii="Arial Narrow" w:hAnsi="Arial Narrow"/>
+                <w:b/>
+                <w:bCs/>
+              </w:rPr>
+              <w:t>}</w:t>
+            </w:r>
           </w:p>
           <w:p>
             <w:pPr>
@@ -4981,113 +4708,74 @@
               <w:jc w:val="center"/>
               <w:rPr>
                 <w:rFonts w:ascii="Arial Narrow" w:hAnsi="Arial Narrow"/>
-                <w:b/>
-                <w:bCs/>
-              </w:rPr>
-            </w:pPr>
-            <w:r>
-              <w:rPr>
-                <w:rFonts w:ascii="Arial Narrow" w:hAnsi="Arial Narrow"/>
-                <w:b/>
-                <w:bCs/>
-              </w:rPr>
-              <w:t>{</w:t>
-            </w:r>
-            <w:proofErr w:type="spellStart"/>
-            <w:r>
-              <w:rPr>
-                <w:rFonts w:ascii="Arial Narrow" w:hAnsi="Arial Narrow"/>
-                <w:b/>
-                <w:bCs/>
-              </w:rPr>
-              <w:t>adviserName</w:t>
-            </w:r>
-            <w:proofErr w:type="spellEnd"/>
-            <w:r>
-              <w:rPr>
-                <w:rFonts w:ascii="Arial Narrow" w:hAnsi="Arial Narrow"/>
-                <w:b/>
-                <w:bCs/>
+              </w:rPr>
+            </w:pPr>
+            <w:r>
+              <w:rPr>
+                <w:rFonts w:ascii="Arial Narrow" w:hAnsi="Arial Narrow"/>
+              </w:rPr>
+              <w:t>Organization Adviser</w:t>
+            </w:r>
+          </w:p>
+        </w:tc>
+        <w:tc>
+          <w:tcPr>
+            <w:tcW w:w="3119" w:type="dxa"/>
+          </w:tcPr>
+          <w:p>
+            <w:pPr>
+              <w:spacing w:after="0"/>
+              <w:rPr>
+                <w:rFonts w:ascii="Arial Narrow" w:hAnsi="Arial Narrow"/>
+              </w:rPr>
+            </w:pPr>
+            <w:r>
+              <w:rPr>
+                <w:rFonts w:ascii="Arial Narrow" w:hAnsi="Arial Narrow"/>
+              </w:rPr>
+              <w:t>Reviewed by:</w:t>
+            </w:r>
+          </w:p>
+          <w:p>
+            <w:pPr>
+              <w:spacing w:after="0"/>
+              <w:rPr>
+                <w:rFonts w:ascii="Arial Narrow" w:hAnsi="Arial Narrow"/>
+              </w:rPr>
+            </w:pPr>
+          </w:p>
+          <w:p>
+            <w:pPr>
+              <w:spacing w:after="0"/>
+              <w:jc w:val="center"/>
+              <w:rPr>
+                <w:rFonts w:ascii="Arial Narrow" w:hAnsi="Arial Narrow"/>
+                <w:lang w:val="en-PH"/>
+              </w:rPr>
+            </w:pPr>
+            <w:r>
+              <w:rPr>
+                <w:rFonts w:ascii="Arial Narrow" w:hAnsi="Arial Narrow"/>
+                <w:lang w:val="en-PH"/>
+              </w:rPr>
+              <w:t>{%</w:t>
+            </w:r>
+            <w:proofErr w:type="spellStart"/>
+            <w:r>
+              <w:rPr>
+                <w:rFonts w:ascii="Arial Narrow" w:hAnsi="Arial Narrow"/>
+                <w:lang w:val="en-PH"/>
+              </w:rPr>
+              <w:t>deanApproval</w:t>
+            </w:r>
+            <w:proofErr w:type="spellEnd"/>
+            <w:r>
+              <w:rPr>
+                <w:rFonts w:ascii="Arial Narrow" w:hAnsi="Arial Narrow"/>
+                <w:lang w:val="en-PH"/>
               </w:rPr>
               <w:t>}</w:t>
             </w:r>
-          </w:p>
-          <w:p>
-            <w:pPr>
-              <w:spacing w:after="0"/>
-              <w:jc w:val="center"/>
-              <w:rPr>
-                <w:rFonts w:ascii="Arial Narrow" w:hAnsi="Arial Narrow"/>
-              </w:rPr>
-            </w:pPr>
-            <w:r>
-              <w:rPr>
-                <w:rFonts w:ascii="Arial Narrow" w:hAnsi="Arial Narrow"/>
-              </w:rPr>
-              <w:t>Organization Adviser</w:t>
-            </w:r>
-          </w:p>
-        </w:tc>
-        <w:tc>
-          <w:tcPr>
-            <w:tcW w:w="3119" w:type="dxa"/>
-          </w:tcPr>
-          <w:p>
-            <w:pPr>
-              <w:spacing w:after="0"/>
-              <w:rPr>
-                <w:rFonts w:ascii="Arial Narrow" w:hAnsi="Arial Narrow"/>
-              </w:rPr>
-            </w:pPr>
-            <w:r>
-              <w:rPr>
-                <w:rFonts w:ascii="Arial Narrow" w:hAnsi="Arial Narrow"/>
-              </w:rPr>
-              <w:t>Reviewed by:</w:t>
-            </w:r>
-          </w:p>
-          <w:p>
-            <w:pPr>
-              <w:spacing w:after="0"/>
-              <w:jc w:val="center"/>
-              <w:rPr>
-                <w:rFonts w:ascii="Arial Narrow" w:hAnsi="Arial Narrow"/>
-                <w:lang w:val="en-PH"/>
-              </w:rPr>
-            </w:pPr>
-            <w:r>
-              <w:rPr>
-                <w:rFonts w:ascii="Arial Narrow" w:hAnsi="Arial Narrow"/>
-                <w:lang w:val="en-PH"/>
-              </w:rPr>
-              <w:t>{%</w:t>
-            </w:r>
-            <w:proofErr w:type="spellStart"/>
-            <w:r>
-              <w:rPr>
-                <w:rFonts w:ascii="Arial Narrow" w:hAnsi="Arial Narrow"/>
-                <w:lang w:val="en-PH"/>
-              </w:rPr>
-              <w:t>deanApproval</w:t>
-            </w:r>
-            <w:proofErr w:type="spellEnd"/>
-            <w:r>
-              <w:rPr>
-                <w:rFonts w:ascii="Arial Narrow" w:hAnsi="Arial Narrow"/>
-                <w:lang w:val="en-PH"/>
-              </w:rPr>
-              <w:t>}</w:t>
-            </w:r>
-          </w:p>
-          <w:p>
-            <w:pPr>
-              <w:spacing w:after="0"/>
-              <w:jc w:val="center"/>
-              <w:rPr>
-                <w:rFonts w:ascii="Arial Narrow" w:hAnsi="Arial Narrow"/>
-                <w:lang w:val="en-PH"/>
-              </w:rPr>
-            </w:pPr>
             <w:r>
               <w:rPr>
                 <w:rFonts w:ascii="Arial Narrow" w:hAnsi="Arial Narrow"/>
@@ -5174,9 +4862,18 @@
           <w:p>
             <w:pPr>
               <w:spacing w:after="0"/>
+              <w:rPr>
+                <w:rFonts w:ascii="Arial Narrow" w:hAnsi="Arial Narrow"/>
+              </w:rPr>
+            </w:pPr>
+          </w:p>
+          <w:p>
+            <w:pPr>
+              <w:spacing w:after="0"/>
               <w:jc w:val="center"/>
               <w:rPr>
                 <w:rFonts w:ascii="Arial Narrow" w:hAnsi="Arial Narrow"/>
+                <w:b/>
               </w:rPr>
             </w:pPr>
             <w:r>
@@ -5199,6 +4896,29 @@
               </w:rPr>
               <w:t>}</w:t>
             </w:r>
+            <w:r>
+              <w:rPr>
+                <w:rFonts w:ascii="Arial Narrow" w:hAnsi="Arial Narrow"/>
+                <w:b/>
+              </w:rPr>
+              <w:t>{</w:t>
+            </w:r>
+            <w:proofErr w:type="spellStart"/>
+            <w:r>
+              <w:rPr>
+                <w:rFonts w:ascii="Arial Narrow" w:hAnsi="Arial Narrow"/>
+                <w:b/>
+              </w:rPr>
+              <w:t>sdsName</w:t>
+            </w:r>
+            <w:proofErr w:type="spellEnd"/>
+            <w:r>
+              <w:rPr>
+                <w:rFonts w:ascii="Arial Narrow" w:hAnsi="Arial Narrow"/>
+                <w:b/>
+              </w:rPr>
+              <w:t>}</w:t>
+            </w:r>
           </w:p>
           <w:p>
             <w:pPr>
@@ -5206,9 +4926,77 @@
               <w:jc w:val="center"/>
               <w:rPr>
                 <w:rFonts w:ascii="Arial Narrow" w:hAnsi="Arial Narrow"/>
-                <w:b/>
-              </w:rPr>
-            </w:pPr>
+              </w:rPr>
+            </w:pPr>
+            <w:r>
+              <w:rPr>
+                <w:rFonts w:ascii="Arial Narrow" w:hAnsi="Arial Narrow"/>
+              </w:rPr>
+              <w:t>SDS Coordinator/</w:t>
+            </w:r>
+            <w:r>
+              <w:rPr>
+                <w:rFonts w:ascii="Arial Narrow" w:hAnsi="Arial Narrow"/>
+              </w:rPr>
+              <w:t>Activity Officer</w:t>
+            </w:r>
+          </w:p>
+        </w:tc>
+        <w:tc>
+          <w:tcPr>
+            <w:tcW w:w="3969" w:type="dxa"/>
+          </w:tcPr>
+          <w:p>
+            <w:pPr>
+              <w:spacing w:after="0"/>
+              <w:rPr>
+                <w:rFonts w:ascii="Arial Narrow" w:hAnsi="Arial Narrow"/>
+              </w:rPr>
+            </w:pPr>
+            <w:r>
+              <w:rPr>
+                <w:rFonts w:ascii="Arial Narrow" w:hAnsi="Arial Narrow"/>
+              </w:rPr>
+              <w:t>Noted by:</w:t>
+            </w:r>
+          </w:p>
+          <w:p>
+            <w:pPr>
+              <w:spacing w:after="0"/>
+              <w:rPr>
+                <w:rFonts w:ascii="Arial Narrow" w:hAnsi="Arial Narrow"/>
+              </w:rPr>
+            </w:pPr>
+          </w:p>
+          <w:p>
+            <w:pPr>
+              <w:spacing w:after="0"/>
+              <w:jc w:val="center"/>
+              <w:rPr>
+                <w:rFonts w:ascii="Arial Narrow" w:hAnsi="Arial Narrow"/>
+                <w:b/>
+              </w:rPr>
+            </w:pPr>
+            <w:r>
+              <w:rPr>
+                <w:rFonts w:ascii="Arial Narrow" w:hAnsi="Arial Narrow"/>
+              </w:rPr>
+              <w:t>{%</w:t>
+            </w:r>
+            <w:proofErr w:type="spellStart"/>
+            <w:r>
+              <w:rPr>
+                <w:rFonts w:ascii="Arial Narrow" w:hAnsi="Arial Narrow"/>
+              </w:rPr>
+              <w:t>sasApproval</w:t>
+            </w:r>
+            <w:proofErr w:type="spellEnd"/>
+            <w:r>
+              <w:rPr>
+                <w:rFonts w:ascii="Arial Narrow" w:hAnsi="Arial Narrow"/>
+              </w:rPr>
+              <w:t>}</w:t>
+            </w:r>
             <w:r>
               <w:rPr>
                 <w:rFonts w:ascii="Arial Narrow" w:hAnsi="Arial Narrow"/>
@@ -5222,7 +5010,7 @@
                 <w:rFonts w:ascii="Arial Narrow" w:hAnsi="Arial Narrow"/>
                 <w:b/>
               </w:rPr>
-              <w:t>sdsName</w:t>
+              <w:t>sasName</w:t>
             </w:r>
             <w:proofErr w:type="spellEnd"/>
             <w:r>
@@ -5245,33 +5033,47 @@
               <w:rPr>
                 <w:rFonts w:ascii="Arial Narrow" w:hAnsi="Arial Narrow"/>
               </w:rPr>
-              <w:t>SDS Coordinator/</w:t>
-            </w:r>
-            <w:r>
-              <w:rPr>
-                <w:rFonts w:ascii="Arial Narrow" w:hAnsi="Arial Narrow"/>
-              </w:rPr>
-              <w:t>Activity Officer</w:t>
-            </w:r>
-          </w:p>
-        </w:tc>
-        <w:tc>
-          <w:tcPr>
-            <w:tcW w:w="3969" w:type="dxa"/>
-          </w:tcPr>
-          <w:p>
-            <w:pPr>
-              <w:spacing w:after="0"/>
-              <w:rPr>
-                <w:rFonts w:ascii="Arial Narrow" w:hAnsi="Arial Narrow"/>
-              </w:rPr>
-            </w:pPr>
-            <w:r>
-              <w:rPr>
-                <w:rFonts w:ascii="Arial Narrow" w:hAnsi="Arial Narrow"/>
-              </w:rPr>
-              <w:t>Noted by:</w:t>
-            </w:r>
+              <w:t xml:space="preserve">Director, </w:t>
+            </w:r>
+            <w:r>
+              <w:rPr>
+                <w:rFonts w:ascii="Arial Narrow" w:hAnsi="Arial Narrow"/>
+              </w:rPr>
+              <w:t>SAS</w:t>
+            </w:r>
+          </w:p>
+        </w:tc>
+        <w:tc>
+          <w:tcPr>
+            <w:tcW w:w="3119" w:type="dxa"/>
+          </w:tcPr>
+          <w:p>
+            <w:pPr>
+              <w:spacing w:after="0"/>
+              <w:rPr>
+                <w:rFonts w:ascii="Arial Narrow" w:hAnsi="Arial Narrow"/>
+              </w:rPr>
+            </w:pPr>
+            <w:r>
+              <w:rPr>
+                <w:rFonts w:ascii="Arial Narrow" w:hAnsi="Arial Narrow"/>
+              </w:rPr>
+              <w:t>Endorsed</w:t>
+            </w:r>
+            <w:r>
+              <w:rPr>
+                <w:rFonts w:ascii="Arial Narrow" w:hAnsi="Arial Narrow"/>
+              </w:rPr>
+              <w:t xml:space="preserve"> by:</w:t>
+            </w:r>
+          </w:p>
+          <w:p>
+            <w:pPr>
+              <w:spacing w:after="0"/>
+              <w:rPr>
+                <w:rFonts w:ascii="Arial Narrow" w:hAnsi="Arial Narrow"/>
+              </w:rPr>
+            </w:pPr>
           </w:p>
           <w:p>
             <w:pPr>
@@ -5279,6 +5081,7 @@
               <w:jc w:val="center"/>
               <w:rPr>
                 <w:rFonts w:ascii="Arial Narrow" w:hAnsi="Arial Narrow"/>
+                <w:b/>
               </w:rPr>
             </w:pPr>
             <w:r>
@@ -5292,7 +5095,7 @@
               <w:rPr>
                 <w:rFonts w:ascii="Arial Narrow" w:hAnsi="Arial Narrow"/>
               </w:rPr>
-              <w:t>sasApproval</w:t>
+              <w:t>vpaaAsstApproval</w:t>
             </w:r>
             <w:proofErr w:type="spellEnd"/>
             <w:r>
@@ -5301,124 +5104,6 @@
               </w:rPr>
               <w:t>}</w:t>
             </w:r>
-          </w:p>
-          <w:p>
-            <w:pPr>
-              <w:spacing w:after="0"/>
-              <w:jc w:val="center"/>
-              <w:rPr>
-                <w:rFonts w:ascii="Arial Narrow" w:hAnsi="Arial Narrow"/>
-                <w:b/>
-              </w:rPr>
-            </w:pPr>
-            <w:r>
-              <w:rPr>
-                <w:rFonts w:ascii="Arial Narrow" w:hAnsi="Arial Narrow"/>
-                <w:b/>
-              </w:rPr>
-              <w:t>{</w:t>
-            </w:r>
-            <w:proofErr w:type="spellStart"/>
-            <w:r>
-              <w:rPr>
-                <w:rFonts w:ascii="Arial Narrow" w:hAnsi="Arial Narrow"/>
-                <w:b/>
-              </w:rPr>
-              <w:t>sasName</w:t>
-            </w:r>
-            <w:proofErr w:type="spellEnd"/>
-            <w:r>
-              <w:rPr>
-                <w:rFonts w:ascii="Arial Narrow" w:hAnsi="Arial Narrow"/>
-                <w:b/>
-              </w:rPr>
-              <w:t>}</w:t>
-            </w:r>
-          </w:p>
-          <w:p>
-            <w:pPr>
-              <w:spacing w:after="0"/>
-              <w:jc w:val="center"/>
-              <w:rPr>
-                <w:rFonts w:ascii="Arial Narrow" w:hAnsi="Arial Narrow"/>
-              </w:rPr>
-            </w:pPr>
-            <w:r>
-              <w:rPr>
-                <w:rFonts w:ascii="Arial Narrow" w:hAnsi="Arial Narrow"/>
-              </w:rPr>
-              <w:t xml:space="preserve">Director, </w:t>
-            </w:r>
-            <w:r>
-              <w:rPr>
-                <w:rFonts w:ascii="Arial Narrow" w:hAnsi="Arial Narrow"/>
-              </w:rPr>
-              <w:t>SAS</w:t>
-            </w:r>
-          </w:p>
-        </w:tc>
-        <w:tc>
-          <w:tcPr>
-            <w:tcW w:w="3119" w:type="dxa"/>
-          </w:tcPr>
-          <w:p>
-            <w:pPr>
-              <w:spacing w:after="0"/>
-              <w:rPr>
-                <w:rFonts w:ascii="Arial Narrow" w:hAnsi="Arial Narrow"/>
-              </w:rPr>
-            </w:pPr>
-            <w:r>
-              <w:rPr>
-                <w:rFonts w:ascii="Arial Narrow" w:hAnsi="Arial Narrow"/>
-              </w:rPr>
-              <w:t>Endorsed</w:t>
-            </w:r>
-            <w:r>
-              <w:rPr>
-                <w:rFonts w:ascii="Arial Narrow" w:hAnsi="Arial Narrow"/>
-              </w:rPr>
-              <w:t xml:space="preserve"> by:</w:t>
-            </w:r>
-          </w:p>
-          <w:p>
-            <w:pPr>
-              <w:spacing w:after="0"/>
-              <w:jc w:val="center"/>
-              <w:rPr>
-                <w:rFonts w:ascii="Arial Narrow" w:hAnsi="Arial Narrow"/>
-              </w:rPr>
-            </w:pPr>
-            <w:r>
-              <w:rPr>
-                <w:rFonts w:ascii="Arial Narrow" w:hAnsi="Arial Narrow"/>
-              </w:rPr>
-              <w:t>{%</w:t>
-            </w:r>
-            <w:proofErr w:type="spellStart"/>
-            <w:r>
-              <w:rPr>
-                <w:rFonts w:ascii="Arial Narrow" w:hAnsi="Arial Narrow"/>
-              </w:rPr>
-              <w:t>vpaaAsstApproval</w:t>
-            </w:r>
-            <w:proofErr w:type="spellEnd"/>
-            <w:r>
-              <w:rPr>
-                <w:rFonts w:ascii="Arial Narrow" w:hAnsi="Arial Narrow"/>
-              </w:rPr>
-              <w:t>}</w:t>
-            </w:r>
-          </w:p>
-          <w:p>
-            <w:pPr>
-              <w:spacing w:after="0"/>
-              <w:jc w:val="center"/>
-              <w:rPr>
-                <w:rFonts w:ascii="Arial Narrow" w:hAnsi="Arial Narrow"/>
-                <w:b/>
-              </w:rPr>
-            </w:pPr>
             <w:r>
               <w:rPr>
                 <w:rFonts w:ascii="Arial Narrow" w:hAnsi="Arial Narrow"/>
@@ -5494,6 +5179,12 @@
                 <w:rFonts w:ascii="Arial Narrow" w:hAnsi="Arial Narrow"/>
               </w:rPr>
             </w:pPr>
+            <w:r>
+              <w:rPr>
+                <w:rFonts w:ascii="Arial Narrow" w:hAnsi="Arial Narrow"/>
+              </w:rPr>
+              <w:t>{#additionalAssignatories}</w:t>
+            </w:r>
           </w:p>
           <w:p>
             <w:pPr>
@@ -5503,12 +5194,6 @@
                 <w:rFonts w:ascii="Arial Narrow" w:hAnsi="Arial Narrow"/>
               </w:rPr>
             </w:pPr>
-            <w:r>
-              <w:rPr>
-                <w:rFonts w:ascii="Arial Narrow" w:hAnsi="Arial Narrow"/>
-              </w:rPr>
-              <w:t>{#additionalAssignatories}</w:t>
-            </w:r>
           </w:p>
           <w:p>
             <w:pPr>
@@ -5516,6 +5201,8 @@
               <w:jc w:val="center"/>
               <w:rPr>
                 <w:rFonts w:ascii="Arial Narrow" w:hAnsi="Arial Narrow"/>
+                <w:b/>
+                <w:bCs/>
               </w:rPr>
             </w:pPr>
             <w:r>
@@ -5538,17 +5225,6 @@
               </w:rPr>
               <w:t>}</w:t>
             </w:r>
-          </w:p>
-          <w:p>
-            <w:pPr>
-              <w:spacing w:after="0"/>
-              <w:jc w:val="center"/>
-              <w:rPr>
-                <w:rFonts w:ascii="Arial Narrow" w:hAnsi="Arial Narrow"/>
-                <w:b/>
-                <w:bCs/>
-              </w:rPr>
-            </w:pPr>
             <w:r>
               <w:rPr>
                 <w:rFonts w:ascii="Arial Narrow" w:hAnsi="Arial Narrow"/>
@@ -5667,9 +5343,18 @@
           <w:p>
             <w:pPr>
               <w:spacing w:after="0"/>
+              <w:rPr>
+                <w:rFonts w:ascii="Arial Narrow" w:hAnsi="Arial Narrow"/>
+              </w:rPr>
+            </w:pPr>
+          </w:p>
+          <w:p>
+            <w:pPr>
+              <w:spacing w:after="0"/>
               <w:jc w:val="center"/>
               <w:rPr>
                 <w:rFonts w:ascii="Arial Narrow" w:hAnsi="Arial Narrow"/>
+                <w:b/>
               </w:rPr>
             </w:pPr>
             <w:r>
@@ -5692,16 +5377,6 @@
               </w:rPr>
               <w:t>}</w:t>
             </w:r>
-          </w:p>
-          <w:p>
-            <w:pPr>
-              <w:spacing w:after="0"/>
-              <w:jc w:val="center"/>
-              <w:rPr>
-                <w:rFonts w:ascii="Arial Narrow" w:hAnsi="Arial Narrow"/>
-                <w:b/>
-              </w:rPr>
-            </w:pPr>
             <w:r>
               <w:rPr>
                 <w:rFonts w:ascii="Arial Narrow" w:hAnsi="Arial Narrow"/>
@@ -5763,6 +5438,16 @@
                 <w:bCs/>
               </w:rPr>
             </w:pPr>
+          </w:p>
+          <w:p>
+            <w:pPr>
+              <w:spacing w:after="0"/>
+              <w:jc w:val="center"/>
+              <w:rPr>
+                <w:rFonts w:ascii="Arial Narrow" w:hAnsi="Arial Narrow"/>
+                <w:b/>
+              </w:rPr>
+            </w:pPr>
             <w:r>
               <w:rPr>
                 <w:rFonts w:ascii="Arial Narrow" w:hAnsi="Arial Narrow"/>
@@ -5786,16 +5471,6 @@
               </w:rPr>
               <w:t>}</w:t>
             </w:r>
-          </w:p>
-          <w:p>
-            <w:pPr>
-              <w:spacing w:after="0"/>
-              <w:jc w:val="center"/>
-              <w:rPr>
-                <w:rFonts w:ascii="Arial Narrow" w:hAnsi="Arial Narrow"/>
-                <w:b/>
-              </w:rPr>
-            </w:pPr>
             <w:r>
               <w:rPr>
                 <w:rFonts w:ascii="Arial Narrow" w:hAnsi="Arial Narrow"/>

</xml_diff>

<commit_message>
feat: Fixed black image when converting to docx to pdf
</commit_message>
<xml_diff>
--- a/public/templates/student-activity-proposal-form-v2.docx
+++ b/public/templates/student-activity-proposal-form-v2.docx
@@ -211,7 +211,7 @@
           <w:szCs w:val="28"/>
         </w:rPr>
         <w:drawing>
-          <wp:anchor distT="0" distB="0" distL="114300" distR="114300" simplePos="0" relativeHeight="251665408" behindDoc="0" locked="0" layoutInCell="1" allowOverlap="1" wp14:anchorId="4D66C737" wp14:editId="3530755E">
+          <wp:anchor distT="0" distB="0" distL="114300" distR="114300" simplePos="0" relativeHeight="251665408" behindDoc="0" locked="0" layoutInCell="1" allowOverlap="1" wp14:anchorId="4D66C737" wp14:editId="25F93FB4">
             <wp:simplePos x="0" y="0"/>
             <wp:positionH relativeFrom="column">
               <wp:posOffset>190004</wp:posOffset>
@@ -276,7 +276,7 @@
           <w:szCs w:val="28"/>
         </w:rPr>
         <w:drawing>
-          <wp:anchor distT="0" distB="0" distL="114300" distR="114300" simplePos="0" relativeHeight="251659264" behindDoc="0" locked="0" layoutInCell="1" allowOverlap="1" wp14:anchorId="31EB85D4" wp14:editId="6C3E82E5">
+          <wp:anchor distT="0" distB="0" distL="114300" distR="114300" simplePos="0" relativeHeight="251659264" behindDoc="0" locked="0" layoutInCell="1" allowOverlap="1" wp14:anchorId="31EB85D4" wp14:editId="74561890">
             <wp:simplePos x="0" y="0"/>
             <wp:positionH relativeFrom="column">
               <wp:posOffset>-474914</wp:posOffset>
@@ -575,7 +575,21 @@
               <w:rPr>
                 <w:rFonts w:ascii="Arial Narrow" w:hAnsi="Arial Narrow"/>
               </w:rPr>
-              <w:t>}) College  ({</w:t>
+              <w:t xml:space="preserve">}) </w:t>
+            </w:r>
+            <w:proofErr w:type="gramStart"/>
+            <w:r>
+              <w:rPr>
+                <w:rFonts w:ascii="Arial Narrow" w:hAnsi="Arial Narrow"/>
+              </w:rPr>
+              <w:t>College  (</w:t>
+            </w:r>
+            <w:proofErr w:type="gramEnd"/>
+            <w:r>
+              <w:rPr>
+                <w:rFonts w:ascii="Arial Narrow" w:hAnsi="Arial Narrow"/>
+              </w:rPr>
+              <w:t>{</w:t>
             </w:r>
             <w:proofErr w:type="spellStart"/>
             <w:r>
@@ -589,7 +603,21 @@
               <w:rPr>
                 <w:rFonts w:ascii="Arial Narrow" w:hAnsi="Arial Narrow"/>
               </w:rPr>
-              <w:t>}) Alternative Education  ({</w:t>
+              <w:t xml:space="preserve">}) Alternative </w:t>
+            </w:r>
+            <w:proofErr w:type="gramStart"/>
+            <w:r>
+              <w:rPr>
+                <w:rFonts w:ascii="Arial Narrow" w:hAnsi="Arial Narrow"/>
+              </w:rPr>
+              <w:t>Education  (</w:t>
+            </w:r>
+            <w:proofErr w:type="gramEnd"/>
+            <w:r>
+              <w:rPr>
+                <w:rFonts w:ascii="Arial Narrow" w:hAnsi="Arial Narrow"/>
+              </w:rPr>
+              <w:t>{</w:t>
             </w:r>
             <w:proofErr w:type="spellStart"/>
             <w:r>
@@ -603,7 +631,21 @@
               <w:rPr>
                 <w:rFonts w:ascii="Arial Narrow" w:hAnsi="Arial Narrow"/>
               </w:rPr>
-              <w:t>}) Graduate Studies  ({</w:t>
+              <w:t xml:space="preserve">}) Graduate </w:t>
+            </w:r>
+            <w:proofErr w:type="gramStart"/>
+            <w:r>
+              <w:rPr>
+                <w:rFonts w:ascii="Arial Narrow" w:hAnsi="Arial Narrow"/>
+              </w:rPr>
+              <w:t>Studies  (</w:t>
+            </w:r>
+            <w:proofErr w:type="gramEnd"/>
+            <w:r>
+              <w:rPr>
+                <w:rFonts w:ascii="Arial Narrow" w:hAnsi="Arial Narrow"/>
+              </w:rPr>
+              <w:t>{</w:t>
             </w:r>
             <w:proofErr w:type="spellStart"/>
             <w:r>
@@ -617,7 +659,21 @@
               <w:rPr>
                 <w:rFonts w:ascii="Arial Narrow" w:hAnsi="Arial Narrow"/>
               </w:rPr>
-              <w:t>}) Extensions Office  ({</w:t>
+              <w:t xml:space="preserve">}) Extensions </w:t>
+            </w:r>
+            <w:proofErr w:type="gramStart"/>
+            <w:r>
+              <w:rPr>
+                <w:rFonts w:ascii="Arial Narrow" w:hAnsi="Arial Narrow"/>
+              </w:rPr>
+              <w:t>Office  (</w:t>
+            </w:r>
+            <w:proofErr w:type="gramEnd"/>
+            <w:r>
+              <w:rPr>
+                <w:rFonts w:ascii="Arial Narrow" w:hAnsi="Arial Narrow"/>
+              </w:rPr>
+              <w:t>{</w:t>
             </w:r>
             <w:proofErr w:type="spellStart"/>
             <w:r>
@@ -1424,7 +1480,21 @@
               <w:rPr>
                 <w:rFonts w:ascii="Arial Narrow" w:hAnsi="Arial Narrow"/>
               </w:rPr>
-              <w:t>}) Online        ({</w:t>
+              <w:t xml:space="preserve">}) Online     </w:t>
+            </w:r>
+            <w:proofErr w:type="gramStart"/>
+            <w:r>
+              <w:rPr>
+                <w:rFonts w:ascii="Arial Narrow" w:hAnsi="Arial Narrow"/>
+              </w:rPr>
+              <w:t xml:space="preserve">   (</w:t>
+            </w:r>
+            <w:proofErr w:type="gramEnd"/>
+            <w:r>
+              <w:rPr>
+                <w:rFonts w:ascii="Arial Narrow" w:hAnsi="Arial Narrow"/>
+              </w:rPr>
+              <w:t>{</w:t>
             </w:r>
             <w:proofErr w:type="spellStart"/>
             <w:r>
@@ -1835,7 +1905,21 @@
               <w:rPr>
                 <w:rFonts w:ascii="Arial Narrow" w:hAnsi="Arial Narrow"/>
               </w:rPr>
-              <w:t>}) Co-Curricular   ({</w:t>
+              <w:t>}) Co-Curricular</w:t>
+            </w:r>
+            <w:proofErr w:type="gramStart"/>
+            <w:r>
+              <w:rPr>
+                <w:rFonts w:ascii="Arial Narrow" w:hAnsi="Arial Narrow"/>
+              </w:rPr>
+              <w:t xml:space="preserve">   (</w:t>
+            </w:r>
+            <w:proofErr w:type="gramEnd"/>
+            <w:r>
+              <w:rPr>
+                <w:rFonts w:ascii="Arial Narrow" w:hAnsi="Arial Narrow"/>
+              </w:rPr>
+              <w:t>{</w:t>
             </w:r>
             <w:proofErr w:type="spellStart"/>
             <w:r>
@@ -1955,7 +2039,21 @@
               <w:rPr>
                 <w:rFonts w:ascii="Arial Narrow" w:hAnsi="Arial Narrow"/>
               </w:rPr>
-              <w:t>}) Organizational     ({</w:t>
+              <w:t xml:space="preserve">}) Organizational  </w:t>
+            </w:r>
+            <w:proofErr w:type="gramStart"/>
+            <w:r>
+              <w:rPr>
+                <w:rFonts w:ascii="Arial Narrow" w:hAnsi="Arial Narrow"/>
+              </w:rPr>
+              <w:t xml:space="preserve">   (</w:t>
+            </w:r>
+            <w:proofErr w:type="gramEnd"/>
+            <w:r>
+              <w:rPr>
+                <w:rFonts w:ascii="Arial Narrow" w:hAnsi="Arial Narrow"/>
+              </w:rPr>
+              <w:t>{</w:t>
             </w:r>
             <w:proofErr w:type="spellStart"/>
             <w:r>
@@ -1984,7 +2082,21 @@
               <w:rPr>
                 <w:rFonts w:ascii="Arial Narrow" w:hAnsi="Arial Narrow"/>
               </w:rPr>
-              <w:t xml:space="preserve"> Institutional     ({</w:t>
+              <w:t xml:space="preserve"> Institutional  </w:t>
+            </w:r>
+            <w:proofErr w:type="gramStart"/>
+            <w:r>
+              <w:rPr>
+                <w:rFonts w:ascii="Arial Narrow" w:hAnsi="Arial Narrow"/>
+              </w:rPr>
+              <w:t xml:space="preserve">   (</w:t>
+            </w:r>
+            <w:proofErr w:type="gramEnd"/>
+            <w:r>
+              <w:rPr>
+                <w:rFonts w:ascii="Arial Narrow" w:hAnsi="Arial Narrow"/>
+              </w:rPr>
+              <w:t>{</w:t>
             </w:r>
             <w:proofErr w:type="spellStart"/>
             <w:r>
@@ -1998,7 +2110,21 @@
               <w:rPr>
                 <w:rFonts w:ascii="Arial Narrow" w:hAnsi="Arial Narrow"/>
               </w:rPr>
-              <w:t>}) Regional     ({</w:t>
+              <w:t xml:space="preserve">}) Regional  </w:t>
+            </w:r>
+            <w:proofErr w:type="gramStart"/>
+            <w:r>
+              <w:rPr>
+                <w:rFonts w:ascii="Arial Narrow" w:hAnsi="Arial Narrow"/>
+              </w:rPr>
+              <w:t xml:space="preserve">   (</w:t>
+            </w:r>
+            <w:proofErr w:type="gramEnd"/>
+            <w:r>
+              <w:rPr>
+                <w:rFonts w:ascii="Arial Narrow" w:hAnsi="Arial Narrow"/>
+              </w:rPr>
+              <w:t>{</w:t>
             </w:r>
             <w:proofErr w:type="spellStart"/>
             <w:r>
@@ -2130,7 +2256,21 @@
               <w:rPr>
                 <w:rFonts w:ascii="Arial Narrow" w:hAnsi="Arial Narrow"/>
               </w:rPr>
-              <w:t>}) Team Building     ({</w:t>
+              <w:t xml:space="preserve">}) Team Building  </w:t>
+            </w:r>
+            <w:proofErr w:type="gramStart"/>
+            <w:r>
+              <w:rPr>
+                <w:rFonts w:ascii="Arial Narrow" w:hAnsi="Arial Narrow"/>
+              </w:rPr>
+              <w:t xml:space="preserve">   (</w:t>
+            </w:r>
+            <w:proofErr w:type="gramEnd"/>
+            <w:r>
+              <w:rPr>
+                <w:rFonts w:ascii="Arial Narrow" w:hAnsi="Arial Narrow"/>
+              </w:rPr>
+              <w:t>{</w:t>
             </w:r>
             <w:proofErr w:type="spellStart"/>
             <w:r>
@@ -2144,7 +2284,21 @@
               <w:rPr>
                 <w:rFonts w:ascii="Arial Narrow" w:hAnsi="Arial Narrow"/>
               </w:rPr>
-              <w:t>}) Leadership Summit     ({</w:t>
+              <w:t xml:space="preserve">}) Leadership Summit  </w:t>
+            </w:r>
+            <w:proofErr w:type="gramStart"/>
+            <w:r>
+              <w:rPr>
+                <w:rFonts w:ascii="Arial Narrow" w:hAnsi="Arial Narrow"/>
+              </w:rPr>
+              <w:t xml:space="preserve">   (</w:t>
+            </w:r>
+            <w:proofErr w:type="gramEnd"/>
+            <w:r>
+              <w:rPr>
+                <w:rFonts w:ascii="Arial Narrow" w:hAnsi="Arial Narrow"/>
+              </w:rPr>
+              <w:t>{</w:t>
             </w:r>
             <w:proofErr w:type="spellStart"/>
             <w:r>
@@ -2158,7 +2312,21 @@
               <w:rPr>
                 <w:rFonts w:ascii="Arial Narrow" w:hAnsi="Arial Narrow"/>
               </w:rPr>
-              <w:t>}) General Assembly     ({</w:t>
+              <w:t xml:space="preserve">}) General Assembly  </w:t>
+            </w:r>
+            <w:proofErr w:type="gramStart"/>
+            <w:r>
+              <w:rPr>
+                <w:rFonts w:ascii="Arial Narrow" w:hAnsi="Arial Narrow"/>
+              </w:rPr>
+              <w:t xml:space="preserve">   (</w:t>
+            </w:r>
+            <w:proofErr w:type="gramEnd"/>
+            <w:r>
+              <w:rPr>
+                <w:rFonts w:ascii="Arial Narrow" w:hAnsi="Arial Narrow"/>
+              </w:rPr>
+              <w:t>{</w:t>
             </w:r>
             <w:proofErr w:type="spellStart"/>
             <w:r>
@@ -2187,7 +2355,21 @@
               <w:rPr>
                 <w:rFonts w:ascii="Arial Narrow" w:hAnsi="Arial Narrow"/>
               </w:rPr>
-              <w:t>Competition     ({</w:t>
+              <w:t xml:space="preserve">Competition  </w:t>
+            </w:r>
+            <w:proofErr w:type="gramStart"/>
+            <w:r>
+              <w:rPr>
+                <w:rFonts w:ascii="Arial Narrow" w:hAnsi="Arial Narrow"/>
+              </w:rPr>
+              <w:t xml:space="preserve">   (</w:t>
+            </w:r>
+            <w:proofErr w:type="gramEnd"/>
+            <w:r>
+              <w:rPr>
+                <w:rFonts w:ascii="Arial Narrow" w:hAnsi="Arial Narrow"/>
+              </w:rPr>
+              <w:t>{</w:t>
             </w:r>
             <w:proofErr w:type="spellStart"/>
             <w:r>
@@ -2201,7 +2383,21 @@
               <w:rPr>
                 <w:rFonts w:ascii="Arial Narrow" w:hAnsi="Arial Narrow"/>
               </w:rPr>
-              <w:t>}) Press Conference     ({</w:t>
+              <w:t xml:space="preserve">}) Press Conference  </w:t>
+            </w:r>
+            <w:proofErr w:type="gramStart"/>
+            <w:r>
+              <w:rPr>
+                <w:rFonts w:ascii="Arial Narrow" w:hAnsi="Arial Narrow"/>
+              </w:rPr>
+              <w:t xml:space="preserve">   (</w:t>
+            </w:r>
+            <w:proofErr w:type="gramEnd"/>
+            <w:r>
+              <w:rPr>
+                <w:rFonts w:ascii="Arial Narrow" w:hAnsi="Arial Narrow"/>
+              </w:rPr>
+              <w:t>{</w:t>
             </w:r>
             <w:proofErr w:type="spellStart"/>
             <w:r>
@@ -2396,7 +2592,21 @@
               <w:rPr>
                 <w:rFonts w:ascii="Arial Narrow" w:hAnsi="Arial Narrow"/>
               </w:rPr>
-              <w:t>}) Courage  ({</w:t>
+              <w:t xml:space="preserve">}) </w:t>
+            </w:r>
+            <w:proofErr w:type="gramStart"/>
+            <w:r>
+              <w:rPr>
+                <w:rFonts w:ascii="Arial Narrow" w:hAnsi="Arial Narrow"/>
+              </w:rPr>
+              <w:t>Courage  (</w:t>
+            </w:r>
+            <w:proofErr w:type="gramEnd"/>
+            <w:r>
+              <w:rPr>
+                <w:rFonts w:ascii="Arial Narrow" w:hAnsi="Arial Narrow"/>
+              </w:rPr>
+              <w:t>{</w:t>
             </w:r>
             <w:proofErr w:type="spellStart"/>
             <w:r>
@@ -2410,7 +2620,21 @@
               <w:rPr>
                 <w:rFonts w:ascii="Arial Narrow" w:hAnsi="Arial Narrow"/>
               </w:rPr>
-              <w:t>}) Compassion  ({</w:t>
+              <w:t xml:space="preserve">}) </w:t>
+            </w:r>
+            <w:proofErr w:type="gramStart"/>
+            <w:r>
+              <w:rPr>
+                <w:rFonts w:ascii="Arial Narrow" w:hAnsi="Arial Narrow"/>
+              </w:rPr>
+              <w:t>Compassion  (</w:t>
+            </w:r>
+            <w:proofErr w:type="gramEnd"/>
+            <w:r>
+              <w:rPr>
+                <w:rFonts w:ascii="Arial Narrow" w:hAnsi="Arial Narrow"/>
+              </w:rPr>
+              <w:t>{</w:t>
             </w:r>
             <w:proofErr w:type="spellStart"/>
             <w:r>
@@ -2424,7 +2648,21 @@
               <w:rPr>
                 <w:rFonts w:ascii="Arial Narrow" w:hAnsi="Arial Narrow"/>
               </w:rPr>
-              <w:t>}) Community-Oriented  ({</w:t>
+              <w:t>}) Community-</w:t>
+            </w:r>
+            <w:proofErr w:type="gramStart"/>
+            <w:r>
+              <w:rPr>
+                <w:rFonts w:ascii="Arial Narrow" w:hAnsi="Arial Narrow"/>
+              </w:rPr>
+              <w:t>Oriented  (</w:t>
+            </w:r>
+            <w:proofErr w:type="gramEnd"/>
+            <w:r>
+              <w:rPr>
+                <w:rFonts w:ascii="Arial Narrow" w:hAnsi="Arial Narrow"/>
+              </w:rPr>
+              <w:t>{</w:t>
             </w:r>
             <w:proofErr w:type="spellStart"/>
             <w:r>
@@ -2438,7 +2676,21 @@
               <w:rPr>
                 <w:rFonts w:ascii="Arial Narrow" w:hAnsi="Arial Narrow"/>
               </w:rPr>
-              <w:t>}) Humility  ({</w:t>
+              <w:t xml:space="preserve">}) </w:t>
+            </w:r>
+            <w:proofErr w:type="gramStart"/>
+            <w:r>
+              <w:rPr>
+                <w:rFonts w:ascii="Arial Narrow" w:hAnsi="Arial Narrow"/>
+              </w:rPr>
+              <w:t>Humility  (</w:t>
+            </w:r>
+            <w:proofErr w:type="gramEnd"/>
+            <w:r>
+              <w:rPr>
+                <w:rFonts w:ascii="Arial Narrow" w:hAnsi="Arial Narrow"/>
+              </w:rPr>
+              <w:t>{</w:t>
             </w:r>
             <w:proofErr w:type="spellStart"/>
             <w:r>
@@ -2452,7 +2704,21 @@
               <w:rPr>
                 <w:rFonts w:ascii="Arial Narrow" w:hAnsi="Arial Narrow"/>
               </w:rPr>
-              <w:t>}) Interiority  ({</w:t>
+              <w:t xml:space="preserve">}) </w:t>
+            </w:r>
+            <w:proofErr w:type="gramStart"/>
+            <w:r>
+              <w:rPr>
+                <w:rFonts w:ascii="Arial Narrow" w:hAnsi="Arial Narrow"/>
+              </w:rPr>
+              <w:t>Interiority  (</w:t>
+            </w:r>
+            <w:proofErr w:type="gramEnd"/>
+            <w:r>
+              <w:rPr>
+                <w:rFonts w:ascii="Arial Narrow" w:hAnsi="Arial Narrow"/>
+              </w:rPr>
+              <w:t>{</w:t>
             </w:r>
             <w:proofErr w:type="spellStart"/>
             <w:r>
@@ -4232,14 +4498,30 @@
                 <w:rFonts w:ascii="Arial Narrow" w:hAnsi="Arial Narrow" w:cs="Arial"/>
                 <w:b/>
               </w:rPr>
-              <w:t xml:space="preserve"> Yes  </w:t>
-            </w:r>
+              <w:t xml:space="preserve"> </w:t>
+            </w:r>
+            <w:proofErr w:type="gramStart"/>
             <w:r>
               <w:rPr>
                 <w:rFonts w:ascii="Arial Narrow" w:hAnsi="Arial Narrow" w:cs="Arial"/>
                 <w:b/>
               </w:rPr>
-              <w:t>({</w:t>
+              <w:t xml:space="preserve">Yes  </w:t>
+            </w:r>
+            <w:r>
+              <w:rPr>
+                <w:rFonts w:ascii="Arial Narrow" w:hAnsi="Arial Narrow" w:cs="Arial"/>
+                <w:b/>
+              </w:rPr>
+              <w:t>(</w:t>
+            </w:r>
+            <w:proofErr w:type="gramEnd"/>
+            <w:r>
+              <w:rPr>
+                <w:rFonts w:ascii="Arial Narrow" w:hAnsi="Arial Narrow" w:cs="Arial"/>
+                <w:b/>
+              </w:rPr>
+              <w:t>{</w:t>
             </w:r>
             <w:proofErr w:type="spellStart"/>
             <w:r>
@@ -4295,16 +4577,17 @@
                 <w:color w:val="ED7D31" w:themeColor="accent2"/>
                 <w:sz w:val="18"/>
               </w:rPr>
-              <w:t>[CMO no. 63 s.2017]</w:t>
-            </w:r>
+              <w:t>[CMO no. 63 s.2017</w:t>
+            </w:r>
+            <w:proofErr w:type="gramStart"/>
             <w:r>
               <w:rPr>
                 <w:rFonts w:ascii="Arial Narrow" w:hAnsi="Arial Narrow" w:cs="Arial"/>
-                <w:b/>
+                <w:i/>
                 <w:color w:val="ED7D31" w:themeColor="accent2"/>
                 <w:sz w:val="18"/>
               </w:rPr>
-              <w:t xml:space="preserve"> </w:t>
+              <w:t>]</w:t>
             </w:r>
             <w:r>
               <w:rPr>
@@ -4319,15 +4602,32 @@
               <w:rPr>
                 <w:rFonts w:ascii="Arial Narrow" w:hAnsi="Arial Narrow" w:cs="Arial"/>
                 <w:b/>
-              </w:rPr>
-              <w:t>({</w:t>
-            </w:r>
-            <w:proofErr w:type="spellStart"/>
+                <w:color w:val="ED7D31" w:themeColor="accent2"/>
+                <w:sz w:val="18"/>
+              </w:rPr>
+              <w:t xml:space="preserve"> </w:t>
+            </w:r>
             <w:r>
               <w:rPr>
                 <w:rFonts w:ascii="Arial Narrow" w:hAnsi="Arial Narrow" w:cs="Arial"/>
                 <w:b/>
               </w:rPr>
+              <w:t>(</w:t>
+            </w:r>
+            <w:proofErr w:type="gramEnd"/>
+            <w:r>
+              <w:rPr>
+                <w:rFonts w:ascii="Arial Narrow" w:hAnsi="Arial Narrow" w:cs="Arial"/>
+                <w:b/>
+              </w:rPr>
+              <w:t>{</w:t>
+            </w:r>
+            <w:proofErr w:type="spellStart"/>
+            <w:r>
+              <w:rPr>
+                <w:rFonts w:ascii="Arial Narrow" w:hAnsi="Arial Narrow" w:cs="Arial"/>
+                <w:b/>
+              </w:rPr>
               <w:t>reportComplianceYes</w:t>
             </w:r>
             <w:proofErr w:type="spellEnd"/>
@@ -4345,6 +4645,7 @@
               </w:rPr>
               <w:t xml:space="preserve"> </w:t>
             </w:r>
+            <w:proofErr w:type="gramStart"/>
             <w:r>
               <w:rPr>
                 <w:rFonts w:ascii="Arial Narrow" w:hAnsi="Arial Narrow" w:cs="Arial"/>
@@ -4364,7 +4665,15 @@
                 <w:rFonts w:ascii="Arial Narrow" w:hAnsi="Arial Narrow" w:cs="Arial"/>
                 <w:b/>
               </w:rPr>
-              <w:t>({</w:t>
+              <w:t>(</w:t>
+            </w:r>
+            <w:proofErr w:type="gramEnd"/>
+            <w:r>
+              <w:rPr>
+                <w:rFonts w:ascii="Arial Narrow" w:hAnsi="Arial Narrow" w:cs="Arial"/>
+                <w:b/>
+              </w:rPr>
+              <w:t>{</w:t>
             </w:r>
             <w:proofErr w:type="spellStart"/>
             <w:r>
@@ -4662,6 +4971,7 @@
               <w:t>{%</w:t>
             </w:r>
             <w:proofErr w:type="spellStart"/>
+            <w:proofErr w:type="gramStart"/>
             <w:r>
               <w:rPr>
                 <w:rFonts w:ascii="Arial Narrow" w:hAnsi="Arial Narrow"/>
@@ -4684,6 +4994,7 @@
               <w:t>{</w:t>
             </w:r>
             <w:proofErr w:type="spellStart"/>
+            <w:proofErr w:type="gramEnd"/>
             <w:r>
               <w:rPr>
                 <w:rFonts w:ascii="Arial Narrow" w:hAnsi="Arial Narrow"/>
@@ -4761,6 +5072,7 @@
               <w:t>{%</w:t>
             </w:r>
             <w:proofErr w:type="spellStart"/>
+            <w:proofErr w:type="gramStart"/>
             <w:r>
               <w:rPr>
                 <w:rFonts w:ascii="Arial Narrow" w:hAnsi="Arial Narrow"/>
@@ -4786,6 +5098,7 @@
               <w:t>{</w:t>
             </w:r>
             <w:proofErr w:type="spellStart"/>
+            <w:proofErr w:type="gramEnd"/>
             <w:r>
               <w:rPr>
                 <w:rFonts w:ascii="Arial Narrow" w:hAnsi="Arial Narrow"/>
@@ -4883,6 +5196,7 @@
               <w:t>{%</w:t>
             </w:r>
             <w:proofErr w:type="spellStart"/>
+            <w:proofErr w:type="gramStart"/>
             <w:r>
               <w:rPr>
                 <w:rFonts w:ascii="Arial Narrow" w:hAnsi="Arial Narrow"/>
@@ -4904,6 +5218,7 @@
               <w:t>{</w:t>
             </w:r>
             <w:proofErr w:type="spellStart"/>
+            <w:proofErr w:type="gramEnd"/>
             <w:r>
               <w:rPr>
                 <w:rFonts w:ascii="Arial Narrow" w:hAnsi="Arial Narrow"/>
@@ -4984,6 +5299,7 @@
               <w:t>{%</w:t>
             </w:r>
             <w:proofErr w:type="spellStart"/>
+            <w:proofErr w:type="gramStart"/>
             <w:r>
               <w:rPr>
                 <w:rFonts w:ascii="Arial Narrow" w:hAnsi="Arial Narrow"/>
@@ -5005,6 +5321,7 @@
               <w:t>{</w:t>
             </w:r>
             <w:proofErr w:type="spellStart"/>
+            <w:proofErr w:type="gramEnd"/>
             <w:r>
               <w:rPr>
                 <w:rFonts w:ascii="Arial Narrow" w:hAnsi="Arial Narrow"/>
@@ -5091,6 +5408,7 @@
               <w:t>{%</w:t>
             </w:r>
             <w:proofErr w:type="spellStart"/>
+            <w:proofErr w:type="gramStart"/>
             <w:r>
               <w:rPr>
                 <w:rFonts w:ascii="Arial Narrow" w:hAnsi="Arial Narrow"/>
@@ -5112,6 +5430,7 @@
               <w:t>{</w:t>
             </w:r>
             <w:proofErr w:type="spellStart"/>
+            <w:proofErr w:type="gramEnd"/>
             <w:r>
               <w:rPr>
                 <w:rFonts w:ascii="Arial Narrow" w:hAnsi="Arial Narrow"/>
@@ -5212,6 +5531,7 @@
               <w:t>{%</w:t>
             </w:r>
             <w:proofErr w:type="spellStart"/>
+            <w:proofErr w:type="gramStart"/>
             <w:r>
               <w:rPr>
                 <w:rFonts w:ascii="Arial Narrow" w:hAnsi="Arial Narrow"/>
@@ -5234,6 +5554,7 @@
               <w:t>{</w:t>
             </w:r>
             <w:proofErr w:type="spellStart"/>
+            <w:proofErr w:type="gramEnd"/>
             <w:r>
               <w:rPr>
                 <w:rFonts w:ascii="Arial Narrow" w:hAnsi="Arial Narrow"/>
@@ -5364,6 +5685,7 @@
               <w:t>{%</w:t>
             </w:r>
             <w:proofErr w:type="spellStart"/>
+            <w:proofErr w:type="gramStart"/>
             <w:r>
               <w:rPr>
                 <w:rFonts w:ascii="Arial Narrow" w:hAnsi="Arial Narrow"/>
@@ -5385,6 +5707,7 @@
               <w:t>{</w:t>
             </w:r>
             <w:proofErr w:type="spellStart"/>
+            <w:proofErr w:type="gramEnd"/>
             <w:r>
               <w:rPr>
                 <w:rFonts w:ascii="Arial Narrow" w:hAnsi="Arial Narrow"/>
@@ -5456,6 +5779,7 @@
               <w:t>{%</w:t>
             </w:r>
             <w:proofErr w:type="spellStart"/>
+            <w:proofErr w:type="gramStart"/>
             <w:r>
               <w:rPr>
                 <w:rFonts w:ascii="Arial Narrow" w:hAnsi="Arial Narrow"/>
@@ -5479,6 +5803,7 @@
               <w:t>{</w:t>
             </w:r>
             <w:proofErr w:type="spellStart"/>
+            <w:proofErr w:type="gramEnd"/>
             <w:r>
               <w:rPr>
                 <w:rFonts w:ascii="Arial Narrow" w:hAnsi="Arial Narrow"/>
@@ -5623,15 +5948,13 @@
         <w:tblLook w:val="04A0" w:firstRow="1" w:lastRow="0" w:firstColumn="1" w:lastColumn="0" w:noHBand="0" w:noVBand="1"/>
       </w:tblPr>
       <w:tblGrid>
-        <w:gridCol w:w="3460"/>
-        <w:gridCol w:w="1215"/>
-        <w:gridCol w:w="3546"/>
-        <w:gridCol w:w="1129"/>
+        <w:gridCol w:w="4675"/>
+        <w:gridCol w:w="4675"/>
       </w:tblGrid>
       <w:tr>
         <w:tc>
           <w:tcPr>
-            <w:tcW w:w="3460" w:type="dxa"/>
+            <w:tcW w:w="4675" w:type="dxa"/>
             <w:shd w:val="clear" w:color="auto" w:fill="FFE599" w:themeFill="accent4" w:themeFillTint="66"/>
           </w:tcPr>
           <w:p>
@@ -5654,23 +5977,7 @@
         </w:tc>
         <w:tc>
           <w:tcPr>
-            <w:tcW w:w="1215" w:type="dxa"/>
-            <w:shd w:val="clear" w:color="auto" w:fill="FFFFFF" w:themeFill="background1"/>
-          </w:tcPr>
-          <w:p>
-            <w:pPr>
-              <w:spacing w:after="0"/>
-              <w:jc w:val="center"/>
-              <w:rPr>
-                <w:rFonts w:ascii="Arial Narrow" w:hAnsi="Arial Narrow"/>
-                <w:b/>
-              </w:rPr>
-            </w:pPr>
-          </w:p>
-        </w:tc>
-        <w:tc>
-          <w:tcPr>
-            <w:tcW w:w="3546" w:type="dxa"/>
+            <w:tcW w:w="4675" w:type="dxa"/>
             <w:shd w:val="clear" w:color="auto" w:fill="FFE599" w:themeFill="accent4" w:themeFillTint="66"/>
           </w:tcPr>
           <w:p>
@@ -5689,22 +5996,6 @@
               </w:rPr>
               <w:t>CANCELED</w:t>
             </w:r>
-          </w:p>
-        </w:tc>
-        <w:tc>
-          <w:tcPr>
-            <w:tcW w:w="1129" w:type="dxa"/>
-            <w:shd w:val="clear" w:color="auto" w:fill="FFFFFF" w:themeFill="background1"/>
-          </w:tcPr>
-          <w:p>
-            <w:pPr>
-              <w:spacing w:after="0"/>
-              <w:jc w:val="center"/>
-              <w:rPr>
-                <w:rFonts w:ascii="Arial Narrow" w:hAnsi="Arial Narrow"/>
-                <w:b/>
-              </w:rPr>
-            </w:pPr>
           </w:p>
         </w:tc>
       </w:tr>
@@ -5715,7 +6006,6 @@
         <w:tc>
           <w:tcPr>
             <w:tcW w:w="4675" w:type="dxa"/>
-            <w:gridSpan w:val="2"/>
           </w:tcPr>
           <w:p>
             <w:pPr>
@@ -5755,7 +6045,6 @@
         <w:tc>
           <w:tcPr>
             <w:tcW w:w="4675" w:type="dxa"/>
-            <w:gridSpan w:val="2"/>
           </w:tcPr>
           <w:p>
             <w:pPr>

</xml_diff>

<commit_message>
feat: add activity logs and history to SAPF document generation
</commit_message>
<xml_diff>
--- a/public/templates/student-activity-proposal-form-v2.docx
+++ b/public/templates/student-activity-proposal-form-v2.docx
@@ -211,7 +211,7 @@
           <w:szCs w:val="28"/>
         </w:rPr>
         <w:drawing>
-          <wp:anchor distT="0" distB="0" distL="114300" distR="114300" simplePos="0" relativeHeight="251665408" behindDoc="0" locked="0" layoutInCell="1" allowOverlap="1" wp14:anchorId="4D66C737" wp14:editId="25F93FB4">
+          <wp:anchor distT="0" distB="0" distL="114300" distR="114300" simplePos="0" relativeHeight="251665408" behindDoc="0" locked="0" layoutInCell="1" allowOverlap="1" wp14:anchorId="4D66C737" wp14:editId="14D2D932">
             <wp:simplePos x="0" y="0"/>
             <wp:positionH relativeFrom="column">
               <wp:posOffset>190004</wp:posOffset>
@@ -276,7 +276,7 @@
           <w:szCs w:val="28"/>
         </w:rPr>
         <w:drawing>
-          <wp:anchor distT="0" distB="0" distL="114300" distR="114300" simplePos="0" relativeHeight="251659264" behindDoc="0" locked="0" layoutInCell="1" allowOverlap="1" wp14:anchorId="31EB85D4" wp14:editId="74561890">
+          <wp:anchor distT="0" distB="0" distL="114300" distR="114300" simplePos="0" relativeHeight="251659264" behindDoc="0" locked="0" layoutInCell="1" allowOverlap="1" wp14:anchorId="31EB85D4" wp14:editId="34935FE6">
             <wp:simplePos x="0" y="0"/>
             <wp:positionH relativeFrom="column">
               <wp:posOffset>-474914</wp:posOffset>
@@ -6018,13 +6018,7 @@
               <w:rPr>
                 <w:rFonts w:ascii="Arial Narrow" w:hAnsi="Arial Narrow"/>
               </w:rPr>
-              <w:t>Remarks:</w:t>
-            </w:r>
-            <w:r>
-              <w:rPr>
-                <w:rFonts w:ascii="Arial Narrow" w:hAnsi="Arial Narrow"/>
-              </w:rPr>
-              <w:t xml:space="preserve"> {</w:t>
+              <w:t>Remarks: {</w:t>
             </w:r>
             <w:proofErr w:type="spellStart"/>
             <w:r>
@@ -6057,13 +6051,7 @@
               <w:rPr>
                 <w:rFonts w:ascii="Arial Narrow" w:hAnsi="Arial Narrow"/>
               </w:rPr>
-              <w:t>Remarks:</w:t>
-            </w:r>
-            <w:r>
-              <w:rPr>
-                <w:rFonts w:ascii="Arial Narrow" w:hAnsi="Arial Narrow"/>
-              </w:rPr>
-              <w:t xml:space="preserve"> {</w:t>
+              <w:t>Remarks: {</w:t>
             </w:r>
             <w:proofErr w:type="spellStart"/>
             <w:r>
@@ -6078,6 +6066,213 @@
                 <w:rFonts w:ascii="Arial Narrow" w:hAnsi="Arial Narrow"/>
               </w:rPr>
               <w:t>}</w:t>
+            </w:r>
+          </w:p>
+        </w:tc>
+      </w:tr>
+      <w:tr>
+        <w:tc>
+          <w:tcPr>
+            <w:tcW w:w="9350" w:type="dxa"/>
+            <w:gridSpan w:val="2"/>
+            <w:shd w:val="clear" w:color="auto" w:fill="FFE599" w:themeFill="accent4" w:themeFillTint="66"/>
+          </w:tcPr>
+          <w:p>
+            <w:pPr>
+              <w:spacing w:after="0"/>
+              <w:jc w:val="center"/>
+              <w:rPr>
+                <w:rFonts w:ascii="Arial Narrow" w:hAnsi="Arial Narrow"/>
+                <w:b/>
+              </w:rPr>
+            </w:pPr>
+            <w:r>
+              <w:rPr>
+                <w:rFonts w:ascii="Arial Narrow" w:hAnsi="Arial Narrow"/>
+                <w:b/>
+              </w:rPr>
+              <w:t>HISTORY</w:t>
+            </w:r>
+          </w:p>
+        </w:tc>
+      </w:tr>
+      <w:tr>
+        <w:trPr>
+          <w:trHeight w:val="1619"/>
+        </w:trPr>
+        <w:tc>
+          <w:tcPr>
+            <w:tcW w:w="9350" w:type="dxa"/>
+            <w:gridSpan w:val="2"/>
+          </w:tcPr>
+          <w:p>
+            <w:pPr>
+              <w:spacing w:after="0"/>
+              <w:rPr>
+                <w:rFonts w:ascii="Arial Narrow" w:hAnsi="Arial Narrow"/>
+              </w:rPr>
+            </w:pPr>
+            <w:r>
+              <w:rPr>
+                <w:rFonts w:ascii="Arial Narrow" w:hAnsi="Arial Narrow"/>
+              </w:rPr>
+              <w:t>{#history}</w:t>
+            </w:r>
+          </w:p>
+          <w:p>
+            <w:pPr>
+              <w:spacing w:after="0"/>
+              <w:rPr>
+                <w:rFonts w:ascii="Arial Narrow" w:hAnsi="Arial Narrow"/>
+                <w:b/>
+              </w:rPr>
+            </w:pPr>
+            <w:r>
+              <w:rPr>
+                <w:rFonts w:ascii="Arial Narrow" w:hAnsi="Arial Narrow"/>
+                <w:b/>
+              </w:rPr>
+              <w:t>{</w:t>
+            </w:r>
+            <w:proofErr w:type="spellStart"/>
+            <w:r>
+              <w:rPr>
+                <w:rFonts w:ascii="Arial Narrow" w:hAnsi="Arial Narrow"/>
+                <w:b/>
+              </w:rPr>
+              <w:t>historyDate</w:t>
+            </w:r>
+            <w:proofErr w:type="spellEnd"/>
+            <w:r>
+              <w:rPr>
+                <w:rFonts w:ascii="Arial Narrow" w:hAnsi="Arial Narrow"/>
+                <w:b/>
+              </w:rPr>
+              <w:t>} | {</w:t>
+            </w:r>
+            <w:proofErr w:type="spellStart"/>
+            <w:r>
+              <w:rPr>
+                <w:rFonts w:ascii="Arial Narrow" w:hAnsi="Arial Narrow"/>
+                <w:b/>
+              </w:rPr>
+              <w:t>historyAction</w:t>
+            </w:r>
+            <w:proofErr w:type="spellEnd"/>
+            <w:r>
+              <w:rPr>
+                <w:rFonts w:ascii="Arial Narrow" w:hAnsi="Arial Narrow"/>
+                <w:b/>
+              </w:rPr>
+              <w:t>} | {</w:t>
+            </w:r>
+            <w:proofErr w:type="spellStart"/>
+            <w:r>
+              <w:rPr>
+                <w:rFonts w:ascii="Arial Narrow" w:hAnsi="Arial Narrow"/>
+                <w:b/>
+              </w:rPr>
+              <w:t>historyActor</w:t>
+            </w:r>
+            <w:proofErr w:type="spellEnd"/>
+            <w:r>
+              <w:rPr>
+                <w:rFonts w:ascii="Arial Narrow" w:hAnsi="Arial Narrow"/>
+                <w:b/>
+              </w:rPr>
+              <w:t>}</w:t>
+            </w:r>
+          </w:p>
+          <w:p>
+            <w:pPr>
+              <w:spacing w:after="0"/>
+              <w:rPr>
+                <w:rFonts w:ascii="Arial Narrow" w:hAnsi="Arial Narrow"/>
+              </w:rPr>
+            </w:pPr>
+            <w:r>
+              <w:rPr>
+                <w:rFonts w:ascii="Arial Narrow" w:hAnsi="Arial Narrow"/>
+              </w:rPr>
+              <w:t>{</w:t>
+            </w:r>
+            <w:proofErr w:type="spellStart"/>
+            <w:r>
+              <w:rPr>
+                <w:rFonts w:ascii="Arial Narrow" w:hAnsi="Arial Narrow"/>
+              </w:rPr>
+              <w:t>historyComment</w:t>
+            </w:r>
+            <w:proofErr w:type="spellEnd"/>
+            <w:r>
+              <w:rPr>
+                <w:rFonts w:ascii="Arial Narrow" w:hAnsi="Arial Narrow"/>
+              </w:rPr>
+              <w:t>}</w:t>
+            </w:r>
+          </w:p>
+          <w:p>
+            <w:pPr>
+              <w:spacing w:after="0"/>
+              <w:rPr>
+                <w:rFonts w:ascii="Arial Narrow" w:hAnsi="Arial Narrow"/>
+              </w:rPr>
+            </w:pPr>
+            <w:r>
+              <w:rPr>
+                <w:rFonts w:ascii="Arial Narrow" w:hAnsi="Arial Narrow"/>
+              </w:rPr>
+              <w:t>{#changes}</w:t>
+            </w:r>
+          </w:p>
+          <w:p>
+            <w:pPr>
+              <w:spacing w:after="0"/>
+              <w:rPr>
+                <w:rFonts w:ascii="Arial Narrow" w:hAnsi="Arial Narrow"/>
+              </w:rPr>
+            </w:pPr>
+            <w:r>
+              <w:rPr>
+                <w:rFonts w:ascii="Arial Narrow" w:hAnsi="Arial Narrow"/>
+              </w:rPr>
+              <w:t>• {field}: {before} → {after}</w:t>
+            </w:r>
+          </w:p>
+          <w:p>
+            <w:pPr>
+              <w:spacing w:after="0"/>
+              <w:rPr>
+                <w:rFonts w:ascii="Arial Narrow" w:hAnsi="Arial Narrow"/>
+              </w:rPr>
+            </w:pPr>
+            <w:r>
+              <w:rPr>
+                <w:rFonts w:ascii="Arial Narrow" w:hAnsi="Arial Narrow"/>
+              </w:rPr>
+              <w:t>{/changes}</w:t>
+            </w:r>
+          </w:p>
+          <w:p>
+            <w:pPr>
+              <w:spacing w:after="0"/>
+              <w:rPr>
+                <w:rFonts w:ascii="Arial Narrow" w:hAnsi="Arial Narrow"/>
+              </w:rPr>
+            </w:pPr>
+          </w:p>
+          <w:p>
+            <w:pPr>
+              <w:spacing w:after="0"/>
+              <w:rPr>
+                <w:rFonts w:ascii="Arial Narrow" w:hAnsi="Arial Narrow"/>
+              </w:rPr>
+            </w:pPr>
+            <w:r>
+              <w:rPr>
+                <w:rFonts w:ascii="Arial Narrow" w:hAnsi="Arial Narrow"/>
+              </w:rPr>
+              <w:t>{/history}</w:t>
             </w:r>
           </w:p>
         </w:tc>

</xml_diff>